<commit_message>
Update design document with FR2 implementation.
</commit_message>
<xml_diff>
--- a/design-document.docx
+++ b/design-document.docx
@@ -7,7 +7,33 @@
         <w:pStyle w:val="Heading1"/>
       </w:pPr>
       <w:r>
-        <w:t>FR1: Load Patients from File</w:t>
+        <w:t>Complete design class diagram</w:t>
+      </w:r>
+    </w:p>
+    <w:p/>
+    <w:p>
+      <w:pPr>
+        <w:pStyle w:val="Heading1"/>
+      </w:pPr>
+    </w:p>
+    <w:p>
+      <w:pPr>
+        <w:pStyle w:val="Heading1"/>
+      </w:pPr>
+      <w:r>
+        <w:t xml:space="preserve">FR1: Load </w:t>
+      </w:r>
+      <w:r>
+        <w:t>p</w:t>
+      </w:r>
+      <w:r>
+        <w:t xml:space="preserve">atients from </w:t>
+      </w:r>
+      <w:r>
+        <w:t>f</w:t>
+      </w:r>
+      <w:r>
+        <w:t>ile</w:t>
       </w:r>
     </w:p>
     <w:p>
@@ -107,6 +133,7 @@
     </w:p>
     <w:p>
       <w:r>
+        <w:lastRenderedPageBreak/>
         <w:t>With this implementation, the patient management system only needs a single line of code changed to use the new file loader.</w:t>
       </w:r>
     </w:p>
@@ -134,7 +161,6 @@
         </w:numPr>
       </w:pPr>
       <w:r>
-        <w:lastRenderedPageBreak/>
         <w:t xml:space="preserve">After changing the single line of code in </w:t>
       </w:r>
       <w:r>
@@ -266,14 +292,7 @@
           <w:i/>
           <w:iCs/>
         </w:rPr>
-        <w:t>PatientFileLoaderAdapter</w:t>
-      </w:r>
-      <w:r>
-        <w:rPr>
-          <w:i/>
-          <w:iCs/>
-        </w:rPr>
-        <w:t xml:space="preserve">, </w:t>
+        <w:t xml:space="preserve">PatientFileLoaderAdapter, </w:t>
       </w:r>
       <w:r>
         <w:t xml:space="preserve">which is then delegated to the </w:t>
@@ -654,6 +673,500 @@
       </w:r>
       <w:r>
         <w:t>Patient.cpp to not keep printing garbage memory.</w:t>
+      </w:r>
+    </w:p>
+    <w:p>
+      <w:pPr>
+        <w:pStyle w:val="Heading1"/>
+      </w:pPr>
+      <w:r>
+        <w:lastRenderedPageBreak/>
+        <w:t>FR2: Load Patients from file and database</w:t>
+      </w:r>
+    </w:p>
+    <w:p>
+      <w:pPr>
+        <w:keepNext/>
+      </w:pPr>
+      <w:r>
+        <w:rPr>
+          <w:noProof/>
+        </w:rPr>
+        <w:drawing>
+          <wp:inline distT="0" distB="0" distL="0" distR="0" wp14:anchorId="31A60D35" wp14:editId="2B1770E6">
+            <wp:extent cx="5732145" cy="5506720"/>
+            <wp:effectExtent l="0" t="0" r="1905" b="0"/>
+            <wp:docPr id="900607631" name="Picture 1"/>
+            <wp:cNvGraphicFramePr>
+              <a:graphicFrameLocks xmlns:a="http://schemas.openxmlformats.org/drawingml/2006/main" noChangeAspect="1"/>
+            </wp:cNvGraphicFramePr>
+            <a:graphic xmlns:a="http://schemas.openxmlformats.org/drawingml/2006/main">
+              <a:graphicData uri="http://schemas.openxmlformats.org/drawingml/2006/picture">
+                <pic:pic xmlns:pic="http://schemas.openxmlformats.org/drawingml/2006/picture">
+                  <pic:nvPicPr>
+                    <pic:cNvPr id="0" name="Picture 1"/>
+                    <pic:cNvPicPr>
+                      <a:picLocks noChangeAspect="1" noChangeArrowheads="1"/>
+                    </pic:cNvPicPr>
+                  </pic:nvPicPr>
+                  <pic:blipFill>
+                    <a:blip r:embed="rId6">
+                      <a:extLst>
+                        <a:ext uri="{28A0092B-C50C-407E-A947-70E740481C1C}">
+                          <a14:useLocalDpi xmlns:a14="http://schemas.microsoft.com/office/drawing/2010/main" val="0"/>
+                        </a:ext>
+                      </a:extLst>
+                    </a:blip>
+                    <a:srcRect/>
+                    <a:stretch>
+                      <a:fillRect/>
+                    </a:stretch>
+                  </pic:blipFill>
+                  <pic:spPr bwMode="auto">
+                    <a:xfrm>
+                      <a:off x="0" y="0"/>
+                      <a:ext cx="5732145" cy="5506720"/>
+                    </a:xfrm>
+                    <a:prstGeom prst="rect">
+                      <a:avLst/>
+                    </a:prstGeom>
+                    <a:noFill/>
+                    <a:ln>
+                      <a:noFill/>
+                    </a:ln>
+                  </pic:spPr>
+                </pic:pic>
+              </a:graphicData>
+            </a:graphic>
+          </wp:inline>
+        </w:drawing>
+      </w:r>
+    </w:p>
+    <w:p>
+      <w:pPr>
+        <w:pStyle w:val="Caption"/>
+        <w:jc w:val="center"/>
+      </w:pPr>
+      <w:r>
+        <w:t xml:space="preserve">Figure </w:t>
+      </w:r>
+      <w:fldSimple w:instr=" SEQ Figure \* ARABIC ">
+        <w:r>
+          <w:rPr>
+            <w:noProof/>
+          </w:rPr>
+          <w:t>2</w:t>
+        </w:r>
+      </w:fldSimple>
+      <w:r>
+        <w:t xml:space="preserve"> - Composite design pattern for database &amp; file loading.</w:t>
+      </w:r>
+    </w:p>
+    <w:p>
+      <w:r>
+        <w:rPr>
+          <w:b/>
+          <w:bCs/>
+        </w:rPr>
+        <w:t xml:space="preserve">Chosen design pattern: </w:t>
+      </w:r>
+      <w:r>
+        <w:t>Composite</w:t>
+      </w:r>
+    </w:p>
+    <w:p>
+      <w:r>
+        <w:t xml:space="preserve">The </w:t>
+      </w:r>
+      <w:r>
+        <w:rPr>
+          <w:i/>
+          <w:iCs/>
+        </w:rPr>
+        <w:t>PatientManagementSystem</w:t>
+      </w:r>
+      <w:r>
+        <w:t xml:space="preserve"> still needs to load patients from the database in addition to loading them from a file. To do this, I applied the composite pattern by introducing a new </w:t>
+      </w:r>
+      <w:r>
+        <w:rPr>
+          <w:i/>
+          <w:iCs/>
+        </w:rPr>
+        <w:t>CompositePatientLoader</w:t>
+      </w:r>
+      <w:r>
+        <w:t xml:space="preserve"> class, which allows </w:t>
+      </w:r>
+      <w:r>
+        <w:rPr>
+          <w:i/>
+          <w:iCs/>
+        </w:rPr>
+        <w:t>PatientManagementSystem</w:t>
+      </w:r>
+      <w:r>
+        <w:rPr>
+          <w:i/>
+          <w:iCs/>
+        </w:rPr>
+        <w:t xml:space="preserve"> </w:t>
+      </w:r>
+      <w:r>
+        <w:t xml:space="preserve">to treat a group of loaders as a single loader instead. Both the file and database loaders can be stored within the composite loader, which in turn calls each loaders’ methods. To make it easier to switch between file loading, database loading, and combined loading, I also added a helper function in </w:t>
+      </w:r>
+      <w:r>
+        <w:rPr>
+          <w:i/>
+          <w:iCs/>
+        </w:rPr>
+        <w:t>PatientManagementSystem</w:t>
+      </w:r>
+      <w:r>
+        <w:t xml:space="preserve"> </w:t>
+      </w:r>
+      <w:r>
+        <w:t>to create each loader and read patients in the correct order.</w:t>
+      </w:r>
+    </w:p>
+    <w:p>
+      <w:r>
+        <w:t xml:space="preserve">The </w:t>
+      </w:r>
+      <w:r>
+        <w:rPr>
+          <w:i/>
+          <w:iCs/>
+        </w:rPr>
+        <w:t>CompositePatientLoader</w:t>
+      </w:r>
+      <w:r>
+        <w:t xml:space="preserve"> class owns its children, so a virtual destructor was also added into </w:t>
+      </w:r>
+      <w:r>
+        <w:rPr>
+          <w:i/>
+          <w:iCs/>
+        </w:rPr>
+        <w:t>AbstractPatientDatabaseLoader</w:t>
+      </w:r>
+      <w:r>
+        <w:t>, called when the composite class is destroyed.</w:t>
+      </w:r>
+    </w:p>
+    <w:p>
+      <w:pPr>
+        <w:rPr>
+          <w:b/>
+          <w:bCs/>
+        </w:rPr>
+      </w:pPr>
+      <w:r>
+        <w:rPr>
+          <w:b/>
+          <w:bCs/>
+        </w:rPr>
+        <w:t>How it works:</w:t>
+      </w:r>
+    </w:p>
+    <w:p>
+      <w:pPr>
+        <w:pStyle w:val="ListParagraph"/>
+        <w:numPr>
+          <w:ilvl w:val="0"/>
+          <w:numId w:val="3"/>
+        </w:numPr>
+      </w:pPr>
+      <w:r>
+        <w:rPr>
+          <w:i/>
+          <w:iCs/>
+        </w:rPr>
+        <w:lastRenderedPageBreak/>
+        <w:t>PatientManagementSystem</w:t>
+      </w:r>
+      <w:r>
+        <w:t xml:space="preserve"> creates and owns a </w:t>
+      </w:r>
+      <w:r>
+        <w:rPr>
+          <w:i/>
+          <w:iCs/>
+        </w:rPr>
+        <w:t>CompositePatientLoader</w:t>
+      </w:r>
+      <w:r>
+        <w:t xml:space="preserve"> through the </w:t>
+      </w:r>
+      <w:r>
+        <w:rPr>
+          <w:i/>
+          <w:iCs/>
+        </w:rPr>
+        <w:t>AbstractPatientDatabaseLoader</w:t>
+      </w:r>
+      <w:r>
+        <w:t xml:space="preserve"> interface.</w:t>
+      </w:r>
+    </w:p>
+    <w:p>
+      <w:pPr>
+        <w:pStyle w:val="ListParagraph"/>
+        <w:numPr>
+          <w:ilvl w:val="0"/>
+          <w:numId w:val="3"/>
+        </w:numPr>
+      </w:pPr>
+      <w:r>
+        <w:t xml:space="preserve">This </w:t>
+      </w:r>
+      <w:r>
+        <w:rPr>
+          <w:i/>
+          <w:iCs/>
+        </w:rPr>
+        <w:t>CompositePatientLoader</w:t>
+      </w:r>
+      <w:r>
+        <w:t xml:space="preserve"> creates both a </w:t>
+      </w:r>
+      <w:r>
+        <w:rPr>
+          <w:i/>
+          <w:iCs/>
+        </w:rPr>
+        <w:t>PatientDatabaseLoader</w:t>
+      </w:r>
+      <w:r>
+        <w:t xml:space="preserve"> and a </w:t>
+      </w:r>
+      <w:r>
+        <w:rPr>
+          <w:i/>
+          <w:iCs/>
+        </w:rPr>
+        <w:t>PatientFileLoaderAdaptor</w:t>
+      </w:r>
+      <w:r>
+        <w:t>.</w:t>
+      </w:r>
+    </w:p>
+    <w:p>
+      <w:pPr>
+        <w:pStyle w:val="ListParagraph"/>
+        <w:numPr>
+          <w:ilvl w:val="0"/>
+          <w:numId w:val="3"/>
+        </w:numPr>
+      </w:pPr>
+      <w:r>
+        <w:t xml:space="preserve">The </w:t>
+      </w:r>
+      <w:r>
+        <w:rPr>
+          <w:i/>
+          <w:iCs/>
+        </w:rPr>
+        <w:t>PatientManagementSystem</w:t>
+      </w:r>
+      <w:r>
+        <w:t xml:space="preserve"> calls the </w:t>
+      </w:r>
+      <w:r>
+        <w:rPr>
+          <w:i/>
+          <w:iCs/>
+        </w:rPr>
+        <w:t xml:space="preserve">initialiseConnection(), loadPatients(…), </w:t>
+      </w:r>
+      <w:r>
+        <w:t xml:space="preserve">and </w:t>
+      </w:r>
+      <w:r>
+        <w:rPr>
+          <w:i/>
+          <w:iCs/>
+        </w:rPr>
+        <w:t>closeConnection()</w:t>
+      </w:r>
+      <w:r>
+        <w:t xml:space="preserve"> on both </w:t>
+      </w:r>
+      <w:r>
+        <w:rPr>
+          <w:i/>
+          <w:iCs/>
+        </w:rPr>
+        <w:t>CompositePatientLoader</w:t>
+      </w:r>
+      <w:r>
+        <w:t xml:space="preserve"> child loaders, which calls the respective versions of those methods within each child.</w:t>
+      </w:r>
+    </w:p>
+    <w:p>
+      <w:pPr>
+        <w:pStyle w:val="ListParagraph"/>
+        <w:numPr>
+          <w:ilvl w:val="0"/>
+          <w:numId w:val="3"/>
+        </w:numPr>
+      </w:pPr>
+      <w:r>
+        <w:rPr>
+          <w:i/>
+          <w:iCs/>
+        </w:rPr>
+        <w:t>PatientDatabaseLoader</w:t>
+      </w:r>
+      <w:r>
+        <w:t xml:space="preserve"> patients are loaded first, followed by patients from the </w:t>
+      </w:r>
+      <w:r>
+        <w:rPr>
+          <w:i/>
+          <w:iCs/>
+        </w:rPr>
+        <w:t>PatientFileLoader</w:t>
+      </w:r>
+      <w:r>
+        <w:t>.</w:t>
+      </w:r>
+    </w:p>
+    <w:p>
+      <w:pPr>
+        <w:pStyle w:val="ListParagraph"/>
+        <w:numPr>
+          <w:ilvl w:val="0"/>
+          <w:numId w:val="3"/>
+        </w:numPr>
+      </w:pPr>
+      <w:r>
+        <w:t xml:space="preserve">All patients are then returned to the </w:t>
+      </w:r>
+      <w:r>
+        <w:rPr>
+          <w:i/>
+          <w:iCs/>
+        </w:rPr>
+        <w:t>PatientManagementSystem</w:t>
+      </w:r>
+      <w:r>
+        <w:t xml:space="preserve"> which proceeds as normal.</w:t>
+      </w:r>
+    </w:p>
+    <w:p>
+      <w:pPr>
+        <w:rPr>
+          <w:b/>
+          <w:bCs/>
+        </w:rPr>
+      </w:pPr>
+      <w:r>
+        <w:rPr>
+          <w:b/>
+          <w:bCs/>
+        </w:rPr>
+        <w:t>Git commits:</w:t>
+      </w:r>
+    </w:p>
+    <w:p>
+      <w:pPr>
+        <w:pStyle w:val="ListParagraph"/>
+        <w:numPr>
+          <w:ilvl w:val="0"/>
+          <w:numId w:val="4"/>
+        </w:numPr>
+      </w:pPr>
+      <w:r>
+        <w:t xml:space="preserve">Commits </w:t>
+      </w:r>
+      <w:r>
+        <w:rPr>
+          <w:b/>
+          <w:bCs/>
+        </w:rPr>
+        <w:t>69ebf1f2, bf38c05e,</w:t>
+      </w:r>
+      <w:r>
+        <w:t xml:space="preserve"> and </w:t>
+      </w:r>
+      <w:r>
+        <w:rPr>
+          <w:b/>
+          <w:bCs/>
+        </w:rPr>
+        <w:t>f73aea7d</w:t>
+      </w:r>
+      <w:r>
+        <w:t xml:space="preserve"> construct the header and source files for the composite patient loader.</w:t>
+      </w:r>
+    </w:p>
+    <w:p>
+      <w:pPr>
+        <w:pStyle w:val="ListParagraph"/>
+        <w:numPr>
+          <w:ilvl w:val="0"/>
+          <w:numId w:val="4"/>
+        </w:numPr>
+      </w:pPr>
+      <w:r>
+        <w:t xml:space="preserve">Commit </w:t>
+      </w:r>
+      <w:r>
+        <w:rPr>
+          <w:b/>
+          <w:bCs/>
+        </w:rPr>
+        <w:t>911ac1e6</w:t>
+      </w:r>
+      <w:r>
+        <w:t xml:space="preserve"> adds a helper function to the patient management system, so only one line of code needs to be changed to revert back to database/file loading.</w:t>
+      </w:r>
+    </w:p>
+    <w:p>
+      <w:pPr>
+        <w:pStyle w:val="ListParagraph"/>
+        <w:numPr>
+          <w:ilvl w:val="0"/>
+          <w:numId w:val="4"/>
+        </w:numPr>
+      </w:pPr>
+      <w:r>
+        <w:t xml:space="preserve">Commit </w:t>
+      </w:r>
+      <w:r>
+        <w:rPr>
+          <w:b/>
+          <w:bCs/>
+        </w:rPr>
+        <w:t>877373</w:t>
+      </w:r>
+      <w:r>
+        <w:rPr>
+          <w:b/>
+          <w:bCs/>
+        </w:rPr>
+        <w:t>fd</w:t>
+      </w:r>
+      <w:r>
+        <w:t xml:space="preserve"> adds a virtual destructor the abstract database loader, to help with memory management.</w:t>
+      </w:r>
+    </w:p>
+    <w:p>
+      <w:pPr>
+        <w:pStyle w:val="Heading1"/>
+      </w:pPr>
+      <w:r>
+        <w:t>FR3: Calculate the patient alert levels</w:t>
+      </w:r>
+    </w:p>
+    <w:p/>
+    <w:p>
+      <w:pPr>
+        <w:pStyle w:val="Heading1"/>
+      </w:pPr>
+      <w:r>
+        <w:t>FR4: Alert the hospitals and GPs</w:t>
       </w:r>
     </w:p>
     <w:sectPr>
@@ -870,11 +1383,219 @@
       </w:pPr>
     </w:lvl>
   </w:abstractNum>
+  <w:abstractNum w:abstractNumId="2" w15:restartNumberingAfterBreak="0">
+    <w:nsid w:val="5352295F"/>
+    <w:multiLevelType w:val="hybridMultilevel"/>
+    <w:tmpl w:val="23C22DF6"/>
+    <w:lvl w:ilvl="0" w:tplc="0C09000F">
+      <w:start w:val="1"/>
+      <w:numFmt w:val="decimal"/>
+      <w:lvlText w:val="%1."/>
+      <w:lvlJc w:val="left"/>
+      <w:pPr>
+        <w:ind w:left="720" w:hanging="360"/>
+      </w:pPr>
+      <w:rPr>
+        <w:rFonts w:hint="default"/>
+      </w:rPr>
+    </w:lvl>
+    <w:lvl w:ilvl="1" w:tplc="0C090019" w:tentative="1">
+      <w:start w:val="1"/>
+      <w:numFmt w:val="lowerLetter"/>
+      <w:lvlText w:val="%2."/>
+      <w:lvlJc w:val="left"/>
+      <w:pPr>
+        <w:ind w:left="1440" w:hanging="360"/>
+      </w:pPr>
+    </w:lvl>
+    <w:lvl w:ilvl="2" w:tplc="0C09001B" w:tentative="1">
+      <w:start w:val="1"/>
+      <w:numFmt w:val="lowerRoman"/>
+      <w:lvlText w:val="%3."/>
+      <w:lvlJc w:val="right"/>
+      <w:pPr>
+        <w:ind w:left="2160" w:hanging="180"/>
+      </w:pPr>
+    </w:lvl>
+    <w:lvl w:ilvl="3" w:tplc="0C09000F" w:tentative="1">
+      <w:start w:val="1"/>
+      <w:numFmt w:val="decimal"/>
+      <w:lvlText w:val="%4."/>
+      <w:lvlJc w:val="left"/>
+      <w:pPr>
+        <w:ind w:left="2880" w:hanging="360"/>
+      </w:pPr>
+    </w:lvl>
+    <w:lvl w:ilvl="4" w:tplc="0C090019" w:tentative="1">
+      <w:start w:val="1"/>
+      <w:numFmt w:val="lowerLetter"/>
+      <w:lvlText w:val="%5."/>
+      <w:lvlJc w:val="left"/>
+      <w:pPr>
+        <w:ind w:left="3600" w:hanging="360"/>
+      </w:pPr>
+    </w:lvl>
+    <w:lvl w:ilvl="5" w:tplc="0C09001B" w:tentative="1">
+      <w:start w:val="1"/>
+      <w:numFmt w:val="lowerRoman"/>
+      <w:lvlText w:val="%6."/>
+      <w:lvlJc w:val="right"/>
+      <w:pPr>
+        <w:ind w:left="4320" w:hanging="180"/>
+      </w:pPr>
+    </w:lvl>
+    <w:lvl w:ilvl="6" w:tplc="0C09000F" w:tentative="1">
+      <w:start w:val="1"/>
+      <w:numFmt w:val="decimal"/>
+      <w:lvlText w:val="%7."/>
+      <w:lvlJc w:val="left"/>
+      <w:pPr>
+        <w:ind w:left="5040" w:hanging="360"/>
+      </w:pPr>
+    </w:lvl>
+    <w:lvl w:ilvl="7" w:tplc="0C090019" w:tentative="1">
+      <w:start w:val="1"/>
+      <w:numFmt w:val="lowerLetter"/>
+      <w:lvlText w:val="%8."/>
+      <w:lvlJc w:val="left"/>
+      <w:pPr>
+        <w:ind w:left="5760" w:hanging="360"/>
+      </w:pPr>
+    </w:lvl>
+    <w:lvl w:ilvl="8" w:tplc="0C09001B" w:tentative="1">
+      <w:start w:val="1"/>
+      <w:numFmt w:val="lowerRoman"/>
+      <w:lvlText w:val="%9."/>
+      <w:lvlJc w:val="right"/>
+      <w:pPr>
+        <w:ind w:left="6480" w:hanging="180"/>
+      </w:pPr>
+    </w:lvl>
+  </w:abstractNum>
+  <w:abstractNum w:abstractNumId="3" w15:restartNumberingAfterBreak="0">
+    <w:nsid w:val="705825E3"/>
+    <w:multiLevelType w:val="hybridMultilevel"/>
+    <w:tmpl w:val="6074BA82"/>
+    <w:lvl w:ilvl="0" w:tplc="0C090001">
+      <w:start w:val="1"/>
+      <w:numFmt w:val="bullet"/>
+      <w:lvlText w:val=""/>
+      <w:lvlJc w:val="left"/>
+      <w:pPr>
+        <w:ind w:left="720" w:hanging="360"/>
+      </w:pPr>
+      <w:rPr>
+        <w:rFonts w:ascii="Symbol" w:hAnsi="Symbol" w:hint="default"/>
+      </w:rPr>
+    </w:lvl>
+    <w:lvl w:ilvl="1" w:tplc="0C090003" w:tentative="1">
+      <w:start w:val="1"/>
+      <w:numFmt w:val="bullet"/>
+      <w:lvlText w:val="o"/>
+      <w:lvlJc w:val="left"/>
+      <w:pPr>
+        <w:ind w:left="1440" w:hanging="360"/>
+      </w:pPr>
+      <w:rPr>
+        <w:rFonts w:ascii="Courier New" w:hAnsi="Courier New" w:cs="Courier New" w:hint="default"/>
+      </w:rPr>
+    </w:lvl>
+    <w:lvl w:ilvl="2" w:tplc="0C090005" w:tentative="1">
+      <w:start w:val="1"/>
+      <w:numFmt w:val="bullet"/>
+      <w:lvlText w:val=""/>
+      <w:lvlJc w:val="left"/>
+      <w:pPr>
+        <w:ind w:left="2160" w:hanging="360"/>
+      </w:pPr>
+      <w:rPr>
+        <w:rFonts w:ascii="Wingdings" w:hAnsi="Wingdings" w:hint="default"/>
+      </w:rPr>
+    </w:lvl>
+    <w:lvl w:ilvl="3" w:tplc="0C090001" w:tentative="1">
+      <w:start w:val="1"/>
+      <w:numFmt w:val="bullet"/>
+      <w:lvlText w:val=""/>
+      <w:lvlJc w:val="left"/>
+      <w:pPr>
+        <w:ind w:left="2880" w:hanging="360"/>
+      </w:pPr>
+      <w:rPr>
+        <w:rFonts w:ascii="Symbol" w:hAnsi="Symbol" w:hint="default"/>
+      </w:rPr>
+    </w:lvl>
+    <w:lvl w:ilvl="4" w:tplc="0C090003" w:tentative="1">
+      <w:start w:val="1"/>
+      <w:numFmt w:val="bullet"/>
+      <w:lvlText w:val="o"/>
+      <w:lvlJc w:val="left"/>
+      <w:pPr>
+        <w:ind w:left="3600" w:hanging="360"/>
+      </w:pPr>
+      <w:rPr>
+        <w:rFonts w:ascii="Courier New" w:hAnsi="Courier New" w:cs="Courier New" w:hint="default"/>
+      </w:rPr>
+    </w:lvl>
+    <w:lvl w:ilvl="5" w:tplc="0C090005" w:tentative="1">
+      <w:start w:val="1"/>
+      <w:numFmt w:val="bullet"/>
+      <w:lvlText w:val=""/>
+      <w:lvlJc w:val="left"/>
+      <w:pPr>
+        <w:ind w:left="4320" w:hanging="360"/>
+      </w:pPr>
+      <w:rPr>
+        <w:rFonts w:ascii="Wingdings" w:hAnsi="Wingdings" w:hint="default"/>
+      </w:rPr>
+    </w:lvl>
+    <w:lvl w:ilvl="6" w:tplc="0C090001" w:tentative="1">
+      <w:start w:val="1"/>
+      <w:numFmt w:val="bullet"/>
+      <w:lvlText w:val=""/>
+      <w:lvlJc w:val="left"/>
+      <w:pPr>
+        <w:ind w:left="5040" w:hanging="360"/>
+      </w:pPr>
+      <w:rPr>
+        <w:rFonts w:ascii="Symbol" w:hAnsi="Symbol" w:hint="default"/>
+      </w:rPr>
+    </w:lvl>
+    <w:lvl w:ilvl="7" w:tplc="0C090003" w:tentative="1">
+      <w:start w:val="1"/>
+      <w:numFmt w:val="bullet"/>
+      <w:lvlText w:val="o"/>
+      <w:lvlJc w:val="left"/>
+      <w:pPr>
+        <w:ind w:left="5760" w:hanging="360"/>
+      </w:pPr>
+      <w:rPr>
+        <w:rFonts w:ascii="Courier New" w:hAnsi="Courier New" w:cs="Courier New" w:hint="default"/>
+      </w:rPr>
+    </w:lvl>
+    <w:lvl w:ilvl="8" w:tplc="0C090005" w:tentative="1">
+      <w:start w:val="1"/>
+      <w:numFmt w:val="bullet"/>
+      <w:lvlText w:val=""/>
+      <w:lvlJc w:val="left"/>
+      <w:pPr>
+        <w:ind w:left="6480" w:hanging="360"/>
+      </w:pPr>
+      <w:rPr>
+        <w:rFonts w:ascii="Wingdings" w:hAnsi="Wingdings" w:hint="default"/>
+      </w:rPr>
+    </w:lvl>
+  </w:abstractNum>
   <w:num w:numId="1" w16cid:durableId="1428770149">
     <w:abstractNumId w:val="1"/>
   </w:num>
   <w:num w:numId="2" w16cid:durableId="73432152">
     <w:abstractNumId w:val="0"/>
+  </w:num>
+  <w:num w:numId="3" w16cid:durableId="2082285570">
+    <w:abstractNumId w:val="2"/>
+  </w:num>
+  <w:num w:numId="4" w16cid:durableId="1218467137">
+    <w:abstractNumId w:val="3"/>
   </w:num>
 </w:numbering>
 </file>

</xml_diff>

<commit_message>
Modify design document for FR3
</commit_message>
<xml_diff>
--- a/design-document.docx
+++ b/design-document.docx
@@ -1157,18 +1157,774 @@
         <w:pStyle w:val="Heading1"/>
       </w:pPr>
       <w:r>
+        <w:rPr>
+          <w:noProof/>
+        </w:rPr>
+        <w:lastRenderedPageBreak/>
+        <mc:AlternateContent>
+          <mc:Choice Requires="wps">
+            <w:drawing>
+              <wp:anchor distT="0" distB="0" distL="114300" distR="114300" simplePos="0" relativeHeight="251660288" behindDoc="1" locked="0" layoutInCell="1" allowOverlap="1" wp14:anchorId="1A6091AB" wp14:editId="19A991ED">
+                <wp:simplePos x="0" y="0"/>
+                <wp:positionH relativeFrom="column">
+                  <wp:posOffset>-339090</wp:posOffset>
+                </wp:positionH>
+                <wp:positionV relativeFrom="paragraph">
+                  <wp:posOffset>5054600</wp:posOffset>
+                </wp:positionV>
+                <wp:extent cx="6409055" cy="635"/>
+                <wp:effectExtent l="0" t="0" r="0" b="0"/>
+                <wp:wrapTight wrapText="bothSides">
+                  <wp:wrapPolygon edited="0">
+                    <wp:start x="0" y="0"/>
+                    <wp:lineTo x="0" y="21600"/>
+                    <wp:lineTo x="21600" y="21600"/>
+                    <wp:lineTo x="21600" y="0"/>
+                  </wp:wrapPolygon>
+                </wp:wrapTight>
+                <wp:docPr id="827539306" name="Text Box 1"/>
+                <wp:cNvGraphicFramePr/>
+                <a:graphic xmlns:a="http://schemas.openxmlformats.org/drawingml/2006/main">
+                  <a:graphicData uri="http://schemas.microsoft.com/office/word/2010/wordprocessingShape">
+                    <wps:wsp>
+                      <wps:cNvSpPr txBox="1"/>
+                      <wps:spPr>
+                        <a:xfrm>
+                          <a:off x="0" y="0"/>
+                          <a:ext cx="6409055" cy="635"/>
+                        </a:xfrm>
+                        <a:prstGeom prst="rect">
+                          <a:avLst/>
+                        </a:prstGeom>
+                        <a:solidFill>
+                          <a:prstClr val="white"/>
+                        </a:solidFill>
+                        <a:ln>
+                          <a:noFill/>
+                        </a:ln>
+                      </wps:spPr>
+                      <wps:txbx>
+                        <w:txbxContent>
+                          <w:p>
+                            <w:pPr>
+                              <w:pStyle w:val="Caption"/>
+                              <w:jc w:val="center"/>
+                              <w:rPr>
+                                <w:noProof/>
+                              </w:rPr>
+                            </w:pPr>
+                            <w:r>
+                              <w:t xml:space="preserve">Figure </w:t>
+                            </w:r>
+                            <w:fldSimple w:instr=" SEQ Figure \* ARABIC ">
+                              <w:r>
+                                <w:rPr>
+                                  <w:noProof/>
+                                </w:rPr>
+                                <w:t>3</w:t>
+                              </w:r>
+                            </w:fldSimple>
+                            <w:r>
+                              <w:t xml:space="preserve"> - Strategy design pattern for calculating patient alert levels.</w:t>
+                            </w:r>
+                          </w:p>
+                        </w:txbxContent>
+                      </wps:txbx>
+                      <wps:bodyPr rot="0" spcFirstLastPara="0" vertOverflow="overflow" horzOverflow="overflow" vert="horz" wrap="square" lIns="0" tIns="0" rIns="0" bIns="0" numCol="1" spcCol="0" rtlCol="0" fromWordArt="0" anchor="t" anchorCtr="0" forceAA="0" compatLnSpc="1">
+                        <a:prstTxWarp prst="textNoShape">
+                          <a:avLst/>
+                        </a:prstTxWarp>
+                        <a:spAutoFit/>
+                      </wps:bodyPr>
+                    </wps:wsp>
+                  </a:graphicData>
+                </a:graphic>
+              </wp:anchor>
+            </w:drawing>
+          </mc:Choice>
+          <mc:Fallback>
+            <w:pict>
+              <v:shapetype w14:anchorId="1A6091AB" id="_x0000_t202" coordsize="21600,21600" o:spt="202" path="m,l,21600r21600,l21600,xe">
+                <v:stroke joinstyle="miter"/>
+                <v:path gradientshapeok="t" o:connecttype="rect"/>
+              </v:shapetype>
+              <v:shape id="Text Box 1" o:spid="_x0000_s1026" type="#_x0000_t202" style="position:absolute;margin-left:-26.7pt;margin-top:398pt;width:504.65pt;height:.05pt;z-index:-251656192;visibility:visible;mso-wrap-style:square;mso-wrap-distance-left:9pt;mso-wrap-distance-top:0;mso-wrap-distance-right:9pt;mso-wrap-distance-bottom:0;mso-position-horizontal:absolute;mso-position-horizontal-relative:text;mso-position-vertical:absolute;mso-position-vertical-relative:text;v-text-anchor:top" o:gfxdata="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" stroked="f">
+                <v:textbox style="mso-fit-shape-to-text:t" inset="0,0,0,0">
+                  <w:txbxContent>
+                    <w:p>
+                      <w:pPr>
+                        <w:pStyle w:val="Caption"/>
+                        <w:jc w:val="center"/>
+                        <w:rPr>
+                          <w:noProof/>
+                        </w:rPr>
+                      </w:pPr>
+                      <w:r>
+                        <w:t xml:space="preserve">Figure </w:t>
+                      </w:r>
+                      <w:fldSimple w:instr=" SEQ Figure \* ARABIC ">
+                        <w:r>
+                          <w:rPr>
+                            <w:noProof/>
+                          </w:rPr>
+                          <w:t>3</w:t>
+                        </w:r>
+                      </w:fldSimple>
+                      <w:r>
+                        <w:t xml:space="preserve"> - Strategy design pattern for calculating patient alert levels.</w:t>
+                      </w:r>
+                    </w:p>
+                  </w:txbxContent>
+                </v:textbox>
+                <w10:wrap type="tight"/>
+              </v:shape>
+            </w:pict>
+          </mc:Fallback>
+        </mc:AlternateContent>
+      </w:r>
+      <w:r>
+        <w:rPr>
+          <w:noProof/>
+        </w:rPr>
+        <w:drawing>
+          <wp:anchor distT="0" distB="0" distL="114300" distR="114300" simplePos="0" relativeHeight="251658240" behindDoc="1" locked="0" layoutInCell="1" allowOverlap="1" wp14:anchorId="7C235224" wp14:editId="27968001">
+            <wp:simplePos x="0" y="0"/>
+            <wp:positionH relativeFrom="margin">
+              <wp:align>center</wp:align>
+            </wp:positionH>
+            <wp:positionV relativeFrom="paragraph">
+              <wp:posOffset>438683</wp:posOffset>
+            </wp:positionV>
+            <wp:extent cx="6409419" cy="4559783"/>
+            <wp:effectExtent l="0" t="0" r="0" b="0"/>
+            <wp:wrapTight wrapText="bothSides">
+              <wp:wrapPolygon edited="0">
+                <wp:start x="0" y="0"/>
+                <wp:lineTo x="0" y="21480"/>
+                <wp:lineTo x="21508" y="21480"/>
+                <wp:lineTo x="21508" y="0"/>
+                <wp:lineTo x="0" y="0"/>
+              </wp:wrapPolygon>
+            </wp:wrapTight>
+            <wp:docPr id="747547022" name="Picture 1"/>
+            <wp:cNvGraphicFramePr>
+              <a:graphicFrameLocks xmlns:a="http://schemas.openxmlformats.org/drawingml/2006/main" noChangeAspect="1"/>
+            </wp:cNvGraphicFramePr>
+            <a:graphic xmlns:a="http://schemas.openxmlformats.org/drawingml/2006/main">
+              <a:graphicData uri="http://schemas.openxmlformats.org/drawingml/2006/picture">
+                <pic:pic xmlns:pic="http://schemas.openxmlformats.org/drawingml/2006/picture">
+                  <pic:nvPicPr>
+                    <pic:cNvPr id="0" name="Picture 1"/>
+                    <pic:cNvPicPr>
+                      <a:picLocks noChangeAspect="1" noChangeArrowheads="1"/>
+                    </pic:cNvPicPr>
+                  </pic:nvPicPr>
+                  <pic:blipFill>
+                    <a:blip r:embed="rId7">
+                      <a:extLst>
+                        <a:ext uri="{28A0092B-C50C-407E-A947-70E740481C1C}">
+                          <a14:useLocalDpi xmlns:a14="http://schemas.microsoft.com/office/drawing/2010/main" val="0"/>
+                        </a:ext>
+                      </a:extLst>
+                    </a:blip>
+                    <a:srcRect/>
+                    <a:stretch>
+                      <a:fillRect/>
+                    </a:stretch>
+                  </pic:blipFill>
+                  <pic:spPr bwMode="auto">
+                    <a:xfrm>
+                      <a:off x="0" y="0"/>
+                      <a:ext cx="6409419" cy="4559783"/>
+                    </a:xfrm>
+                    <a:prstGeom prst="rect">
+                      <a:avLst/>
+                    </a:prstGeom>
+                    <a:noFill/>
+                    <a:ln>
+                      <a:noFill/>
+                    </a:ln>
+                  </pic:spPr>
+                </pic:pic>
+              </a:graphicData>
+            </a:graphic>
+          </wp:anchor>
+        </w:drawing>
+      </w:r>
+      <w:r>
         <w:t>FR3: Calculate the patient alert levels</w:t>
       </w:r>
     </w:p>
+    <w:p>
+      <w:r>
+        <w:rPr>
+          <w:b/>
+          <w:bCs/>
+        </w:rPr>
+        <w:t xml:space="preserve">Chosen design pattern: </w:t>
+      </w:r>
+      <w:r>
+        <w:t>Strategy</w:t>
+      </w:r>
+    </w:p>
+    <w:p>
+      <w:r>
+        <w:t xml:space="preserve">The </w:t>
+      </w:r>
+      <w:r>
+        <w:rPr>
+          <w:i/>
+          <w:iCs/>
+        </w:rPr>
+        <w:t>PatientManagementSystem</w:t>
+      </w:r>
+      <w:r>
+        <w:t xml:space="preserve"> needs to be able to calculate the alert level for patients, depending on their most recent vitals record. For this, I applied the strategy pattern, with a different strategy for each diagnosis, following the alert levels logic defined on the assignment page. </w:t>
+      </w:r>
+      <w:r>
+        <w:t xml:space="preserve">The particular strategy is defined within </w:t>
+      </w:r>
+      <w:r>
+        <w:rPr>
+          <w:i/>
+          <w:iCs/>
+        </w:rPr>
+        <w:t>Patient</w:t>
+      </w:r>
+      <w:r>
+        <w:t>, depending on the received diagnosis. It is assumed for now that a patient can only have one diagnosis; if this wasn’t the case, a vector of alert level strategies could be used, and the highest alert level overall used.</w:t>
+      </w:r>
+    </w:p>
+    <w:p>
+      <w:r>
+        <w:t xml:space="preserve">Instead of creating a new method in addition to </w:t>
+      </w:r>
+      <w:r>
+        <w:rPr>
+          <w:i/>
+          <w:iCs/>
+        </w:rPr>
+        <w:t>addVitals(…)</w:t>
+      </w:r>
+      <w:r>
+        <w:t xml:space="preserve">, I instead created a new enumeration to determine if a record is </w:t>
+      </w:r>
+      <w:r>
+        <w:rPr>
+          <w:i/>
+          <w:iCs/>
+        </w:rPr>
+        <w:t>Historical</w:t>
+      </w:r>
+      <w:r>
+        <w:t xml:space="preserve"> or a </w:t>
+      </w:r>
+      <w:r>
+        <w:rPr>
+          <w:i/>
+          <w:iCs/>
+        </w:rPr>
+        <w:t>NewRecord</w:t>
+      </w:r>
+      <w:r>
+        <w:t>. This means that when a database or file is initially loaded, alert levels are not automatically calculated for them. Only vitals recorded at runtime calculated alert levels.</w:t>
+      </w:r>
+    </w:p>
+    <w:p>
+      <w:pPr>
+        <w:rPr>
+          <w:b/>
+          <w:bCs/>
+        </w:rPr>
+      </w:pPr>
+      <w:r>
+        <w:rPr>
+          <w:b/>
+          <w:bCs/>
+        </w:rPr>
+        <w:t>How it works:</w:t>
+      </w:r>
+    </w:p>
+    <w:p>
+      <w:pPr>
+        <w:pStyle w:val="ListParagraph"/>
+        <w:numPr>
+          <w:ilvl w:val="0"/>
+          <w:numId w:val="5"/>
+        </w:numPr>
+      </w:pPr>
+      <w:r>
+        <w:t xml:space="preserve">When a database/file is loaded, </w:t>
+      </w:r>
+      <w:r>
+        <w:rPr>
+          <w:i/>
+          <w:iCs/>
+        </w:rPr>
+        <w:t>Patient</w:t>
+      </w:r>
+      <w:r>
+        <w:t xml:space="preserve"> adds the listed diagnosis, along with the corresponding </w:t>
+      </w:r>
+      <w:r>
+        <w:rPr>
+          <w:i/>
+          <w:iCs/>
+        </w:rPr>
+        <w:t>AlertLevelStrategy</w:t>
+      </w:r>
+      <w:r>
+        <w:t>.</w:t>
+      </w:r>
+    </w:p>
+    <w:p>
+      <w:pPr>
+        <w:pStyle w:val="ListParagraph"/>
+        <w:numPr>
+          <w:ilvl w:val="0"/>
+          <w:numId w:val="5"/>
+        </w:numPr>
+      </w:pPr>
+      <w:r>
+        <w:t xml:space="preserve">When vitals from a database/file are loaded, </w:t>
+      </w:r>
+      <w:r>
+        <w:rPr>
+          <w:i/>
+          <w:iCs/>
+        </w:rPr>
+        <w:t xml:space="preserve">addVitals(…) </w:t>
+      </w:r>
+      <w:r>
+        <w:t xml:space="preserve">is called with the default </w:t>
+      </w:r>
+      <w:r>
+        <w:rPr>
+          <w:i/>
+          <w:iCs/>
+        </w:rPr>
+        <w:t xml:space="preserve">VitalsRecordType::Historical </w:t>
+      </w:r>
+      <w:r>
+        <w:t>argument, skipping the alert level calculation.</w:t>
+      </w:r>
+    </w:p>
+    <w:p>
+      <w:pPr>
+        <w:pStyle w:val="ListParagraph"/>
+        <w:numPr>
+          <w:ilvl w:val="0"/>
+          <w:numId w:val="5"/>
+        </w:numPr>
+      </w:pPr>
+      <w:r>
+        <w:lastRenderedPageBreak/>
+        <w:t xml:space="preserve">When a user adds new vitals through the </w:t>
+      </w:r>
+      <w:r>
+        <w:rPr>
+          <w:i/>
+          <w:iCs/>
+        </w:rPr>
+        <w:t>PatientManagementSystem</w:t>
+      </w:r>
+      <w:r>
+        <w:t xml:space="preserve">, </w:t>
+      </w:r>
+      <w:r>
+        <w:rPr>
+          <w:i/>
+          <w:iCs/>
+        </w:rPr>
+        <w:t>VitalsRecordType::NewRecord</w:t>
+      </w:r>
+      <w:r>
+        <w:t xml:space="preserve"> is passed as an argument, prompting the </w:t>
+      </w:r>
+      <w:r>
+        <w:rPr>
+          <w:i/>
+          <w:iCs/>
+        </w:rPr>
+        <w:t>Patient</w:t>
+      </w:r>
+      <w:r>
+        <w:t xml:space="preserve"> to also call </w:t>
+      </w:r>
+      <w:r>
+        <w:rPr>
+          <w:i/>
+          <w:iCs/>
+        </w:rPr>
+        <w:t>calculateAlertLevel()</w:t>
+      </w:r>
+      <w:r>
+        <w:t>.</w:t>
+      </w:r>
+    </w:p>
+    <w:p>
+      <w:pPr>
+        <w:pStyle w:val="ListParagraph"/>
+        <w:numPr>
+          <w:ilvl w:val="0"/>
+          <w:numId w:val="5"/>
+        </w:numPr>
+      </w:pPr>
+      <w:r>
+        <w:t xml:space="preserve">Depending on the patient’s </w:t>
+      </w:r>
+      <w:r>
+        <w:rPr>
+          <w:i/>
+          <w:iCs/>
+        </w:rPr>
+        <w:t>AlertLevelStrategy</w:t>
+      </w:r>
+      <w:r>
+        <w:t xml:space="preserve">, a child strategy class for Cordyceps, Kepral’s Syndrome, or Andromeda Strain calls </w:t>
+      </w:r>
+      <w:r>
+        <w:rPr>
+          <w:i/>
+          <w:iCs/>
+        </w:rPr>
+        <w:t>calculateAlertLevel()</w:t>
+      </w:r>
+      <w:r>
+        <w:t>.</w:t>
+      </w:r>
+    </w:p>
+    <w:p>
+      <w:pPr>
+        <w:pStyle w:val="ListParagraph"/>
+        <w:numPr>
+          <w:ilvl w:val="0"/>
+          <w:numId w:val="5"/>
+        </w:numPr>
+      </w:pPr>
+      <w:r>
+        <w:t xml:space="preserve">The child class then uses the defined logic to return either </w:t>
+      </w:r>
+      <w:r>
+        <w:t xml:space="preserve">an </w:t>
+      </w:r>
+      <w:r>
+        <w:rPr>
+          <w:i/>
+          <w:iCs/>
+        </w:rPr>
+        <w:t>AlertLevel</w:t>
+      </w:r>
+      <w:r>
+        <w:t xml:space="preserve"> of </w:t>
+      </w:r>
+      <w:r>
+        <w:rPr>
+          <w:i/>
+          <w:iCs/>
+        </w:rPr>
+        <w:t>Green</w:t>
+      </w:r>
+      <w:r>
+        <w:t xml:space="preserve">, </w:t>
+      </w:r>
+      <w:r>
+        <w:rPr>
+          <w:i/>
+          <w:iCs/>
+        </w:rPr>
+        <w:t>Yellow</w:t>
+      </w:r>
+      <w:r>
+        <w:t xml:space="preserve">, </w:t>
+      </w:r>
+      <w:r>
+        <w:rPr>
+          <w:i/>
+          <w:iCs/>
+        </w:rPr>
+        <w:t>Orange</w:t>
+      </w:r>
+      <w:r>
+        <w:t xml:space="preserve">, or </w:t>
+      </w:r>
+      <w:r>
+        <w:rPr>
+          <w:i/>
+          <w:iCs/>
+        </w:rPr>
+        <w:t>Red.</w:t>
+      </w:r>
+    </w:p>
+    <w:p>
+      <w:pPr>
+        <w:pStyle w:val="ListParagraph"/>
+        <w:numPr>
+          <w:ilvl w:val="0"/>
+          <w:numId w:val="5"/>
+        </w:numPr>
+      </w:pPr>
+      <w:r>
+        <w:t xml:space="preserve">The patient stores this alert level with </w:t>
+      </w:r>
+      <w:proofErr w:type="spellStart"/>
+      <w:r>
+        <w:rPr>
+          <w:i/>
+          <w:iCs/>
+        </w:rPr>
+        <w:t>setAlertLevel</w:t>
+      </w:r>
+      <w:proofErr w:type="spellEnd"/>
+      <w:r>
+        <w:rPr>
+          <w:i/>
+          <w:iCs/>
+        </w:rPr>
+        <w:t>(…)</w:t>
+      </w:r>
+      <w:r>
+        <w:t xml:space="preserve">, printing if that alert level is above </w:t>
+      </w:r>
+      <w:r>
+        <w:rPr>
+          <w:i/>
+          <w:iCs/>
+        </w:rPr>
+        <w:t>Green</w:t>
+      </w:r>
+      <w:r>
+        <w:t>.</w:t>
+      </w:r>
+    </w:p>
+    <w:p>
+      <w:pPr>
+        <w:rPr>
+          <w:b/>
+          <w:bCs/>
+        </w:rPr>
+      </w:pPr>
+      <w:r>
+        <w:rPr>
+          <w:b/>
+          <w:bCs/>
+        </w:rPr>
+        <w:t>Git Commits:</w:t>
+      </w:r>
+    </w:p>
+    <w:p>
+      <w:pPr>
+        <w:pStyle w:val="ListParagraph"/>
+        <w:numPr>
+          <w:ilvl w:val="0"/>
+          <w:numId w:val="6"/>
+        </w:numPr>
+        <w:rPr>
+          <w:b/>
+          <w:bCs/>
+        </w:rPr>
+      </w:pPr>
+      <w:r>
+        <w:t xml:space="preserve">Commits </w:t>
+      </w:r>
+      <w:r>
+        <w:rPr>
+          <w:b/>
+          <w:bCs/>
+        </w:rPr>
+        <w:t>3665057e</w:t>
+      </w:r>
+      <w:r>
+        <w:t xml:space="preserve"> and </w:t>
+      </w:r>
+      <w:r>
+        <w:rPr>
+          <w:b/>
+          <w:bCs/>
+        </w:rPr>
+        <w:t>af8065a5</w:t>
+      </w:r>
+      <w:r>
+        <w:t xml:space="preserve"> set up the strategy pattern, create all relevant header/source files, and implements the abstract interface.</w:t>
+      </w:r>
+    </w:p>
+    <w:p>
+      <w:pPr>
+        <w:pStyle w:val="ListParagraph"/>
+        <w:numPr>
+          <w:ilvl w:val="0"/>
+          <w:numId w:val="6"/>
+        </w:numPr>
+        <w:rPr>
+          <w:b/>
+          <w:bCs/>
+        </w:rPr>
+      </w:pPr>
+      <w:r>
+        <w:t xml:space="preserve">Commits </w:t>
+      </w:r>
+      <w:r>
+        <w:rPr>
+          <w:b/>
+          <w:bCs/>
+        </w:rPr>
+        <w:t>fc44bf22</w:t>
+      </w:r>
+      <w:r>
+        <w:t xml:space="preserve">, </w:t>
+      </w:r>
+      <w:r>
+        <w:rPr>
+          <w:b/>
+          <w:bCs/>
+        </w:rPr>
+        <w:t>b96d88d4</w:t>
+      </w:r>
+      <w:r>
+        <w:t xml:space="preserve">, </w:t>
+      </w:r>
+      <w:r>
+        <w:rPr>
+          <w:b/>
+          <w:bCs/>
+        </w:rPr>
+        <w:t>52228952</w:t>
+      </w:r>
+      <w:r>
+        <w:t xml:space="preserve">, and </w:t>
+      </w:r>
+      <w:r>
+        <w:rPr>
+          <w:b/>
+          <w:bCs/>
+        </w:rPr>
+        <w:t xml:space="preserve">a672fe50 </w:t>
+      </w:r>
+      <w:r>
+        <w:t xml:space="preserve">override the </w:t>
+      </w:r>
+      <w:r>
+        <w:rPr>
+          <w:i/>
+          <w:iCs/>
+        </w:rPr>
+        <w:t>calculateAlertLevel()</w:t>
+      </w:r>
+      <w:r>
+        <w:t xml:space="preserve"> method from the abstract interface, in each derived class. Logic for each derived class is also implemented.</w:t>
+      </w:r>
+    </w:p>
+    <w:p>
+      <w:pPr>
+        <w:pStyle w:val="ListParagraph"/>
+        <w:numPr>
+          <w:ilvl w:val="0"/>
+          <w:numId w:val="6"/>
+        </w:numPr>
+        <w:rPr>
+          <w:b/>
+          <w:bCs/>
+        </w:rPr>
+      </w:pPr>
+      <w:r>
+        <w:t xml:space="preserve">Commits </w:t>
+      </w:r>
+      <w:r>
+        <w:rPr>
+          <w:b/>
+          <w:bCs/>
+        </w:rPr>
+        <w:t>cfd5cd4f</w:t>
+      </w:r>
+      <w:r>
+        <w:t xml:space="preserve"> and </w:t>
+      </w:r>
+      <w:r>
+        <w:rPr>
+          <w:b/>
+          <w:bCs/>
+        </w:rPr>
+        <w:t>775bab21</w:t>
+      </w:r>
+      <w:r>
+        <w:t xml:space="preserve"> create a new enumeration to distinguish between historical and new records.</w:t>
+      </w:r>
+    </w:p>
+    <w:p>
+      <w:pPr>
+        <w:pStyle w:val="ListParagraph"/>
+        <w:numPr>
+          <w:ilvl w:val="0"/>
+          <w:numId w:val="6"/>
+        </w:numPr>
+        <w:rPr>
+          <w:b/>
+          <w:bCs/>
+        </w:rPr>
+      </w:pPr>
+      <w:r>
+        <w:t xml:space="preserve">Commits </w:t>
+      </w:r>
+      <w:r>
+        <w:rPr>
+          <w:b/>
+          <w:bCs/>
+        </w:rPr>
+        <w:t>6169af36</w:t>
+      </w:r>
+      <w:r>
+        <w:t xml:space="preserve">, </w:t>
+      </w:r>
+      <w:r>
+        <w:rPr>
+          <w:b/>
+          <w:bCs/>
+        </w:rPr>
+        <w:t>25bb137d</w:t>
+      </w:r>
+      <w:r>
+        <w:t xml:space="preserve">, and </w:t>
+      </w:r>
+      <w:r>
+        <w:rPr>
+          <w:b/>
+          <w:bCs/>
+        </w:rPr>
+        <w:t>d836ac31</w:t>
+      </w:r>
+      <w:r>
+        <w:t xml:space="preserve"> modify the existing </w:t>
+      </w:r>
+      <w:r>
+        <w:rPr>
+          <w:i/>
+          <w:iCs/>
+        </w:rPr>
+        <w:t>Patient</w:t>
+      </w:r>
+      <w:r>
+        <w:t xml:space="preserve"> and </w:t>
+      </w:r>
+      <w:r>
+        <w:rPr>
+          <w:i/>
+          <w:iCs/>
+        </w:rPr>
+        <w:t xml:space="preserve">PatientManagementSystem </w:t>
+      </w:r>
+      <w:r>
+        <w:t>to calculate/set alert based on the given diagnosis.</w:t>
+      </w:r>
+    </w:p>
+    <w:p>
+      <w:pPr>
+        <w:pStyle w:val="Heading1"/>
+      </w:pPr>
+      <w:r>
+        <w:t>FR4: Alert the hospitals and GPs</w:t>
+      </w:r>
+    </w:p>
     <w:p/>
-    <w:p>
-      <w:pPr>
-        <w:pStyle w:val="Heading1"/>
-      </w:pPr>
-      <w:r>
-        <w:t>FR4: Alert the hospitals and GPs</w:t>
-      </w:r>
-    </w:p>
     <w:sectPr>
       <w:pgSz w:w="11906" w:h="16838"/>
       <w:pgMar w:top="1440" w:right="1440" w:bottom="1440" w:left="1440" w:header="708" w:footer="708" w:gutter="0"/>
@@ -1182,6 +1938,92 @@
 <file path=word/numbering.xml><?xml version="1.0" encoding="utf-8"?>
 <w:numbering xmlns:wpc="http://schemas.microsoft.com/office/word/2010/wordprocessingCanvas" xmlns:cx="http://schemas.microsoft.com/office/drawing/2014/chartex" xmlns:cx1="http://schemas.microsoft.com/office/drawing/2015/9/8/chartex" xmlns:cx2="http://schemas.microsoft.com/office/drawing/2015/10/21/chartex" xmlns:cx3="http://schemas.microsoft.com/office/drawing/2016/5/9/chartex" xmlns:cx4="http://schemas.microsoft.com/office/drawing/2016/5/10/chartex" xmlns:cx5="http://schemas.microsoft.com/office/drawing/2016/5/11/chartex" xmlns:cx6="http://schemas.microsoft.com/office/drawing/2016/5/12/chartex" xmlns:cx7="http://schemas.microsoft.com/office/drawing/2016/5/13/chartex" xmlns:cx8="http://schemas.microsoft.com/office/drawing/2016/5/14/chartex" xmlns:mc="http://schemas.openxmlformats.org/markup-compatibility/2006" xmlns:aink="http://schemas.microsoft.com/office/drawing/2016/ink" xmlns:am3d="http://schemas.microsoft.com/office/drawing/2017/model3d" xmlns:o="urn:schemas-microsoft-com:office:office" xmlns:oel="http://schemas.microsoft.com/office/2019/extlst" xmlns:r="http://schemas.openxmlformats.org/officeDocument/2006/relationships" xmlns:m="http://schemas.openxmlformats.org/officeDocument/2006/math" xmlns:v="urn:schemas-microsoft-com:vml" xmlns:wp14="http://schemas.microsoft.com/office/word/2010/wordprocessingDrawing" xmlns:wp="http://schemas.openxmlformats.org/drawingml/2006/wordprocessingDrawing" xmlns:w10="urn:schemas-microsoft-com:office:word" xmlns:w="http://schemas.openxmlformats.org/wordprocessingml/2006/main" xmlns:w14="http://schemas.microsoft.com/office/word/2010/wordml" xmlns:w15="http://schemas.microsoft.com/office/word/2012/wordml" xmlns:w16cex="http://schemas.microsoft.com/office/word/2018/wordml/cex" xmlns:w16cid="http://schemas.microsoft.com/office/word/2016/wordml/cid" xmlns:w16="http://schemas.microsoft.com/office/word/2018/wordml" xmlns:w16du="http://schemas.microsoft.com/office/word/2023/wordml/word16du" xmlns:w16sdtdh="http://schemas.microsoft.com/office/word/2020/wordml/sdtdatahash" xmlns:w16sdtfl="http://schemas.microsoft.com/office/word/2024/wordml/sdtformatlock" xmlns:w16se="http://schemas.microsoft.com/office/word/2015/wordml/symex" xmlns:wpg="http://schemas.microsoft.com/office/word/2010/wordprocessingGroup" xmlns:wpi="http://schemas.microsoft.com/office/word/2010/wordprocessingInk" xmlns:wne="http://schemas.microsoft.com/office/word/2006/wordml" xmlns:wps="http://schemas.microsoft.com/office/word/2010/wordprocessingShape" mc:Ignorable="w14 w15 w16se w16cid w16 w16cex w16sdtdh w16sdtfl w16du wp14">
   <w:abstractNum w:abstractNumId="0" w15:restartNumberingAfterBreak="0">
+    <w:nsid w:val="08775D69"/>
+    <w:multiLevelType w:val="hybridMultilevel"/>
+    <w:tmpl w:val="B1824814"/>
+    <w:lvl w:ilvl="0" w:tplc="0C09000F">
+      <w:start w:val="1"/>
+      <w:numFmt w:val="decimal"/>
+      <w:lvlText w:val="%1."/>
+      <w:lvlJc w:val="left"/>
+      <w:pPr>
+        <w:ind w:left="720" w:hanging="360"/>
+      </w:pPr>
+    </w:lvl>
+    <w:lvl w:ilvl="1" w:tplc="0C090019" w:tentative="1">
+      <w:start w:val="1"/>
+      <w:numFmt w:val="lowerLetter"/>
+      <w:lvlText w:val="%2."/>
+      <w:lvlJc w:val="left"/>
+      <w:pPr>
+        <w:ind w:left="1440" w:hanging="360"/>
+      </w:pPr>
+    </w:lvl>
+    <w:lvl w:ilvl="2" w:tplc="0C09001B" w:tentative="1">
+      <w:start w:val="1"/>
+      <w:numFmt w:val="lowerRoman"/>
+      <w:lvlText w:val="%3."/>
+      <w:lvlJc w:val="right"/>
+      <w:pPr>
+        <w:ind w:left="2160" w:hanging="180"/>
+      </w:pPr>
+    </w:lvl>
+    <w:lvl w:ilvl="3" w:tplc="0C09000F" w:tentative="1">
+      <w:start w:val="1"/>
+      <w:numFmt w:val="decimal"/>
+      <w:lvlText w:val="%4."/>
+      <w:lvlJc w:val="left"/>
+      <w:pPr>
+        <w:ind w:left="2880" w:hanging="360"/>
+      </w:pPr>
+    </w:lvl>
+    <w:lvl w:ilvl="4" w:tplc="0C090019" w:tentative="1">
+      <w:start w:val="1"/>
+      <w:numFmt w:val="lowerLetter"/>
+      <w:lvlText w:val="%5."/>
+      <w:lvlJc w:val="left"/>
+      <w:pPr>
+        <w:ind w:left="3600" w:hanging="360"/>
+      </w:pPr>
+    </w:lvl>
+    <w:lvl w:ilvl="5" w:tplc="0C09001B" w:tentative="1">
+      <w:start w:val="1"/>
+      <w:numFmt w:val="lowerRoman"/>
+      <w:lvlText w:val="%6."/>
+      <w:lvlJc w:val="right"/>
+      <w:pPr>
+        <w:ind w:left="4320" w:hanging="180"/>
+      </w:pPr>
+    </w:lvl>
+    <w:lvl w:ilvl="6" w:tplc="0C09000F" w:tentative="1">
+      <w:start w:val="1"/>
+      <w:numFmt w:val="decimal"/>
+      <w:lvlText w:val="%7."/>
+      <w:lvlJc w:val="left"/>
+      <w:pPr>
+        <w:ind w:left="5040" w:hanging="360"/>
+      </w:pPr>
+    </w:lvl>
+    <w:lvl w:ilvl="7" w:tplc="0C090019" w:tentative="1">
+      <w:start w:val="1"/>
+      <w:numFmt w:val="lowerLetter"/>
+      <w:lvlText w:val="%8."/>
+      <w:lvlJc w:val="left"/>
+      <w:pPr>
+        <w:ind w:left="5760" w:hanging="360"/>
+      </w:pPr>
+    </w:lvl>
+    <w:lvl w:ilvl="8" w:tplc="0C09001B" w:tentative="1">
+      <w:start w:val="1"/>
+      <w:numFmt w:val="lowerRoman"/>
+      <w:lvlText w:val="%9."/>
+      <w:lvlJc w:val="right"/>
+      <w:pPr>
+        <w:ind w:left="6480" w:hanging="180"/>
+      </w:pPr>
+    </w:lvl>
+  </w:abstractNum>
+  <w:abstractNum w:abstractNumId="1" w15:restartNumberingAfterBreak="0">
     <w:nsid w:val="1CE65160"/>
     <w:multiLevelType w:val="hybridMultilevel"/>
     <w:tmpl w:val="3A960AA6"/>
@@ -1294,7 +2136,7 @@
       </w:rPr>
     </w:lvl>
   </w:abstractNum>
-  <w:abstractNum w:abstractNumId="1" w15:restartNumberingAfterBreak="0">
+  <w:abstractNum w:abstractNumId="2" w15:restartNumberingAfterBreak="0">
     <w:nsid w:val="321C183C"/>
     <w:multiLevelType w:val="hybridMultilevel"/>
     <w:tmpl w:val="A65EE59E"/>
@@ -1383,7 +2225,7 @@
       </w:pPr>
     </w:lvl>
   </w:abstractNum>
-  <w:abstractNum w:abstractNumId="2" w15:restartNumberingAfterBreak="0">
+  <w:abstractNum w:abstractNumId="3" w15:restartNumberingAfterBreak="0">
     <w:nsid w:val="5352295F"/>
     <w:multiLevelType w:val="hybridMultilevel"/>
     <w:tmpl w:val="23C22DF6"/>
@@ -1472,7 +2314,120 @@
       </w:pPr>
     </w:lvl>
   </w:abstractNum>
-  <w:abstractNum w:abstractNumId="3" w15:restartNumberingAfterBreak="0">
+  <w:abstractNum w:abstractNumId="4" w15:restartNumberingAfterBreak="0">
+    <w:nsid w:val="597E7952"/>
+    <w:multiLevelType w:val="hybridMultilevel"/>
+    <w:tmpl w:val="2DA6B8B2"/>
+    <w:lvl w:ilvl="0" w:tplc="0C090001">
+      <w:start w:val="1"/>
+      <w:numFmt w:val="bullet"/>
+      <w:lvlText w:val=""/>
+      <w:lvlJc w:val="left"/>
+      <w:pPr>
+        <w:ind w:left="720" w:hanging="360"/>
+      </w:pPr>
+      <w:rPr>
+        <w:rFonts w:ascii="Symbol" w:hAnsi="Symbol" w:hint="default"/>
+      </w:rPr>
+    </w:lvl>
+    <w:lvl w:ilvl="1" w:tplc="0C090003" w:tentative="1">
+      <w:start w:val="1"/>
+      <w:numFmt w:val="bullet"/>
+      <w:lvlText w:val="o"/>
+      <w:lvlJc w:val="left"/>
+      <w:pPr>
+        <w:ind w:left="1440" w:hanging="360"/>
+      </w:pPr>
+      <w:rPr>
+        <w:rFonts w:ascii="Courier New" w:hAnsi="Courier New" w:cs="Courier New" w:hint="default"/>
+      </w:rPr>
+    </w:lvl>
+    <w:lvl w:ilvl="2" w:tplc="0C090005" w:tentative="1">
+      <w:start w:val="1"/>
+      <w:numFmt w:val="bullet"/>
+      <w:lvlText w:val=""/>
+      <w:lvlJc w:val="left"/>
+      <w:pPr>
+        <w:ind w:left="2160" w:hanging="360"/>
+      </w:pPr>
+      <w:rPr>
+        <w:rFonts w:ascii="Wingdings" w:hAnsi="Wingdings" w:hint="default"/>
+      </w:rPr>
+    </w:lvl>
+    <w:lvl w:ilvl="3" w:tplc="0C090001" w:tentative="1">
+      <w:start w:val="1"/>
+      <w:numFmt w:val="bullet"/>
+      <w:lvlText w:val=""/>
+      <w:lvlJc w:val="left"/>
+      <w:pPr>
+        <w:ind w:left="2880" w:hanging="360"/>
+      </w:pPr>
+      <w:rPr>
+        <w:rFonts w:ascii="Symbol" w:hAnsi="Symbol" w:hint="default"/>
+      </w:rPr>
+    </w:lvl>
+    <w:lvl w:ilvl="4" w:tplc="0C090003" w:tentative="1">
+      <w:start w:val="1"/>
+      <w:numFmt w:val="bullet"/>
+      <w:lvlText w:val="o"/>
+      <w:lvlJc w:val="left"/>
+      <w:pPr>
+        <w:ind w:left="3600" w:hanging="360"/>
+      </w:pPr>
+      <w:rPr>
+        <w:rFonts w:ascii="Courier New" w:hAnsi="Courier New" w:cs="Courier New" w:hint="default"/>
+      </w:rPr>
+    </w:lvl>
+    <w:lvl w:ilvl="5" w:tplc="0C090005" w:tentative="1">
+      <w:start w:val="1"/>
+      <w:numFmt w:val="bullet"/>
+      <w:lvlText w:val=""/>
+      <w:lvlJc w:val="left"/>
+      <w:pPr>
+        <w:ind w:left="4320" w:hanging="360"/>
+      </w:pPr>
+      <w:rPr>
+        <w:rFonts w:ascii="Wingdings" w:hAnsi="Wingdings" w:hint="default"/>
+      </w:rPr>
+    </w:lvl>
+    <w:lvl w:ilvl="6" w:tplc="0C090001" w:tentative="1">
+      <w:start w:val="1"/>
+      <w:numFmt w:val="bullet"/>
+      <w:lvlText w:val=""/>
+      <w:lvlJc w:val="left"/>
+      <w:pPr>
+        <w:ind w:left="5040" w:hanging="360"/>
+      </w:pPr>
+      <w:rPr>
+        <w:rFonts w:ascii="Symbol" w:hAnsi="Symbol" w:hint="default"/>
+      </w:rPr>
+    </w:lvl>
+    <w:lvl w:ilvl="7" w:tplc="0C090003" w:tentative="1">
+      <w:start w:val="1"/>
+      <w:numFmt w:val="bullet"/>
+      <w:lvlText w:val="o"/>
+      <w:lvlJc w:val="left"/>
+      <w:pPr>
+        <w:ind w:left="5760" w:hanging="360"/>
+      </w:pPr>
+      <w:rPr>
+        <w:rFonts w:ascii="Courier New" w:hAnsi="Courier New" w:cs="Courier New" w:hint="default"/>
+      </w:rPr>
+    </w:lvl>
+    <w:lvl w:ilvl="8" w:tplc="0C090005" w:tentative="1">
+      <w:start w:val="1"/>
+      <w:numFmt w:val="bullet"/>
+      <w:lvlText w:val=""/>
+      <w:lvlJc w:val="left"/>
+      <w:pPr>
+        <w:ind w:left="6480" w:hanging="360"/>
+      </w:pPr>
+      <w:rPr>
+        <w:rFonts w:ascii="Wingdings" w:hAnsi="Wingdings" w:hint="default"/>
+      </w:rPr>
+    </w:lvl>
+  </w:abstractNum>
+  <w:abstractNum w:abstractNumId="5" w15:restartNumberingAfterBreak="0">
     <w:nsid w:val="705825E3"/>
     <w:multiLevelType w:val="hybridMultilevel"/>
     <w:tmpl w:val="6074BA82"/>
@@ -1586,16 +2541,22 @@
     </w:lvl>
   </w:abstractNum>
   <w:num w:numId="1" w16cid:durableId="1428770149">
+    <w:abstractNumId w:val="2"/>
+  </w:num>
+  <w:num w:numId="2" w16cid:durableId="73432152">
     <w:abstractNumId w:val="1"/>
   </w:num>
-  <w:num w:numId="2" w16cid:durableId="73432152">
+  <w:num w:numId="3" w16cid:durableId="2082285570">
+    <w:abstractNumId w:val="3"/>
+  </w:num>
+  <w:num w:numId="4" w16cid:durableId="1218467137">
+    <w:abstractNumId w:val="5"/>
+  </w:num>
+  <w:num w:numId="5" w16cid:durableId="1850950043">
     <w:abstractNumId w:val="0"/>
   </w:num>
-  <w:num w:numId="3" w16cid:durableId="2082285570">
-    <w:abstractNumId w:val="2"/>
-  </w:num>
-  <w:num w:numId="4" w16cid:durableId="1218467137">
-    <w:abstractNumId w:val="3"/>
+  <w:num w:numId="6" w16cid:durableId="2003704331">
+    <w:abstractNumId w:val="4"/>
   </w:num>
 </w:numbering>
 </file>
@@ -2000,6 +2961,7 @@
   <w:style w:type="paragraph" w:default="1" w:styleId="Normal">
     <w:name w:val="Normal"/>
     <w:qFormat/>
+    <w:rsid w:val="007044EC"/>
   </w:style>
   <w:style w:type="paragraph" w:styleId="Heading1">
     <w:name w:val="heading 1"/>

</xml_diff>

<commit_message>
Update design document with fr4 and complete diagram
</commit_message>
<xml_diff>
--- a/design-document.docx
+++ b/design-document.docx
@@ -2,25 +2,1332 @@
 <file path=word/document.xml><?xml version="1.0" encoding="utf-8"?>
 <w:document xmlns:wpc="http://schemas.microsoft.com/office/word/2010/wordprocessingCanvas" xmlns:cx="http://schemas.microsoft.com/office/drawing/2014/chartex" xmlns:cx1="http://schemas.microsoft.com/office/drawing/2015/9/8/chartex" xmlns:cx2="http://schemas.microsoft.com/office/drawing/2015/10/21/chartex" xmlns:cx3="http://schemas.microsoft.com/office/drawing/2016/5/9/chartex" xmlns:cx4="http://schemas.microsoft.com/office/drawing/2016/5/10/chartex" xmlns:cx5="http://schemas.microsoft.com/office/drawing/2016/5/11/chartex" xmlns:cx6="http://schemas.microsoft.com/office/drawing/2016/5/12/chartex" xmlns:cx7="http://schemas.microsoft.com/office/drawing/2016/5/13/chartex" xmlns:cx8="http://schemas.microsoft.com/office/drawing/2016/5/14/chartex" xmlns:mc="http://schemas.openxmlformats.org/markup-compatibility/2006" xmlns:aink="http://schemas.microsoft.com/office/drawing/2016/ink" xmlns:am3d="http://schemas.microsoft.com/office/drawing/2017/model3d" xmlns:o="urn:schemas-microsoft-com:office:office" xmlns:oel="http://schemas.microsoft.com/office/2019/extlst" xmlns:r="http://schemas.openxmlformats.org/officeDocument/2006/relationships" xmlns:m="http://schemas.openxmlformats.org/officeDocument/2006/math" xmlns:v="urn:schemas-microsoft-com:vml" xmlns:wp14="http://schemas.microsoft.com/office/word/2010/wordprocessingDrawing" xmlns:wp="http://schemas.openxmlformats.org/drawingml/2006/wordprocessingDrawing" xmlns:w10="urn:schemas-microsoft-com:office:word" xmlns:w="http://schemas.openxmlformats.org/wordprocessingml/2006/main" xmlns:w14="http://schemas.microsoft.com/office/word/2010/wordml" xmlns:w15="http://schemas.microsoft.com/office/word/2012/wordml" xmlns:w16cex="http://schemas.microsoft.com/office/word/2018/wordml/cex" xmlns:w16cid="http://schemas.microsoft.com/office/word/2016/wordml/cid" xmlns:w16="http://schemas.microsoft.com/office/word/2018/wordml" xmlns:w16du="http://schemas.microsoft.com/office/word/2023/wordml/word16du" xmlns:w16sdtdh="http://schemas.microsoft.com/office/word/2020/wordml/sdtdatahash" xmlns:w16sdtfl="http://schemas.microsoft.com/office/word/2024/wordml/sdtformatlock" xmlns:w16se="http://schemas.microsoft.com/office/word/2015/wordml/symex" xmlns:wpg="http://schemas.microsoft.com/office/word/2010/wordprocessingGroup" xmlns:wpi="http://schemas.microsoft.com/office/word/2010/wordprocessingInk" xmlns:wne="http://schemas.microsoft.com/office/word/2006/wordml" xmlns:wps="http://schemas.microsoft.com/office/word/2010/wordprocessingShape" mc:Ignorable="w14 w15 w16se w16cid w16 w16cex w16sdtdh w16sdtfl w16du wp14">
   <w:body>
+    <w:sdt>
+      <w:sdtPr>
+        <w:id w:val="-864372294"/>
+        <w:docPartObj>
+          <w:docPartGallery w:val="Cover Pages"/>
+          <w:docPartUnique/>
+        </w:docPartObj>
+      </w:sdtPr>
+      <w:sdtContent>
+        <w:p>
+          <w:r>
+            <w:rPr>
+              <w:noProof/>
+            </w:rPr>
+            <mc:AlternateContent>
+              <mc:Choice Requires="wpg">
+                <w:drawing>
+                  <wp:anchor distT="0" distB="0" distL="114300" distR="114300" simplePos="0" relativeHeight="251668480" behindDoc="0" locked="0" layoutInCell="1" allowOverlap="1" wp14:anchorId="247779EE" wp14:editId="168D6ED0">
+                    <wp:simplePos x="0" y="0"/>
+                    <wp:positionH relativeFrom="page">
+                      <wp:align>center</wp:align>
+                    </wp:positionH>
+                    <mc:AlternateContent>
+                      <mc:Choice Requires="wp14">
+                        <wp:positionV relativeFrom="page">
+                          <wp14:pctPosVOffset>2300</wp14:pctPosVOffset>
+                        </wp:positionV>
+                      </mc:Choice>
+                      <mc:Fallback>
+                        <wp:positionV relativeFrom="page">
+                          <wp:posOffset>245745</wp:posOffset>
+                        </wp:positionV>
+                      </mc:Fallback>
+                    </mc:AlternateContent>
+                    <wp:extent cx="7315200" cy="1215391"/>
+                    <wp:effectExtent l="0" t="0" r="1270" b="1905"/>
+                    <wp:wrapNone/>
+                    <wp:docPr id="149" name="Group 157"/>
+                    <wp:cNvGraphicFramePr/>
+                    <a:graphic xmlns:a="http://schemas.openxmlformats.org/drawingml/2006/main">
+                      <a:graphicData uri="http://schemas.microsoft.com/office/word/2010/wordprocessingGroup">
+                        <wpg:wgp>
+                          <wpg:cNvGrpSpPr/>
+                          <wpg:grpSpPr>
+                            <a:xfrm>
+                              <a:off x="0" y="0"/>
+                              <a:ext cx="7315200" cy="1215391"/>
+                              <a:chOff x="0" y="-1"/>
+                              <a:chExt cx="7315200" cy="1216153"/>
+                            </a:xfrm>
+                          </wpg:grpSpPr>
+                          <wps:wsp>
+                            <wps:cNvPr id="150" name="Rectangle 51"/>
+                            <wps:cNvSpPr/>
+                            <wps:spPr>
+                              <a:xfrm>
+                                <a:off x="0" y="-1"/>
+                                <a:ext cx="7315200" cy="1130373"/>
+                              </a:xfrm>
+                              <a:custGeom>
+                                <a:avLst/>
+                                <a:gdLst>
+                                  <a:gd name="connsiteX0" fmla="*/ 0 w 7312660"/>
+                                  <a:gd name="connsiteY0" fmla="*/ 0 h 1215390"/>
+                                  <a:gd name="connsiteX1" fmla="*/ 7312660 w 7312660"/>
+                                  <a:gd name="connsiteY1" fmla="*/ 0 h 1215390"/>
+                                  <a:gd name="connsiteX2" fmla="*/ 7312660 w 7312660"/>
+                                  <a:gd name="connsiteY2" fmla="*/ 1215390 h 1215390"/>
+                                  <a:gd name="connsiteX3" fmla="*/ 0 w 7312660"/>
+                                  <a:gd name="connsiteY3" fmla="*/ 1215390 h 1215390"/>
+                                  <a:gd name="connsiteX4" fmla="*/ 0 w 7312660"/>
+                                  <a:gd name="connsiteY4" fmla="*/ 0 h 1215390"/>
+                                  <a:gd name="connsiteX0" fmla="*/ 0 w 7312660"/>
+                                  <a:gd name="connsiteY0" fmla="*/ 0 h 1215390"/>
+                                  <a:gd name="connsiteX1" fmla="*/ 7312660 w 7312660"/>
+                                  <a:gd name="connsiteY1" fmla="*/ 0 h 1215390"/>
+                                  <a:gd name="connsiteX2" fmla="*/ 7312660 w 7312660"/>
+                                  <a:gd name="connsiteY2" fmla="*/ 1215390 h 1215390"/>
+                                  <a:gd name="connsiteX3" fmla="*/ 3667125 w 7312660"/>
+                                  <a:gd name="connsiteY3" fmla="*/ 1209675 h 1215390"/>
+                                  <a:gd name="connsiteX4" fmla="*/ 0 w 7312660"/>
+                                  <a:gd name="connsiteY4" fmla="*/ 1215390 h 1215390"/>
+                                  <a:gd name="connsiteX5" fmla="*/ 0 w 7312660"/>
+                                  <a:gd name="connsiteY5" fmla="*/ 0 h 1215390"/>
+                                  <a:gd name="connsiteX0" fmla="*/ 0 w 7312660"/>
+                                  <a:gd name="connsiteY0" fmla="*/ 0 h 1215390"/>
+                                  <a:gd name="connsiteX1" fmla="*/ 7312660 w 7312660"/>
+                                  <a:gd name="connsiteY1" fmla="*/ 0 h 1215390"/>
+                                  <a:gd name="connsiteX2" fmla="*/ 7312660 w 7312660"/>
+                                  <a:gd name="connsiteY2" fmla="*/ 1215390 h 1215390"/>
+                                  <a:gd name="connsiteX3" fmla="*/ 3619500 w 7312660"/>
+                                  <a:gd name="connsiteY3" fmla="*/ 733425 h 1215390"/>
+                                  <a:gd name="connsiteX4" fmla="*/ 0 w 7312660"/>
+                                  <a:gd name="connsiteY4" fmla="*/ 1215390 h 1215390"/>
+                                  <a:gd name="connsiteX5" fmla="*/ 0 w 7312660"/>
+                                  <a:gd name="connsiteY5" fmla="*/ 0 h 1215390"/>
+                                  <a:gd name="connsiteX0" fmla="*/ 0 w 7312660"/>
+                                  <a:gd name="connsiteY0" fmla="*/ 0 h 1215390"/>
+                                  <a:gd name="connsiteX1" fmla="*/ 7312660 w 7312660"/>
+                                  <a:gd name="connsiteY1" fmla="*/ 0 h 1215390"/>
+                                  <a:gd name="connsiteX2" fmla="*/ 7312660 w 7312660"/>
+                                  <a:gd name="connsiteY2" fmla="*/ 1129665 h 1215390"/>
+                                  <a:gd name="connsiteX3" fmla="*/ 3619500 w 7312660"/>
+                                  <a:gd name="connsiteY3" fmla="*/ 733425 h 1215390"/>
+                                  <a:gd name="connsiteX4" fmla="*/ 0 w 7312660"/>
+                                  <a:gd name="connsiteY4" fmla="*/ 1215390 h 1215390"/>
+                                  <a:gd name="connsiteX5" fmla="*/ 0 w 7312660"/>
+                                  <a:gd name="connsiteY5" fmla="*/ 0 h 1215390"/>
+                                  <a:gd name="connsiteX0" fmla="*/ 9525 w 7322185"/>
+                                  <a:gd name="connsiteY0" fmla="*/ 0 h 1129665"/>
+                                  <a:gd name="connsiteX1" fmla="*/ 7322185 w 7322185"/>
+                                  <a:gd name="connsiteY1" fmla="*/ 0 h 1129665"/>
+                                  <a:gd name="connsiteX2" fmla="*/ 7322185 w 7322185"/>
+                                  <a:gd name="connsiteY2" fmla="*/ 1129665 h 1129665"/>
+                                  <a:gd name="connsiteX3" fmla="*/ 3629025 w 7322185"/>
+                                  <a:gd name="connsiteY3" fmla="*/ 733425 h 1129665"/>
+                                  <a:gd name="connsiteX4" fmla="*/ 0 w 7322185"/>
+                                  <a:gd name="connsiteY4" fmla="*/ 1091565 h 1129665"/>
+                                  <a:gd name="connsiteX5" fmla="*/ 9525 w 7322185"/>
+                                  <a:gd name="connsiteY5" fmla="*/ 0 h 1129665"/>
+                                  <a:gd name="connsiteX0" fmla="*/ 0 w 7312660"/>
+                                  <a:gd name="connsiteY0" fmla="*/ 0 h 1129665"/>
+                                  <a:gd name="connsiteX1" fmla="*/ 7312660 w 7312660"/>
+                                  <a:gd name="connsiteY1" fmla="*/ 0 h 1129665"/>
+                                  <a:gd name="connsiteX2" fmla="*/ 7312660 w 7312660"/>
+                                  <a:gd name="connsiteY2" fmla="*/ 1129665 h 1129665"/>
+                                  <a:gd name="connsiteX3" fmla="*/ 3619500 w 7312660"/>
+                                  <a:gd name="connsiteY3" fmla="*/ 733425 h 1129665"/>
+                                  <a:gd name="connsiteX4" fmla="*/ 0 w 7312660"/>
+                                  <a:gd name="connsiteY4" fmla="*/ 1091565 h 1129665"/>
+                                  <a:gd name="connsiteX5" fmla="*/ 0 w 7312660"/>
+                                  <a:gd name="connsiteY5" fmla="*/ 0 h 1129665"/>
+                                </a:gdLst>
+                                <a:ahLst/>
+                                <a:cxnLst>
+                                  <a:cxn ang="0">
+                                    <a:pos x="connsiteX0" y="connsiteY0"/>
+                                  </a:cxn>
+                                  <a:cxn ang="0">
+                                    <a:pos x="connsiteX1" y="connsiteY1"/>
+                                  </a:cxn>
+                                  <a:cxn ang="0">
+                                    <a:pos x="connsiteX2" y="connsiteY2"/>
+                                  </a:cxn>
+                                  <a:cxn ang="0">
+                                    <a:pos x="connsiteX3" y="connsiteY3"/>
+                                  </a:cxn>
+                                  <a:cxn ang="0">
+                                    <a:pos x="connsiteX4" y="connsiteY4"/>
+                                  </a:cxn>
+                                  <a:cxn ang="0">
+                                    <a:pos x="connsiteX5" y="connsiteY5"/>
+                                  </a:cxn>
+                                </a:cxnLst>
+                                <a:rect l="l" t="t" r="r" b="b"/>
+                                <a:pathLst>
+                                  <a:path w="7312660" h="1129665">
+                                    <a:moveTo>
+                                      <a:pt x="0" y="0"/>
+                                    </a:moveTo>
+                                    <a:lnTo>
+                                      <a:pt x="7312660" y="0"/>
+                                    </a:lnTo>
+                                    <a:lnTo>
+                                      <a:pt x="7312660" y="1129665"/>
+                                    </a:lnTo>
+                                    <a:lnTo>
+                                      <a:pt x="3619500" y="733425"/>
+                                    </a:lnTo>
+                                    <a:lnTo>
+                                      <a:pt x="0" y="1091565"/>
+                                    </a:lnTo>
+                                    <a:lnTo>
+                                      <a:pt x="0" y="0"/>
+                                    </a:lnTo>
+                                    <a:close/>
+                                  </a:path>
+                                </a:pathLst>
+                              </a:custGeom>
+                              <a:ln>
+                                <a:noFill/>
+                              </a:ln>
+                            </wps:spPr>
+                            <wps:style>
+                              <a:lnRef idx="2">
+                                <a:schemeClr val="accent1">
+                                  <a:shade val="50000"/>
+                                </a:schemeClr>
+                              </a:lnRef>
+                              <a:fillRef idx="1">
+                                <a:schemeClr val="accent1"/>
+                              </a:fillRef>
+                              <a:effectRef idx="0">
+                                <a:schemeClr val="accent1"/>
+                              </a:effectRef>
+                              <a:fontRef idx="minor">
+                                <a:schemeClr val="lt1"/>
+                              </a:fontRef>
+                            </wps:style>
+                            <wps:bodyPr rot="0" spcFirstLastPara="0" vertOverflow="overflow" horzOverflow="overflow" vert="horz" wrap="square" lIns="91440" tIns="45720" rIns="91440" bIns="45720" numCol="1" spcCol="0" rtlCol="0" fromWordArt="0" anchor="ctr" anchorCtr="0" forceAA="0" compatLnSpc="1">
+                              <a:prstTxWarp prst="textNoShape">
+                                <a:avLst/>
+                              </a:prstTxWarp>
+                              <a:noAutofit/>
+                            </wps:bodyPr>
+                          </wps:wsp>
+                          <wps:wsp>
+                            <wps:cNvPr id="151" name="Rectangle 151"/>
+                            <wps:cNvSpPr/>
+                            <wps:spPr>
+                              <a:xfrm>
+                                <a:off x="0" y="0"/>
+                                <a:ext cx="7315200" cy="1216152"/>
+                              </a:xfrm>
+                              <a:prstGeom prst="rect">
+                                <a:avLst/>
+                              </a:prstGeom>
+                              <a:blipFill>
+                                <a:blip r:embed="rId7"/>
+                                <a:stretch>
+                                  <a:fillRect r="-7574"/>
+                                </a:stretch>
+                              </a:blipFill>
+                              <a:ln>
+                                <a:noFill/>
+                              </a:ln>
+                            </wps:spPr>
+                            <wps:style>
+                              <a:lnRef idx="2">
+                                <a:schemeClr val="accent1">
+                                  <a:shade val="50000"/>
+                                </a:schemeClr>
+                              </a:lnRef>
+                              <a:fillRef idx="1">
+                                <a:schemeClr val="accent1"/>
+                              </a:fillRef>
+                              <a:effectRef idx="0">
+                                <a:schemeClr val="accent1"/>
+                              </a:effectRef>
+                              <a:fontRef idx="minor">
+                                <a:schemeClr val="lt1"/>
+                              </a:fontRef>
+                            </wps:style>
+                            <wps:bodyPr rot="0" spcFirstLastPara="0" vertOverflow="overflow" horzOverflow="overflow" vert="horz" wrap="square" lIns="91440" tIns="45720" rIns="91440" bIns="45720" numCol="1" spcCol="0" rtlCol="0" fromWordArt="0" anchor="ctr" anchorCtr="0" forceAA="0" compatLnSpc="1">
+                              <a:prstTxWarp prst="textNoShape">
+                                <a:avLst/>
+                              </a:prstTxWarp>
+                              <a:noAutofit/>
+                            </wps:bodyPr>
+                          </wps:wsp>
+                        </wpg:wgp>
+                      </a:graphicData>
+                    </a:graphic>
+                    <wp14:sizeRelH relativeFrom="page">
+                      <wp14:pctWidth>94100</wp14:pctWidth>
+                    </wp14:sizeRelH>
+                    <wp14:sizeRelV relativeFrom="page">
+                      <wp14:pctHeight>12100</wp14:pctHeight>
+                    </wp14:sizeRelV>
+                  </wp:anchor>
+                </w:drawing>
+              </mc:Choice>
+              <mc:Fallback>
+                <w:pict>
+                  <v:group w14:anchorId="32836325" id="Group 157" o:spid="_x0000_s1026" style="position:absolute;margin-left:0;margin-top:0;width:8in;height:95.7pt;z-index:251668480;mso-width-percent:941;mso-height-percent:121;mso-top-percent:23;mso-position-horizontal:center;mso-position-horizontal-relative:page;mso-position-vertical-relative:page;mso-width-percent:941;mso-height-percent:121;mso-top-percent:23" coordorigin="" coordsize="73152,12161" o:gfxdata="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">
+                    <v:shape id="Rectangle 51" o:spid="_x0000_s1027" style="position:absolute;width:73152;height:11303;visibility:visible;mso-wrap-style:square;v-text-anchor:middle" coordsize="7312660,1129665" o:gfxdata="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" path="m,l7312660,r,1129665l3619500,733425,,1091565,,xe" fillcolor="#156082 [3204]" stroked="f" strokeweight="1pt">
+                      <v:stroke joinstyle="miter"/>
+                      <v:path arrowok="t" o:connecttype="custom" o:connectlocs="0,0;7315200,0;7315200,1130373;3620757,733885;0,1092249;0,0" o:connectangles="0,0,0,0,0,0"/>
+                    </v:shape>
+                    <v:rect id="Rectangle 151" o:spid="_x0000_s1028" style="position:absolute;width:73152;height:12161;visibility:visible;mso-wrap-style:square;v-text-anchor:middle" o:gfxdata="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" stroked="f" strokeweight="1pt">
+                      <v:fill r:id="rId8" o:title="" recolor="t" rotate="t" type="frame"/>
+                    </v:rect>
+                    <w10:wrap anchorx="page" anchory="page"/>
+                  </v:group>
+                </w:pict>
+              </mc:Fallback>
+            </mc:AlternateContent>
+          </w:r>
+          <w:r>
+            <w:rPr>
+              <w:noProof/>
+            </w:rPr>
+            <mc:AlternateContent>
+              <mc:Choice Requires="wps">
+                <w:drawing>
+                  <wp:anchor distT="0" distB="0" distL="114300" distR="114300" simplePos="0" relativeHeight="251666432" behindDoc="0" locked="0" layoutInCell="1" allowOverlap="1" wp14:anchorId="4AE0E2C0" wp14:editId="3067BAA4">
+                    <wp:simplePos x="0" y="0"/>
+                    <wp:positionH relativeFrom="page">
+                      <wp:align>center</wp:align>
+                    </wp:positionH>
+                    <mc:AlternateContent>
+                      <mc:Choice Requires="wp14">
+                        <wp:positionV relativeFrom="page">
+                          <wp14:pctPosVOffset>81800</wp14:pctPosVOffset>
+                        </wp:positionV>
+                      </mc:Choice>
+                      <mc:Fallback>
+                        <wp:positionV relativeFrom="page">
+                          <wp:posOffset>8745855</wp:posOffset>
+                        </wp:positionV>
+                      </mc:Fallback>
+                    </mc:AlternateContent>
+                    <wp:extent cx="7315200" cy="914400"/>
+                    <wp:effectExtent l="0" t="0" r="0" b="8255"/>
+                    <wp:wrapSquare wrapText="bothSides"/>
+                    <wp:docPr id="152" name="Text Box 159"/>
+                    <wp:cNvGraphicFramePr/>
+                    <a:graphic xmlns:a="http://schemas.openxmlformats.org/drawingml/2006/main">
+                      <a:graphicData uri="http://schemas.microsoft.com/office/word/2010/wordprocessingShape">
+                        <wps:wsp>
+                          <wps:cNvSpPr txBox="1"/>
+                          <wps:spPr>
+                            <a:xfrm>
+                              <a:off x="0" y="0"/>
+                              <a:ext cx="7315200" cy="914400"/>
+                            </a:xfrm>
+                            <a:prstGeom prst="rect">
+                              <a:avLst/>
+                            </a:prstGeom>
+                            <a:noFill/>
+                            <a:ln w="6350">
+                              <a:noFill/>
+                            </a:ln>
+                            <a:effectLst/>
+                          </wps:spPr>
+                          <wps:style>
+                            <a:lnRef idx="0">
+                              <a:schemeClr val="accent1"/>
+                            </a:lnRef>
+                            <a:fillRef idx="0">
+                              <a:schemeClr val="accent1"/>
+                            </a:fillRef>
+                            <a:effectRef idx="0">
+                              <a:schemeClr val="accent1"/>
+                            </a:effectRef>
+                            <a:fontRef idx="minor">
+                              <a:schemeClr val="dk1"/>
+                            </a:fontRef>
+                          </wps:style>
+                          <wps:txbx>
+                            <w:txbxContent>
+                              <w:sdt>
+                                <w:sdtPr>
+                                  <w:rPr>
+                                    <w:color w:val="595959" w:themeColor="text1" w:themeTint="A6"/>
+                                    <w:sz w:val="28"/>
+                                    <w:szCs w:val="28"/>
+                                  </w:rPr>
+                                  <w:alias w:val="Author"/>
+                                  <w:tag w:val=""/>
+                                  <w:id w:val="789243997"/>
+                                  <w:dataBinding w:prefixMappings="xmlns:ns0='http://purl.org/dc/elements/1.1/' xmlns:ns1='http://schemas.openxmlformats.org/package/2006/metadata/core-properties' " w:xpath="/ns1:coreProperties[1]/ns0:creator[1]" w:storeItemID="{6C3C8BC8-F283-45AE-878A-BAB7291924A1}"/>
+                                  <w:text/>
+                                </w:sdtPr>
+                                <w:sdtContent>
+                                  <w:p>
+                                    <w:pPr>
+                                      <w:pStyle w:val="NoSpacing"/>
+                                      <w:jc w:val="right"/>
+                                      <w:rPr>
+                                        <w:color w:val="595959" w:themeColor="text1" w:themeTint="A6"/>
+                                        <w:sz w:val="28"/>
+                                        <w:szCs w:val="28"/>
+                                      </w:rPr>
+                                    </w:pPr>
+                                    <w:r>
+                                      <w:rPr>
+                                        <w:color w:val="595959" w:themeColor="text1" w:themeTint="A6"/>
+                                        <w:sz w:val="28"/>
+                                        <w:szCs w:val="28"/>
+                                      </w:rPr>
+                                      <w:t>Adam Katic – A1706436</w:t>
+                                    </w:r>
+                                  </w:p>
+                                </w:sdtContent>
+                              </w:sdt>
+                              <w:p>
+                                <w:pPr>
+                                  <w:pStyle w:val="NoSpacing"/>
+                                  <w:jc w:val="right"/>
+                                  <w:rPr>
+                                    <w:color w:val="595959" w:themeColor="text1" w:themeTint="A6"/>
+                                    <w:sz w:val="18"/>
+                                    <w:szCs w:val="18"/>
+                                  </w:rPr>
+                                </w:pPr>
+                                <w:sdt>
+                                  <w:sdtPr>
+                                    <w:rPr>
+                                      <w:color w:val="595959" w:themeColor="text1" w:themeTint="A6"/>
+                                      <w:sz w:val="18"/>
+                                      <w:szCs w:val="18"/>
+                                    </w:rPr>
+                                    <w:alias w:val="Email"/>
+                                    <w:tag w:val="Email"/>
+                                    <w:id w:val="942260680"/>
+                                    <w:showingPlcHdr/>
+                                    <w:dataBinding w:prefixMappings="xmlns:ns0='http://schemas.microsoft.com/office/2006/coverPageProps' " w:xpath="/ns0:CoverPageProperties[1]/ns0:CompanyEmail[1]" w:storeItemID="{55AF091B-3C7A-41E3-B477-F2FDAA23CFDA}"/>
+                                    <w:text/>
+                                  </w:sdtPr>
+                                  <w:sdtContent>
+                                    <w:r>
+                                      <w:rPr>
+                                        <w:color w:val="595959" w:themeColor="text1" w:themeTint="A6"/>
+                                        <w:sz w:val="18"/>
+                                        <w:szCs w:val="18"/>
+                                      </w:rPr>
+                                      <w:t xml:space="preserve">     </w:t>
+                                    </w:r>
+                                  </w:sdtContent>
+                                </w:sdt>
+                              </w:p>
+                            </w:txbxContent>
+                          </wps:txbx>
+                          <wps:bodyPr rot="0" spcFirstLastPara="0" vertOverflow="overflow" horzOverflow="overflow" vert="horz" wrap="square" lIns="1600200" tIns="0" rIns="685800" bIns="0" numCol="1" spcCol="0" rtlCol="0" fromWordArt="0" anchor="b" anchorCtr="0" forceAA="0" compatLnSpc="1">
+                            <a:prstTxWarp prst="textNoShape">
+                              <a:avLst/>
+                            </a:prstTxWarp>
+                            <a:noAutofit/>
+                          </wps:bodyPr>
+                        </wps:wsp>
+                      </a:graphicData>
+                    </a:graphic>
+                    <wp14:sizeRelH relativeFrom="page">
+                      <wp14:pctWidth>94100</wp14:pctWidth>
+                    </wp14:sizeRelH>
+                    <wp14:sizeRelV relativeFrom="page">
+                      <wp14:pctHeight>9200</wp14:pctHeight>
+                    </wp14:sizeRelV>
+                  </wp:anchor>
+                </w:drawing>
+              </mc:Choice>
+              <mc:Fallback>
+                <w:pict>
+                  <v:shapetype w14:anchorId="4AE0E2C0" id="_x0000_t202" coordsize="21600,21600" o:spt="202" path="m,l,21600r21600,l21600,xe">
+                    <v:stroke joinstyle="miter"/>
+                    <v:path gradientshapeok="t" o:connecttype="rect"/>
+                  </v:shapetype>
+                  <v:shape id="Text Box 159" o:spid="_x0000_s1026" type="#_x0000_t202" style="position:absolute;margin-left:0;margin-top:0;width:8in;height:1in;z-index:251666432;visibility:visible;mso-wrap-style:square;mso-width-percent:941;mso-height-percent:92;mso-top-percent:818;mso-wrap-distance-left:9pt;mso-wrap-distance-top:0;mso-wrap-distance-right:9pt;mso-wrap-distance-bottom:0;mso-position-horizontal:center;mso-position-horizontal-relative:page;mso-position-vertical-relative:page;mso-width-percent:941;mso-height-percent:92;mso-top-percent:818;mso-width-relative:page;mso-height-relative:page;v-text-anchor:bottom" o:gfxdata="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" filled="f" stroked="f" strokeweight=".5pt">
+                    <v:textbox inset="126pt,0,54pt,0">
+                      <w:txbxContent>
+                        <w:sdt>
+                          <w:sdtPr>
+                            <w:rPr>
+                              <w:color w:val="595959" w:themeColor="text1" w:themeTint="A6"/>
+                              <w:sz w:val="28"/>
+                              <w:szCs w:val="28"/>
+                            </w:rPr>
+                            <w:alias w:val="Author"/>
+                            <w:tag w:val=""/>
+                            <w:id w:val="789243997"/>
+                            <w:dataBinding w:prefixMappings="xmlns:ns0='http://purl.org/dc/elements/1.1/' xmlns:ns1='http://schemas.openxmlformats.org/package/2006/metadata/core-properties' " w:xpath="/ns1:coreProperties[1]/ns0:creator[1]" w:storeItemID="{6C3C8BC8-F283-45AE-878A-BAB7291924A1}"/>
+                            <w:text/>
+                          </w:sdtPr>
+                          <w:sdtContent>
+                            <w:p>
+                              <w:pPr>
+                                <w:pStyle w:val="NoSpacing"/>
+                                <w:jc w:val="right"/>
+                                <w:rPr>
+                                  <w:color w:val="595959" w:themeColor="text1" w:themeTint="A6"/>
+                                  <w:sz w:val="28"/>
+                                  <w:szCs w:val="28"/>
+                                </w:rPr>
+                              </w:pPr>
+                              <w:r>
+                                <w:rPr>
+                                  <w:color w:val="595959" w:themeColor="text1" w:themeTint="A6"/>
+                                  <w:sz w:val="28"/>
+                                  <w:szCs w:val="28"/>
+                                </w:rPr>
+                                <w:t>Adam Katic – A1706436</w:t>
+                              </w:r>
+                            </w:p>
+                          </w:sdtContent>
+                        </w:sdt>
+                        <w:p>
+                          <w:pPr>
+                            <w:pStyle w:val="NoSpacing"/>
+                            <w:jc w:val="right"/>
+                            <w:rPr>
+                              <w:color w:val="595959" w:themeColor="text1" w:themeTint="A6"/>
+                              <w:sz w:val="18"/>
+                              <w:szCs w:val="18"/>
+                            </w:rPr>
+                          </w:pPr>
+                          <w:sdt>
+                            <w:sdtPr>
+                              <w:rPr>
+                                <w:color w:val="595959" w:themeColor="text1" w:themeTint="A6"/>
+                                <w:sz w:val="18"/>
+                                <w:szCs w:val="18"/>
+                              </w:rPr>
+                              <w:alias w:val="Email"/>
+                              <w:tag w:val="Email"/>
+                              <w:id w:val="942260680"/>
+                              <w:showingPlcHdr/>
+                              <w:dataBinding w:prefixMappings="xmlns:ns0='http://schemas.microsoft.com/office/2006/coverPageProps' " w:xpath="/ns0:CoverPageProperties[1]/ns0:CompanyEmail[1]" w:storeItemID="{55AF091B-3C7A-41E3-B477-F2FDAA23CFDA}"/>
+                              <w:text/>
+                            </w:sdtPr>
+                            <w:sdtContent>
+                              <w:r>
+                                <w:rPr>
+                                  <w:color w:val="595959" w:themeColor="text1" w:themeTint="A6"/>
+                                  <w:sz w:val="18"/>
+                                  <w:szCs w:val="18"/>
+                                </w:rPr>
+                                <w:t xml:space="preserve">     </w:t>
+                              </w:r>
+                            </w:sdtContent>
+                          </w:sdt>
+                        </w:p>
+                      </w:txbxContent>
+                    </v:textbox>
+                    <w10:wrap type="square" anchorx="page" anchory="page"/>
+                  </v:shape>
+                </w:pict>
+              </mc:Fallback>
+            </mc:AlternateContent>
+          </w:r>
+          <w:r>
+            <w:rPr>
+              <w:noProof/>
+            </w:rPr>
+            <mc:AlternateContent>
+              <mc:Choice Requires="wps">
+                <w:drawing>
+                  <wp:anchor distT="0" distB="0" distL="114300" distR="114300" simplePos="0" relativeHeight="251665408" behindDoc="0" locked="0" layoutInCell="1" allowOverlap="1" wp14:anchorId="0AD33664" wp14:editId="1E5514CC">
+                    <wp:simplePos x="0" y="0"/>
+                    <wp:positionH relativeFrom="page">
+                      <wp:align>center</wp:align>
+                    </wp:positionH>
+                    <mc:AlternateContent>
+                      <mc:Choice Requires="wp14">
+                        <wp:positionV relativeFrom="page">
+                          <wp14:pctPosVOffset>30000</wp14:pctPosVOffset>
+                        </wp:positionV>
+                      </mc:Choice>
+                      <mc:Fallback>
+                        <wp:positionV relativeFrom="page">
+                          <wp:posOffset>3207385</wp:posOffset>
+                        </wp:positionV>
+                      </mc:Fallback>
+                    </mc:AlternateContent>
+                    <wp:extent cx="7315200" cy="3638550"/>
+                    <wp:effectExtent l="0" t="0" r="0" b="6350"/>
+                    <wp:wrapSquare wrapText="bothSides"/>
+                    <wp:docPr id="154" name="Text Box 163"/>
+                    <wp:cNvGraphicFramePr/>
+                    <a:graphic xmlns:a="http://schemas.openxmlformats.org/drawingml/2006/main">
+                      <a:graphicData uri="http://schemas.microsoft.com/office/word/2010/wordprocessingShape">
+                        <wps:wsp>
+                          <wps:cNvSpPr txBox="1"/>
+                          <wps:spPr>
+                            <a:xfrm>
+                              <a:off x="0" y="0"/>
+                              <a:ext cx="7315200" cy="3638550"/>
+                            </a:xfrm>
+                            <a:prstGeom prst="rect">
+                              <a:avLst/>
+                            </a:prstGeom>
+                            <a:noFill/>
+                            <a:ln w="6350">
+                              <a:noFill/>
+                            </a:ln>
+                            <a:effectLst/>
+                          </wps:spPr>
+                          <wps:style>
+                            <a:lnRef idx="0">
+                              <a:schemeClr val="accent1"/>
+                            </a:lnRef>
+                            <a:fillRef idx="0">
+                              <a:schemeClr val="accent1"/>
+                            </a:fillRef>
+                            <a:effectRef idx="0">
+                              <a:schemeClr val="accent1"/>
+                            </a:effectRef>
+                            <a:fontRef idx="minor">
+                              <a:schemeClr val="dk1"/>
+                            </a:fontRef>
+                          </wps:style>
+                          <wps:txbx>
+                            <w:txbxContent>
+                              <w:p>
+                                <w:pPr>
+                                  <w:jc w:val="right"/>
+                                  <w:rPr>
+                                    <w:color w:val="156082" w:themeColor="accent1"/>
+                                    <w:sz w:val="64"/>
+                                    <w:szCs w:val="64"/>
+                                  </w:rPr>
+                                </w:pPr>
+                                <w:sdt>
+                                  <w:sdtPr>
+                                    <w:rPr>
+                                      <w:caps/>
+                                      <w:color w:val="156082" w:themeColor="accent1"/>
+                                      <w:sz w:val="64"/>
+                                      <w:szCs w:val="64"/>
+                                    </w:rPr>
+                                    <w:alias w:val="Title"/>
+                                    <w:tag w:val=""/>
+                                    <w:id w:val="630141079"/>
+                                    <w:dataBinding w:prefixMappings="xmlns:ns0='http://purl.org/dc/elements/1.1/' xmlns:ns1='http://schemas.openxmlformats.org/package/2006/metadata/core-properties' " w:xpath="/ns1:coreProperties[1]/ns0:title[1]" w:storeItemID="{6C3C8BC8-F283-45AE-878A-BAB7291924A1}"/>
+                                    <w:text w:multiLine="1"/>
+                                  </w:sdtPr>
+                                  <w:sdtEndPr>
+                                    <w:rPr>
+                                      <w:caps w:val="0"/>
+                                    </w:rPr>
+                                  </w:sdtEndPr>
+                                  <w:sdtContent>
+                                    <w:r>
+                                      <w:rPr>
+                                        <w:caps/>
+                                        <w:color w:val="156082" w:themeColor="accent1"/>
+                                        <w:sz w:val="64"/>
+                                        <w:szCs w:val="64"/>
+                                      </w:rPr>
+                                      <w:t>COMP 1039 – Design patterns with c++</w:t>
+                                    </w:r>
+                                  </w:sdtContent>
+                                </w:sdt>
+                              </w:p>
+                              <w:sdt>
+                                <w:sdtPr>
+                                  <w:rPr>
+                                    <w:color w:val="404040" w:themeColor="text1" w:themeTint="BF"/>
+                                    <w:sz w:val="36"/>
+                                    <w:szCs w:val="36"/>
+                                  </w:rPr>
+                                  <w:alias w:val="Subtitle"/>
+                                  <w:tag w:val=""/>
+                                  <w:id w:val="1759551507"/>
+                                  <w:dataBinding w:prefixMappings="xmlns:ns0='http://purl.org/dc/elements/1.1/' xmlns:ns1='http://schemas.openxmlformats.org/package/2006/metadata/core-properties' " w:xpath="/ns1:coreProperties[1]/ns0:subject[1]" w:storeItemID="{6C3C8BC8-F283-45AE-878A-BAB7291924A1}"/>
+                                  <w:text/>
+                                </w:sdtPr>
+                                <w:sdtContent>
+                                  <w:p>
+                                    <w:pPr>
+                                      <w:jc w:val="right"/>
+                                      <w:rPr>
+                                        <w:smallCaps/>
+                                        <w:color w:val="404040" w:themeColor="text1" w:themeTint="BF"/>
+                                        <w:sz w:val="36"/>
+                                        <w:szCs w:val="36"/>
+                                      </w:rPr>
+                                    </w:pPr>
+                                    <w:r>
+                                      <w:rPr>
+                                        <w:color w:val="404040" w:themeColor="text1" w:themeTint="BF"/>
+                                        <w:sz w:val="36"/>
+                                        <w:szCs w:val="36"/>
+                                      </w:rPr>
+                                      <w:t>Assignment 2 – Design Document</w:t>
+                                    </w:r>
+                                  </w:p>
+                                </w:sdtContent>
+                              </w:sdt>
+                            </w:txbxContent>
+                          </wps:txbx>
+                          <wps:bodyPr rot="0" spcFirstLastPara="0" vertOverflow="overflow" horzOverflow="overflow" vert="horz" wrap="square" lIns="1600200" tIns="0" rIns="685800" bIns="0" numCol="1" spcCol="0" rtlCol="0" fromWordArt="0" anchor="b" anchorCtr="0" forceAA="0" compatLnSpc="1">
+                            <a:prstTxWarp prst="textNoShape">
+                              <a:avLst/>
+                            </a:prstTxWarp>
+                            <a:noAutofit/>
+                          </wps:bodyPr>
+                        </wps:wsp>
+                      </a:graphicData>
+                    </a:graphic>
+                    <wp14:sizeRelH relativeFrom="page">
+                      <wp14:pctWidth>94100</wp14:pctWidth>
+                    </wp14:sizeRelH>
+                    <wp14:sizeRelV relativeFrom="page">
+                      <wp14:pctHeight>36300</wp14:pctHeight>
+                    </wp14:sizeRelV>
+                  </wp:anchor>
+                </w:drawing>
+              </mc:Choice>
+              <mc:Fallback>
+                <w:pict>
+                  <v:shape w14:anchorId="0AD33664" id="Text Box 163" o:spid="_x0000_s1027" type="#_x0000_t202" style="position:absolute;margin-left:0;margin-top:0;width:8in;height:286.5pt;z-index:251665408;visibility:visible;mso-wrap-style:square;mso-width-percent:941;mso-height-percent:363;mso-top-percent:300;mso-wrap-distance-left:9pt;mso-wrap-distance-top:0;mso-wrap-distance-right:9pt;mso-wrap-distance-bottom:0;mso-position-horizontal:center;mso-position-horizontal-relative:page;mso-position-vertical-relative:page;mso-width-percent:941;mso-height-percent:363;mso-top-percent:300;mso-width-relative:page;mso-height-relative:page;v-text-anchor:bottom" o:gfxdata="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" filled="f" stroked="f" strokeweight=".5pt">
+                    <v:textbox inset="126pt,0,54pt,0">
+                      <w:txbxContent>
+                        <w:p>
+                          <w:pPr>
+                            <w:jc w:val="right"/>
+                            <w:rPr>
+                              <w:color w:val="156082" w:themeColor="accent1"/>
+                              <w:sz w:val="64"/>
+                              <w:szCs w:val="64"/>
+                            </w:rPr>
+                          </w:pPr>
+                          <w:sdt>
+                            <w:sdtPr>
+                              <w:rPr>
+                                <w:caps/>
+                                <w:color w:val="156082" w:themeColor="accent1"/>
+                                <w:sz w:val="64"/>
+                                <w:szCs w:val="64"/>
+                              </w:rPr>
+                              <w:alias w:val="Title"/>
+                              <w:tag w:val=""/>
+                              <w:id w:val="630141079"/>
+                              <w:dataBinding w:prefixMappings="xmlns:ns0='http://purl.org/dc/elements/1.1/' xmlns:ns1='http://schemas.openxmlformats.org/package/2006/metadata/core-properties' " w:xpath="/ns1:coreProperties[1]/ns0:title[1]" w:storeItemID="{6C3C8BC8-F283-45AE-878A-BAB7291924A1}"/>
+                              <w:text w:multiLine="1"/>
+                            </w:sdtPr>
+                            <w:sdtEndPr>
+                              <w:rPr>
+                                <w:caps w:val="0"/>
+                              </w:rPr>
+                            </w:sdtEndPr>
+                            <w:sdtContent>
+                              <w:r>
+                                <w:rPr>
+                                  <w:caps/>
+                                  <w:color w:val="156082" w:themeColor="accent1"/>
+                                  <w:sz w:val="64"/>
+                                  <w:szCs w:val="64"/>
+                                </w:rPr>
+                                <w:t>COMP 1039 – Design patterns with c++</w:t>
+                              </w:r>
+                            </w:sdtContent>
+                          </w:sdt>
+                        </w:p>
+                        <w:sdt>
+                          <w:sdtPr>
+                            <w:rPr>
+                              <w:color w:val="404040" w:themeColor="text1" w:themeTint="BF"/>
+                              <w:sz w:val="36"/>
+                              <w:szCs w:val="36"/>
+                            </w:rPr>
+                            <w:alias w:val="Subtitle"/>
+                            <w:tag w:val=""/>
+                            <w:id w:val="1759551507"/>
+                            <w:dataBinding w:prefixMappings="xmlns:ns0='http://purl.org/dc/elements/1.1/' xmlns:ns1='http://schemas.openxmlformats.org/package/2006/metadata/core-properties' " w:xpath="/ns1:coreProperties[1]/ns0:subject[1]" w:storeItemID="{6C3C8BC8-F283-45AE-878A-BAB7291924A1}"/>
+                            <w:text/>
+                          </w:sdtPr>
+                          <w:sdtContent>
+                            <w:p>
+                              <w:pPr>
+                                <w:jc w:val="right"/>
+                                <w:rPr>
+                                  <w:smallCaps/>
+                                  <w:color w:val="404040" w:themeColor="text1" w:themeTint="BF"/>
+                                  <w:sz w:val="36"/>
+                                  <w:szCs w:val="36"/>
+                                </w:rPr>
+                              </w:pPr>
+                              <w:r>
+                                <w:rPr>
+                                  <w:color w:val="404040" w:themeColor="text1" w:themeTint="BF"/>
+                                  <w:sz w:val="36"/>
+                                  <w:szCs w:val="36"/>
+                                </w:rPr>
+                                <w:t>Assignment 2 – Design Document</w:t>
+                              </w:r>
+                            </w:p>
+                          </w:sdtContent>
+                        </w:sdt>
+                      </w:txbxContent>
+                    </v:textbox>
+                    <w10:wrap type="square" anchorx="page" anchory="page"/>
+                  </v:shape>
+                </w:pict>
+              </mc:Fallback>
+            </mc:AlternateContent>
+          </w:r>
+        </w:p>
+        <w:p>
+          <w:r>
+            <w:br w:type="page"/>
+          </w:r>
+        </w:p>
+      </w:sdtContent>
+    </w:sdt>
     <w:p>
       <w:pPr>
         <w:pStyle w:val="Heading1"/>
       </w:pPr>
       <w:r>
-        <w:t>Complete design class diagram</w:t>
-      </w:r>
-    </w:p>
-    <w:p/>
+        <w:lastRenderedPageBreak/>
+        <w:t xml:space="preserve">Complete </w:t>
+      </w:r>
+      <w:r>
+        <w:t>C</w:t>
+      </w:r>
+      <w:r>
+        <w:t xml:space="preserve">lass </w:t>
+      </w:r>
+      <w:r>
+        <w:t>D</w:t>
+      </w:r>
+      <w:r>
+        <w:t>iagram</w:t>
+      </w:r>
+      <w:r>
+        <w:t xml:space="preserve"> </w:t>
+      </w:r>
+      <w:r>
+        <w:t>&amp; O</w:t>
+      </w:r>
+      <w:r>
+        <w:t>verview</w:t>
+      </w:r>
+    </w:p>
+    <w:p>
+      <w:pPr>
+        <w:keepNext/>
+        <w:jc w:val="center"/>
+      </w:pPr>
+      <w:r>
+        <w:rPr>
+          <w:noProof/>
+        </w:rPr>
+        <w:drawing>
+          <wp:inline distT="0" distB="0" distL="0" distR="0" wp14:anchorId="50C1EE3E" wp14:editId="2D499E9F">
+            <wp:extent cx="4689043" cy="7854106"/>
+            <wp:effectExtent l="0" t="0" r="0" b="0"/>
+            <wp:docPr id="746923875" name="Picture 5"/>
+            <wp:cNvGraphicFramePr>
+              <a:graphicFrameLocks xmlns:a="http://schemas.openxmlformats.org/drawingml/2006/main" noChangeAspect="1"/>
+            </wp:cNvGraphicFramePr>
+            <a:graphic xmlns:a="http://schemas.openxmlformats.org/drawingml/2006/main">
+              <a:graphicData uri="http://schemas.openxmlformats.org/drawingml/2006/picture">
+                <pic:pic xmlns:pic="http://schemas.openxmlformats.org/drawingml/2006/picture">
+                  <pic:nvPicPr>
+                    <pic:cNvPr id="0" name="Picture 4"/>
+                    <pic:cNvPicPr>
+                      <a:picLocks noChangeAspect="1" noChangeArrowheads="1"/>
+                    </pic:cNvPicPr>
+                  </pic:nvPicPr>
+                  <pic:blipFill>
+                    <a:blip r:embed="rId9">
+                      <a:extLst>
+                        <a:ext uri="{28A0092B-C50C-407E-A947-70E740481C1C}">
+                          <a14:useLocalDpi xmlns:a14="http://schemas.microsoft.com/office/drawing/2010/main" val="0"/>
+                        </a:ext>
+                      </a:extLst>
+                    </a:blip>
+                    <a:srcRect/>
+                    <a:stretch>
+                      <a:fillRect/>
+                    </a:stretch>
+                  </pic:blipFill>
+                  <pic:spPr bwMode="auto">
+                    <a:xfrm>
+                      <a:off x="0" y="0"/>
+                      <a:ext cx="4709302" cy="7888040"/>
+                    </a:xfrm>
+                    <a:prstGeom prst="rect">
+                      <a:avLst/>
+                    </a:prstGeom>
+                    <a:noFill/>
+                    <a:ln>
+                      <a:noFill/>
+                    </a:ln>
+                  </pic:spPr>
+                </pic:pic>
+              </a:graphicData>
+            </a:graphic>
+          </wp:inline>
+        </w:drawing>
+      </w:r>
+    </w:p>
+    <w:p>
+      <w:pPr>
+        <w:pStyle w:val="Caption"/>
+        <w:jc w:val="center"/>
+      </w:pPr>
+      <w:r>
+        <w:t xml:space="preserve">Figure </w:t>
+      </w:r>
+      <w:r>
+        <w:fldChar w:fldCharType="begin"/>
+      </w:r>
+      <w:r>
+        <w:instrText xml:space="preserve"> SEQ Figure \* ARABIC </w:instrText>
+      </w:r>
+      <w:r>
+        <w:fldChar w:fldCharType="separate"/>
+      </w:r>
+      <w:r>
+        <w:rPr>
+          <w:noProof/>
+        </w:rPr>
+        <w:t>1</w:t>
+      </w:r>
+      <w:r>
+        <w:fldChar w:fldCharType="end"/>
+      </w:r>
+      <w:r>
+        <w:t xml:space="preserve"> - Complete system class design after completing all functional requirements.</w:t>
+      </w:r>
+    </w:p>
+    <w:p>
+      <w:pPr>
+        <w:rPr>
+          <w:b/>
+          <w:bCs/>
+        </w:rPr>
+      </w:pPr>
+    </w:p>
+    <w:p>
+      <w:pPr>
+        <w:rPr>
+          <w:b/>
+          <w:bCs/>
+        </w:rPr>
+      </w:pPr>
+      <w:r>
+        <w:rPr>
+          <w:b/>
+          <w:bCs/>
+        </w:rPr>
+        <w:lastRenderedPageBreak/>
+        <w:t>New classes/components created for this assignment:</w:t>
+      </w:r>
+    </w:p>
+    <w:p>
+      <w:pPr>
+        <w:pStyle w:val="ListParagraph"/>
+        <w:numPr>
+          <w:ilvl w:val="0"/>
+          <w:numId w:val="9"/>
+        </w:numPr>
+      </w:pPr>
+      <w:r>
+        <w:rPr>
+          <w:b/>
+          <w:bCs/>
+          <w:i/>
+          <w:iCs/>
+        </w:rPr>
+        <w:t>PatientFileLoader</w:t>
+      </w:r>
+      <w:r>
+        <w:rPr>
+          <w:b/>
+          <w:bCs/>
+          <w:i/>
+          <w:iCs/>
+        </w:rPr>
+        <w:t>:</w:t>
+      </w:r>
+      <w:r>
+        <w:t xml:space="preserve"> Loads a list of patients from a given filepath.</w:t>
+      </w:r>
+    </w:p>
+    <w:p>
+      <w:pPr>
+        <w:pStyle w:val="ListParagraph"/>
+        <w:numPr>
+          <w:ilvl w:val="0"/>
+          <w:numId w:val="9"/>
+        </w:numPr>
+      </w:pPr>
+      <w:r>
+        <w:rPr>
+          <w:b/>
+          <w:bCs/>
+          <w:i/>
+          <w:iCs/>
+        </w:rPr>
+        <w:t>PatientFileLoaderAdapter:</w:t>
+      </w:r>
+      <w:r>
+        <w:rPr>
+          <w:i/>
+          <w:iCs/>
+        </w:rPr>
+        <w:t xml:space="preserve"> </w:t>
+      </w:r>
+      <w:r>
+        <w:t xml:space="preserve">An adapter to connect the </w:t>
+      </w:r>
+      <w:r>
+        <w:rPr>
+          <w:i/>
+          <w:iCs/>
+        </w:rPr>
+        <w:t>PatientFileLoader</w:t>
+      </w:r>
+      <w:r>
+        <w:t xml:space="preserve"> to the abstract database loader. Converts returned patients from the file loader into a format similar to the database loader.</w:t>
+      </w:r>
+    </w:p>
+    <w:p>
+      <w:pPr>
+        <w:pStyle w:val="ListParagraph"/>
+        <w:numPr>
+          <w:ilvl w:val="0"/>
+          <w:numId w:val="9"/>
+        </w:numPr>
+      </w:pPr>
+      <w:r>
+        <w:rPr>
+          <w:b/>
+          <w:bCs/>
+          <w:i/>
+          <w:iCs/>
+        </w:rPr>
+        <w:t>CompositePatientLoader:</w:t>
+      </w:r>
+      <w:r>
+        <w:t xml:space="preserve">  </w:t>
+      </w:r>
+      <w:r>
+        <w:t xml:space="preserve">Handles multiple abstract data loaders, to allow the </w:t>
+      </w:r>
+      <w:r>
+        <w:rPr>
+          <w:i/>
+          <w:iCs/>
+        </w:rPr>
+        <w:t>PatientManagementSystem</w:t>
+      </w:r>
+      <w:r>
+        <w:t xml:space="preserve"> to </w:t>
+      </w:r>
+      <w:r>
+        <w:t>load patients from multiple loaders.</w:t>
+      </w:r>
+    </w:p>
+    <w:p>
+      <w:pPr>
+        <w:pStyle w:val="ListParagraph"/>
+        <w:numPr>
+          <w:ilvl w:val="0"/>
+          <w:numId w:val="9"/>
+        </w:numPr>
+      </w:pPr>
+      <w:r>
+        <w:rPr>
+          <w:b/>
+          <w:bCs/>
+          <w:i/>
+          <w:iCs/>
+        </w:rPr>
+        <w:t>AlertLevelStrategy:</w:t>
+      </w:r>
+      <w:r>
+        <w:t xml:space="preserve"> An abstract interface that concrete strategies for setting alert levels are derived from.</w:t>
+      </w:r>
+    </w:p>
+    <w:p>
+      <w:pPr>
+        <w:pStyle w:val="ListParagraph"/>
+        <w:numPr>
+          <w:ilvl w:val="0"/>
+          <w:numId w:val="9"/>
+        </w:numPr>
+      </w:pPr>
+      <w:r>
+        <w:rPr>
+          <w:b/>
+          <w:bCs/>
+          <w:i/>
+          <w:iCs/>
+        </w:rPr>
+        <w:t xml:space="preserve">CordycepsAlertLevelStrategy: </w:t>
+      </w:r>
+      <w:r>
+        <w:t>Calculates the alert level for a patient with the Cordyceps Brain Infection, when new vitals are added.</w:t>
+      </w:r>
+    </w:p>
+    <w:p>
+      <w:pPr>
+        <w:pStyle w:val="ListParagraph"/>
+        <w:numPr>
+          <w:ilvl w:val="0"/>
+          <w:numId w:val="9"/>
+        </w:numPr>
+      </w:pPr>
+      <w:r>
+        <w:rPr>
+          <w:b/>
+          <w:bCs/>
+          <w:i/>
+          <w:iCs/>
+        </w:rPr>
+        <w:t>Kepral</w:t>
+      </w:r>
+      <w:r>
+        <w:rPr>
+          <w:b/>
+          <w:bCs/>
+          <w:i/>
+          <w:iCs/>
+        </w:rPr>
+        <w:t xml:space="preserve">sAlertLevelStrategy: </w:t>
+      </w:r>
+      <w:r>
+        <w:t xml:space="preserve">Calculates the alert level for a patient with </w:t>
+      </w:r>
+      <w:r>
+        <w:t>Kepral’s Syndrome</w:t>
+      </w:r>
+      <w:r>
+        <w:t>, when new vitals are added.</w:t>
+      </w:r>
+    </w:p>
+    <w:p>
+      <w:pPr>
+        <w:pStyle w:val="ListParagraph"/>
+        <w:numPr>
+          <w:ilvl w:val="0"/>
+          <w:numId w:val="9"/>
+        </w:numPr>
+      </w:pPr>
+      <w:r>
+        <w:rPr>
+          <w:b/>
+          <w:bCs/>
+          <w:i/>
+          <w:iCs/>
+        </w:rPr>
+        <w:t>Andromeda</w:t>
+      </w:r>
+      <w:r>
+        <w:rPr>
+          <w:b/>
+          <w:bCs/>
+          <w:i/>
+          <w:iCs/>
+        </w:rPr>
+        <w:t xml:space="preserve">AlertLevelStrategy: </w:t>
+      </w:r>
+      <w:r>
+        <w:t xml:space="preserve">Calculates the alert level for a patient with the </w:t>
+      </w:r>
+      <w:r>
+        <w:t>Andromeda Strain</w:t>
+      </w:r>
+      <w:r>
+        <w:t>, when new vitals are added.</w:t>
+      </w:r>
+    </w:p>
+    <w:p>
+      <w:pPr>
+        <w:pStyle w:val="ListParagraph"/>
+        <w:numPr>
+          <w:ilvl w:val="0"/>
+          <w:numId w:val="9"/>
+        </w:numPr>
+      </w:pPr>
+      <w:r>
+        <w:rPr>
+          <w:b/>
+          <w:bCs/>
+          <w:i/>
+          <w:iCs/>
+        </w:rPr>
+        <w:t xml:space="preserve">&lt;&lt;enum&gt;&gt; VitalsRecordType: </w:t>
+      </w:r>
+      <w:r>
+        <w:t xml:space="preserve">Enumeration that allows vitals records to be distinguished by the </w:t>
+      </w:r>
+      <w:r>
+        <w:rPr>
+          <w:i/>
+          <w:iCs/>
+        </w:rPr>
+        <w:t>PatientManagementSystem</w:t>
+      </w:r>
+      <w:r>
+        <w:t>, depending on if they were added from a database/file or added manually by the user.</w:t>
+      </w:r>
+    </w:p>
+    <w:p>
+      <w:pPr>
+        <w:pStyle w:val="ListParagraph"/>
+        <w:numPr>
+          <w:ilvl w:val="0"/>
+          <w:numId w:val="9"/>
+        </w:numPr>
+        <w:rPr>
+          <w:b/>
+          <w:bCs/>
+          <w:i/>
+          <w:iCs/>
+        </w:rPr>
+      </w:pPr>
+      <w:r>
+        <w:rPr>
+          <w:b/>
+          <w:bCs/>
+          <w:i/>
+          <w:iCs/>
+        </w:rPr>
+        <w:t>PatientAlertObserver:</w:t>
+      </w:r>
+      <w:r>
+        <w:rPr>
+          <w:b/>
+          <w:bCs/>
+          <w:i/>
+          <w:iCs/>
+        </w:rPr>
+        <w:t xml:space="preserve"> </w:t>
+      </w:r>
+      <w:r>
+        <w:t>Abstract observer that concrete hospital and GP observers are derived from.</w:t>
+      </w:r>
+    </w:p>
+    <w:p>
+      <w:pPr>
+        <w:pStyle w:val="ListParagraph"/>
+        <w:numPr>
+          <w:ilvl w:val="0"/>
+          <w:numId w:val="9"/>
+        </w:numPr>
+        <w:rPr>
+          <w:b/>
+          <w:bCs/>
+          <w:i/>
+          <w:iCs/>
+        </w:rPr>
+      </w:pPr>
+      <w:r>
+        <w:rPr>
+          <w:b/>
+          <w:bCs/>
+          <w:i/>
+          <w:iCs/>
+        </w:rPr>
+        <w:t>HospitalAlertObserver:</w:t>
+      </w:r>
+      <w:r>
+        <w:rPr>
+          <w:i/>
+          <w:iCs/>
+        </w:rPr>
+        <w:t xml:space="preserve"> </w:t>
+      </w:r>
+      <w:r>
+        <w:t>Observer created for each patient, to monitor if that patient’s alert level changes to red and alert the hospital if it does.</w:t>
+      </w:r>
+    </w:p>
+    <w:p>
+      <w:pPr>
+        <w:pStyle w:val="ListParagraph"/>
+        <w:numPr>
+          <w:ilvl w:val="0"/>
+          <w:numId w:val="9"/>
+        </w:numPr>
+        <w:rPr>
+          <w:b/>
+          <w:bCs/>
+          <w:i/>
+          <w:iCs/>
+        </w:rPr>
+      </w:pPr>
+      <w:r>
+        <w:rPr>
+          <w:b/>
+          <w:bCs/>
+          <w:i/>
+          <w:iCs/>
+        </w:rPr>
+        <w:t>GPNotificationAlertObserver:</w:t>
+      </w:r>
+      <w:r>
+        <w:t xml:space="preserve"> </w:t>
+      </w:r>
+      <w:r>
+        <w:t xml:space="preserve">Observer created for each patient, to monitor if that patient’s alert level changes to red and alert </w:t>
+      </w:r>
+      <w:r>
+        <w:t>their GP</w:t>
+      </w:r>
+      <w:r>
+        <w:t xml:space="preserve"> if it does.</w:t>
+      </w:r>
+    </w:p>
+    <w:p>
+      <w:pPr>
+        <w:pStyle w:val="ListParagraph"/>
+        <w:rPr>
+          <w:b/>
+          <w:bCs/>
+          <w:i/>
+          <w:iCs/>
+        </w:rPr>
+      </w:pPr>
+    </w:p>
+    <w:p>
+      <w:r>
+        <w:t xml:space="preserve">Other pre-existing classes, including </w:t>
+      </w:r>
+      <w:r>
+        <w:rPr>
+          <w:i/>
+          <w:iCs/>
+        </w:rPr>
+        <w:t>Patient</w:t>
+      </w:r>
+      <w:r>
+        <w:t xml:space="preserve"> and </w:t>
+      </w:r>
+      <w:r>
+        <w:rPr>
+          <w:i/>
+          <w:iCs/>
+        </w:rPr>
+        <w:t>PatientManagementSystem</w:t>
+      </w:r>
+      <w:r>
+        <w:t xml:space="preserve"> were also modified during the assignment. Details about the</w:t>
+      </w:r>
+      <w:r>
+        <w:t>ir</w:t>
+      </w:r>
+      <w:r>
+        <w:t xml:space="preserve"> changes are mentioned </w:t>
+      </w:r>
+      <w:r>
+        <w:t>in each functional requirement section.</w:t>
+      </w:r>
+    </w:p>
     <w:p>
       <w:pPr>
         <w:pStyle w:val="Heading1"/>
       </w:pPr>
-    </w:p>
-    <w:p>
-      <w:pPr>
-        <w:pStyle w:val="Heading1"/>
-      </w:pPr>
-      <w:r>
+      <w:r>
+        <w:lastRenderedPageBreak/>
         <w:t xml:space="preserve">FR1: Load </w:t>
       </w:r>
       <w:r>
@@ -62,7 +1369,7 @@
                     </pic:cNvPicPr>
                   </pic:nvPicPr>
                   <pic:blipFill>
-                    <a:blip r:embed="rId5">
+                    <a:blip r:embed="rId10">
                       <a:extLst>
                         <a:ext uri="{28A0092B-C50C-407E-A947-70E740481C1C}">
                           <a14:useLocalDpi xmlns:a14="http://schemas.microsoft.com/office/drawing/2010/main" val="0"/>
@@ -102,14 +1409,27 @@
       <w:r>
         <w:t xml:space="preserve">Figure </w:t>
       </w:r>
-      <w:fldSimple w:instr=" SEQ Figure \* ARABIC ">
-        <w:r>
-          <w:rPr>
-            <w:noProof/>
-          </w:rPr>
-          <w:t>1</w:t>
-        </w:r>
-      </w:fldSimple>
+      <w:r>
+        <w:fldChar w:fldCharType="begin"/>
+      </w:r>
+      <w:r>
+        <w:instrText xml:space="preserve"> SEQ Figure \* ARABIC </w:instrText>
+      </w:r>
+      <w:r>
+        <w:fldChar w:fldCharType="separate"/>
+      </w:r>
+      <w:r>
+        <w:rPr>
+          <w:noProof/>
+        </w:rPr>
+        <w:t>2</w:t>
+      </w:r>
+      <w:r>
+        <w:rPr>
+          <w:noProof/>
+        </w:rPr>
+        <w:fldChar w:fldCharType="end"/>
+      </w:r>
       <w:r>
         <w:t xml:space="preserve"> - Adapter design pattern for file loader implementation.</w:t>
       </w:r>
@@ -133,7 +1453,6 @@
     </w:p>
     <w:p>
       <w:r>
-        <w:lastRenderedPageBreak/>
         <w:t>With this implementation, the patient management system only needs a single line of code changed to use the new file loader.</w:t>
       </w:r>
     </w:p>
@@ -206,6 +1525,7 @@
         </w:numPr>
       </w:pPr>
       <w:r>
+        <w:lastRenderedPageBreak/>
         <w:t xml:space="preserve">The </w:t>
       </w:r>
       <w:r>
@@ -710,7 +2030,7 @@
                     </pic:cNvPicPr>
                   </pic:nvPicPr>
                   <pic:blipFill>
-                    <a:blip r:embed="rId6">
+                    <a:blip r:embed="rId11">
                       <a:extLst>
                         <a:ext uri="{28A0092B-C50C-407E-A947-70E740481C1C}">
                           <a14:useLocalDpi xmlns:a14="http://schemas.microsoft.com/office/drawing/2010/main" val="0"/>
@@ -750,14 +2070,27 @@
       <w:r>
         <w:t xml:space="preserve">Figure </w:t>
       </w:r>
-      <w:fldSimple w:instr=" SEQ Figure \* ARABIC ">
-        <w:r>
-          <w:rPr>
-            <w:noProof/>
-          </w:rPr>
-          <w:t>2</w:t>
-        </w:r>
-      </w:fldSimple>
+      <w:r>
+        <w:fldChar w:fldCharType="begin"/>
+      </w:r>
+      <w:r>
+        <w:instrText xml:space="preserve"> SEQ Figure \* ARABIC </w:instrText>
+      </w:r>
+      <w:r>
+        <w:fldChar w:fldCharType="separate"/>
+      </w:r>
+      <w:r>
+        <w:rPr>
+          <w:noProof/>
+        </w:rPr>
+        <w:t>3</w:t>
+      </w:r>
+      <w:r>
+        <w:rPr>
+          <w:noProof/>
+        </w:rPr>
+        <w:fldChar w:fldCharType="end"/>
+      </w:r>
       <w:r>
         <w:t xml:space="preserve"> - Composite design pattern for database &amp; file loading.</w:t>
       </w:r>
@@ -773,6 +2106,9 @@
       <w:r>
         <w:t>Composite</w:t>
       </w:r>
+      <w:r>
+        <w:t xml:space="preserve"> design pattern</w:t>
+      </w:r>
     </w:p>
     <w:p>
       <w:r>
@@ -861,11 +2197,20 @@
           <w:bCs/>
         </w:rPr>
       </w:pPr>
-      <w:r>
-        <w:rPr>
-          <w:b/>
-          <w:bCs/>
-        </w:rPr>
+    </w:p>
+    <w:p>
+      <w:pPr>
+        <w:rPr>
+          <w:b/>
+          <w:bCs/>
+        </w:rPr>
+      </w:pPr>
+      <w:r>
+        <w:rPr>
+          <w:b/>
+          <w:bCs/>
+        </w:rPr>
+        <w:lastRenderedPageBreak/>
         <w:t>How it works:</w:t>
       </w:r>
     </w:p>
@@ -882,7 +2227,6 @@
           <w:i/>
           <w:iCs/>
         </w:rPr>
-        <w:lastRenderedPageBreak/>
         <w:t>PatientManagementSystem</w:t>
       </w:r>
       <w:r>
@@ -1216,14 +2560,27 @@
                             <w:r>
                               <w:t xml:space="preserve">Figure </w:t>
                             </w:r>
-                            <w:fldSimple w:instr=" SEQ Figure \* ARABIC ">
-                              <w:r>
-                                <w:rPr>
-                                  <w:noProof/>
-                                </w:rPr>
-                                <w:t>3</w:t>
-                              </w:r>
-                            </w:fldSimple>
+                            <w:r>
+                              <w:fldChar w:fldCharType="begin"/>
+                            </w:r>
+                            <w:r>
+                              <w:instrText xml:space="preserve"> SEQ Figure \* ARABIC </w:instrText>
+                            </w:r>
+                            <w:r>
+                              <w:fldChar w:fldCharType="separate"/>
+                            </w:r>
+                            <w:r>
+                              <w:rPr>
+                                <w:noProof/>
+                              </w:rPr>
+                              <w:t>4</w:t>
+                            </w:r>
+                            <w:r>
+                              <w:rPr>
+                                <w:noProof/>
+                              </w:rPr>
+                              <w:fldChar w:fldCharType="end"/>
+                            </w:r>
                             <w:r>
                               <w:t xml:space="preserve"> - Strategy design pattern for calculating patient alert levels.</w:t>
                             </w:r>
@@ -1244,11 +2601,7 @@
           </mc:Choice>
           <mc:Fallback>
             <w:pict>
-              <v:shapetype w14:anchorId="1A6091AB" id="_x0000_t202" coordsize="21600,21600" o:spt="202" path="m,l,21600r21600,l21600,xe">
-                <v:stroke joinstyle="miter"/>
-                <v:path gradientshapeok="t" o:connecttype="rect"/>
-              </v:shapetype>
-              <v:shape id="Text Box 1" o:spid="_x0000_s1026" type="#_x0000_t202" style="position:absolute;margin-left:-26.7pt;margin-top:398pt;width:504.65pt;height:.05pt;z-index:-251656192;visibility:visible;mso-wrap-style:square;mso-wrap-distance-left:9pt;mso-wrap-distance-top:0;mso-wrap-distance-right:9pt;mso-wrap-distance-bottom:0;mso-position-horizontal:absolute;mso-position-horizontal-relative:text;mso-position-vertical:absolute;mso-position-vertical-relative:text;v-text-anchor:top" o:gfxdata="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" stroked="f">
+              <v:shape w14:anchorId="1A6091AB" id="Text Box 1" o:spid="_x0000_s1028" type="#_x0000_t202" style="position:absolute;margin-left:-26.7pt;margin-top:398pt;width:504.65pt;height:.05pt;z-index:-251656192;visibility:visible;mso-wrap-style:square;mso-wrap-distance-left:9pt;mso-wrap-distance-top:0;mso-wrap-distance-right:9pt;mso-wrap-distance-bottom:0;mso-position-horizontal:absolute;mso-position-horizontal-relative:text;mso-position-vertical:absolute;mso-position-vertical-relative:text;v-text-anchor:top" o:gfxdata="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" stroked="f">
                 <v:textbox style="mso-fit-shape-to-text:t" inset="0,0,0,0">
                   <w:txbxContent>
                     <w:p>
@@ -1262,14 +2615,27 @@
                       <w:r>
                         <w:t xml:space="preserve">Figure </w:t>
                       </w:r>
-                      <w:fldSimple w:instr=" SEQ Figure \* ARABIC ">
-                        <w:r>
-                          <w:rPr>
-                            <w:noProof/>
-                          </w:rPr>
-                          <w:t>3</w:t>
-                        </w:r>
-                      </w:fldSimple>
+                      <w:r>
+                        <w:fldChar w:fldCharType="begin"/>
+                      </w:r>
+                      <w:r>
+                        <w:instrText xml:space="preserve"> SEQ Figure \* ARABIC </w:instrText>
+                      </w:r>
+                      <w:r>
+                        <w:fldChar w:fldCharType="separate"/>
+                      </w:r>
+                      <w:r>
+                        <w:rPr>
+                          <w:noProof/>
+                        </w:rPr>
+                        <w:t>4</w:t>
+                      </w:r>
+                      <w:r>
+                        <w:rPr>
+                          <w:noProof/>
+                        </w:rPr>
+                        <w:fldChar w:fldCharType="end"/>
+                      </w:r>
                       <w:r>
                         <w:t xml:space="preserve"> - Strategy design pattern for calculating patient alert levels.</w:t>
                       </w:r>
@@ -1320,7 +2686,7 @@
                     </pic:cNvPicPr>
                   </pic:nvPicPr>
                   <pic:blipFill>
-                    <a:blip r:embed="rId7">
+                    <a:blip r:embed="rId12">
                       <a:extLst>
                         <a:ext uri="{28A0092B-C50C-407E-A947-70E740481C1C}">
                           <a14:useLocalDpi xmlns:a14="http://schemas.microsoft.com/office/drawing/2010/main" val="0"/>
@@ -1366,6 +2732,9 @@
       <w:r>
         <w:t>Strategy</w:t>
       </w:r>
+      <w:r>
+        <w:t xml:space="preserve"> design pattern</w:t>
+      </w:r>
     </w:p>
     <w:p>
       <w:r>
@@ -1921,18 +3290,833 @@
         <w:pStyle w:val="Heading1"/>
       </w:pPr>
       <w:r>
+        <w:lastRenderedPageBreak/>
         <w:t>FR4: Alert the hospitals and GPs</w:t>
       </w:r>
     </w:p>
-    <w:p/>
+    <w:p>
+      <w:pPr>
+        <w:pStyle w:val="Heading1"/>
+        <w:jc w:val="center"/>
+      </w:pPr>
+      <w:r>
+        <w:rPr>
+          <w:noProof/>
+        </w:rPr>
+        <w:drawing>
+          <wp:inline distT="0" distB="0" distL="0" distR="0" wp14:anchorId="378721EA" wp14:editId="554AEB66">
+            <wp:extent cx="4395143" cy="5983631"/>
+            <wp:effectExtent l="0" t="0" r="5715" b="0"/>
+            <wp:docPr id="2019486659" name="Picture 4"/>
+            <wp:cNvGraphicFramePr>
+              <a:graphicFrameLocks xmlns:a="http://schemas.openxmlformats.org/drawingml/2006/main" noChangeAspect="1"/>
+            </wp:cNvGraphicFramePr>
+            <a:graphic xmlns:a="http://schemas.openxmlformats.org/drawingml/2006/main">
+              <a:graphicData uri="http://schemas.openxmlformats.org/drawingml/2006/picture">
+                <pic:pic xmlns:pic="http://schemas.openxmlformats.org/drawingml/2006/picture">
+                  <pic:nvPicPr>
+                    <pic:cNvPr id="0" name="Picture 3"/>
+                    <pic:cNvPicPr>
+                      <a:picLocks noChangeAspect="1" noChangeArrowheads="1"/>
+                    </pic:cNvPicPr>
+                  </pic:nvPicPr>
+                  <pic:blipFill>
+                    <a:blip r:embed="rId13">
+                      <a:extLst>
+                        <a:ext uri="{28A0092B-C50C-407E-A947-70E740481C1C}">
+                          <a14:useLocalDpi xmlns:a14="http://schemas.microsoft.com/office/drawing/2010/main" val="0"/>
+                        </a:ext>
+                      </a:extLst>
+                    </a:blip>
+                    <a:srcRect/>
+                    <a:stretch>
+                      <a:fillRect/>
+                    </a:stretch>
+                  </pic:blipFill>
+                  <pic:spPr bwMode="auto">
+                    <a:xfrm>
+                      <a:off x="0" y="0"/>
+                      <a:ext cx="4403489" cy="5994993"/>
+                    </a:xfrm>
+                    <a:prstGeom prst="rect">
+                      <a:avLst/>
+                    </a:prstGeom>
+                    <a:noFill/>
+                    <a:ln>
+                      <a:noFill/>
+                    </a:ln>
+                  </pic:spPr>
+                </pic:pic>
+              </a:graphicData>
+            </a:graphic>
+          </wp:inline>
+        </w:drawing>
+      </w:r>
+    </w:p>
+    <w:p>
+      <w:r>
+        <w:rPr>
+          <w:noProof/>
+        </w:rPr>
+        <mc:AlternateContent>
+          <mc:Choice Requires="wps">
+            <w:drawing>
+              <wp:anchor distT="0" distB="0" distL="114300" distR="114300" simplePos="0" relativeHeight="251663360" behindDoc="1" locked="0" layoutInCell="1" allowOverlap="1" wp14:anchorId="33986E99" wp14:editId="35FA8693">
+                <wp:simplePos x="0" y="0"/>
+                <wp:positionH relativeFrom="page">
+                  <wp:posOffset>1177747</wp:posOffset>
+                </wp:positionH>
+                <wp:positionV relativeFrom="paragraph">
+                  <wp:posOffset>186004</wp:posOffset>
+                </wp:positionV>
+                <wp:extent cx="5054600" cy="635"/>
+                <wp:effectExtent l="0" t="0" r="0" b="0"/>
+                <wp:wrapTight wrapText="bothSides">
+                  <wp:wrapPolygon edited="0">
+                    <wp:start x="0" y="0"/>
+                    <wp:lineTo x="0" y="20057"/>
+                    <wp:lineTo x="21491" y="20057"/>
+                    <wp:lineTo x="21491" y="0"/>
+                    <wp:lineTo x="0" y="0"/>
+                  </wp:wrapPolygon>
+                </wp:wrapTight>
+                <wp:docPr id="364516497" name="Text Box 1"/>
+                <wp:cNvGraphicFramePr/>
+                <a:graphic xmlns:a="http://schemas.openxmlformats.org/drawingml/2006/main">
+                  <a:graphicData uri="http://schemas.microsoft.com/office/word/2010/wordprocessingShape">
+                    <wps:wsp>
+                      <wps:cNvSpPr txBox="1"/>
+                      <wps:spPr>
+                        <a:xfrm>
+                          <a:off x="0" y="0"/>
+                          <a:ext cx="5054600" cy="635"/>
+                        </a:xfrm>
+                        <a:prstGeom prst="rect">
+                          <a:avLst/>
+                        </a:prstGeom>
+                        <a:solidFill>
+                          <a:prstClr val="white"/>
+                        </a:solidFill>
+                        <a:ln>
+                          <a:noFill/>
+                        </a:ln>
+                      </wps:spPr>
+                      <wps:txbx>
+                        <w:txbxContent>
+                          <w:p>
+                            <w:pPr>
+                              <w:pStyle w:val="Caption"/>
+                              <w:jc w:val="center"/>
+                            </w:pPr>
+                            <w:r>
+                              <w:t xml:space="preserve">Figure </w:t>
+                            </w:r>
+                            <w:r>
+                              <w:fldChar w:fldCharType="begin"/>
+                            </w:r>
+                            <w:r>
+                              <w:instrText xml:space="preserve"> SEQ Figure \* ARABIC </w:instrText>
+                            </w:r>
+                            <w:r>
+                              <w:fldChar w:fldCharType="separate"/>
+                            </w:r>
+                            <w:r>
+                              <w:rPr>
+                                <w:noProof/>
+                              </w:rPr>
+                              <w:t>5</w:t>
+                            </w:r>
+                            <w:r>
+                              <w:fldChar w:fldCharType="end"/>
+                            </w:r>
+                            <w:r>
+                              <w:t xml:space="preserve"> - Observer pattern for hospital and GP alerts.</w:t>
+                            </w:r>
+                          </w:p>
+                        </w:txbxContent>
+                      </wps:txbx>
+                      <wps:bodyPr rot="0" spcFirstLastPara="0" vertOverflow="overflow" horzOverflow="overflow" vert="horz" wrap="square" lIns="0" tIns="0" rIns="0" bIns="0" numCol="1" spcCol="0" rtlCol="0" fromWordArt="0" anchor="t" anchorCtr="0" forceAA="0" compatLnSpc="1">
+                        <a:prstTxWarp prst="textNoShape">
+                          <a:avLst/>
+                        </a:prstTxWarp>
+                        <a:spAutoFit/>
+                      </wps:bodyPr>
+                    </wps:wsp>
+                  </a:graphicData>
+                </a:graphic>
+              </wp:anchor>
+            </w:drawing>
+          </mc:Choice>
+          <mc:Fallback>
+            <w:pict>
+              <v:shape w14:anchorId="33986E99" id="_x0000_s1029" type="#_x0000_t202" style="position:absolute;margin-left:92.75pt;margin-top:14.65pt;width:398pt;height:.05pt;z-index:-251653120;visibility:visible;mso-wrap-style:square;mso-wrap-distance-left:9pt;mso-wrap-distance-top:0;mso-wrap-distance-right:9pt;mso-wrap-distance-bottom:0;mso-position-horizontal:absolute;mso-position-horizontal-relative:page;mso-position-vertical:absolute;mso-position-vertical-relative:text;v-text-anchor:top" o:gfxdata="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" stroked="f">
+                <v:textbox style="mso-fit-shape-to-text:t" inset="0,0,0,0">
+                  <w:txbxContent>
+                    <w:p>
+                      <w:pPr>
+                        <w:pStyle w:val="Caption"/>
+                        <w:jc w:val="center"/>
+                      </w:pPr>
+                      <w:r>
+                        <w:t xml:space="preserve">Figure </w:t>
+                      </w:r>
+                      <w:r>
+                        <w:fldChar w:fldCharType="begin"/>
+                      </w:r>
+                      <w:r>
+                        <w:instrText xml:space="preserve"> SEQ Figure \* ARABIC </w:instrText>
+                      </w:r>
+                      <w:r>
+                        <w:fldChar w:fldCharType="separate"/>
+                      </w:r>
+                      <w:r>
+                        <w:rPr>
+                          <w:noProof/>
+                        </w:rPr>
+                        <w:t>5</w:t>
+                      </w:r>
+                      <w:r>
+                        <w:fldChar w:fldCharType="end"/>
+                      </w:r>
+                      <w:r>
+                        <w:t xml:space="preserve"> - Observer pattern for hospital and GP alerts.</w:t>
+                      </w:r>
+                    </w:p>
+                  </w:txbxContent>
+                </v:textbox>
+                <w10:wrap type="tight" anchorx="page"/>
+              </v:shape>
+            </w:pict>
+          </mc:Fallback>
+        </mc:AlternateContent>
+      </w:r>
+    </w:p>
+    <w:p>
+      <w:r>
+        <w:rPr>
+          <w:b/>
+          <w:bCs/>
+        </w:rPr>
+        <w:t xml:space="preserve">Chosen design pattern: </w:t>
+      </w:r>
+      <w:r>
+        <w:t>Observer design pattern</w:t>
+      </w:r>
+    </w:p>
+    <w:p>
+      <w:r>
+        <w:t xml:space="preserve">The </w:t>
+      </w:r>
+      <w:r>
+        <w:rPr>
+          <w:i/>
+          <w:iCs/>
+        </w:rPr>
+        <w:t>PatientManagemen</w:t>
+      </w:r>
+      <w:r>
+        <w:rPr>
+          <w:i/>
+          <w:iCs/>
+        </w:rPr>
+        <w:t xml:space="preserve">tSystem </w:t>
+      </w:r>
+      <w:r>
+        <w:t>needs</w:t>
+      </w:r>
+      <w:r>
+        <w:t xml:space="preserve"> to communicate with both the hospital and the patient’s GP whenever that patient’s alert level changes to red. I used the observer pattern for this, as multiple observers can be registered for each patient</w:t>
+      </w:r>
+      <w:r>
+        <w:t xml:space="preserve"> through an abstract interface</w:t>
+      </w:r>
+      <w:r>
+        <w:t>. When the patient’s alert level goes to red, both the hospital and the patient’s GP are notified with the same function call.</w:t>
+      </w:r>
+    </w:p>
+    <w:p>
+      <w:r>
+        <w:t xml:space="preserve">The initial </w:t>
+      </w:r>
+      <w:r>
+        <w:rPr>
+          <w:i/>
+          <w:iCs/>
+        </w:rPr>
+        <w:t>PatientManagementSystem</w:t>
+      </w:r>
+      <w:r>
+        <w:t xml:space="preserve"> directly owned both the hospital alert and GP notification systems directly, however </w:t>
+      </w:r>
+      <w:r>
+        <w:t xml:space="preserve">for this pattern I disowned them and added the observers in their </w:t>
+      </w:r>
+      <w:r>
+        <w:lastRenderedPageBreak/>
+        <w:t>place.</w:t>
+      </w:r>
+      <w:r>
+        <w:rPr>
+          <w:i/>
+          <w:iCs/>
+        </w:rPr>
+        <w:t xml:space="preserve"> Patient</w:t>
+      </w:r>
+      <w:r>
+        <w:t xml:space="preserve"> stores pointers for the</w:t>
+      </w:r>
+      <w:r>
+        <w:rPr>
+          <w:i/>
+          <w:iCs/>
+        </w:rPr>
+        <w:t xml:space="preserve"> </w:t>
+      </w:r>
+      <w:r>
+        <w:t xml:space="preserve">concrete observers but does not outright own them, hence the association relationship. I also did not explicitly create a </w:t>
+      </w:r>
+      <w:r>
+        <w:rPr>
+          <w:i/>
+          <w:iCs/>
+        </w:rPr>
+        <w:t>removeObserver(…)</w:t>
+      </w:r>
+      <w:r>
+        <w:t xml:space="preserve"> method for </w:t>
+      </w:r>
+      <w:r>
+        <w:rPr>
+          <w:i/>
+          <w:iCs/>
+        </w:rPr>
+        <w:t>Patient</w:t>
+      </w:r>
+      <w:r>
+        <w:t xml:space="preserve"> as they are static and patients/observers are not removed during runtime.</w:t>
+      </w:r>
+    </w:p>
+    <w:p>
+      <w:pPr>
+        <w:rPr>
+          <w:b/>
+          <w:bCs/>
+        </w:rPr>
+      </w:pPr>
+      <w:r>
+        <w:rPr>
+          <w:b/>
+          <w:bCs/>
+        </w:rPr>
+        <w:t>How it works:</w:t>
+      </w:r>
+    </w:p>
+    <w:p>
+      <w:pPr>
+        <w:pStyle w:val="ListParagraph"/>
+        <w:numPr>
+          <w:ilvl w:val="0"/>
+          <w:numId w:val="7"/>
+        </w:numPr>
+      </w:pPr>
+      <w:r>
+        <w:rPr>
+          <w:i/>
+          <w:iCs/>
+        </w:rPr>
+        <w:t>PatientManagementSystem</w:t>
+      </w:r>
+      <w:r>
+        <w:t xml:space="preserve"> creates </w:t>
+      </w:r>
+      <w:r>
+        <w:rPr>
+          <w:i/>
+          <w:iCs/>
+        </w:rPr>
+        <w:t>HospitalAlertObserver</w:t>
+      </w:r>
+      <w:r>
+        <w:t xml:space="preserve"> and </w:t>
+      </w:r>
+      <w:r>
+        <w:rPr>
+          <w:i/>
+          <w:iCs/>
+        </w:rPr>
+        <w:t>GPNotificationObserver</w:t>
+      </w:r>
+      <w:r>
+        <w:t xml:space="preserve"> objects.</w:t>
+      </w:r>
+    </w:p>
+    <w:p>
+      <w:pPr>
+        <w:pStyle w:val="ListParagraph"/>
+        <w:numPr>
+          <w:ilvl w:val="0"/>
+          <w:numId w:val="7"/>
+        </w:numPr>
+      </w:pPr>
+      <w:r>
+        <w:t xml:space="preserve">After loading patients from the database/file, </w:t>
+      </w:r>
+      <w:r>
+        <w:rPr>
+          <w:i/>
+          <w:iCs/>
+        </w:rPr>
+        <w:t xml:space="preserve">PatientManagementSystem </w:t>
+      </w:r>
+      <w:r>
+        <w:t xml:space="preserve">then registers both observers with each patient through </w:t>
+      </w:r>
+      <w:r>
+        <w:rPr>
+          <w:i/>
+          <w:iCs/>
+        </w:rPr>
+        <w:t>addAlertObserver(…)</w:t>
+      </w:r>
+      <w:r>
+        <w:t>.</w:t>
+      </w:r>
+    </w:p>
+    <w:p>
+      <w:pPr>
+        <w:pStyle w:val="ListParagraph"/>
+        <w:numPr>
+          <w:ilvl w:val="0"/>
+          <w:numId w:val="7"/>
+        </w:numPr>
+      </w:pPr>
+      <w:r>
+        <w:t xml:space="preserve">Whenever a new vitals record is added to a patient, that patient calculates their alert level. If the alert level is changed to </w:t>
+      </w:r>
+      <w:r>
+        <w:rPr>
+          <w:i/>
+          <w:iCs/>
+        </w:rPr>
+        <w:t>AlertLevel::Red</w:t>
+      </w:r>
+      <w:r>
+        <w:t xml:space="preserve">, </w:t>
+      </w:r>
+      <w:r>
+        <w:rPr>
+          <w:i/>
+          <w:iCs/>
+        </w:rPr>
+        <w:t>Patient</w:t>
+      </w:r>
+      <w:r>
+        <w:t xml:space="preserve"> will then call </w:t>
+      </w:r>
+      <w:r>
+        <w:rPr>
+          <w:i/>
+          <w:iCs/>
+        </w:rPr>
+        <w:t>notify</w:t>
+      </w:r>
+      <w:r>
+        <w:rPr>
+          <w:i/>
+          <w:iCs/>
+        </w:rPr>
+        <w:t>AlertObservers()</w:t>
+      </w:r>
+      <w:r>
+        <w:t>.</w:t>
+      </w:r>
+    </w:p>
+    <w:p>
+      <w:pPr>
+        <w:pStyle w:val="ListParagraph"/>
+        <w:numPr>
+          <w:ilvl w:val="0"/>
+          <w:numId w:val="7"/>
+        </w:numPr>
+      </w:pPr>
+      <w:r>
+        <w:t xml:space="preserve">Both </w:t>
+      </w:r>
+      <w:r>
+        <w:rPr>
+          <w:i/>
+          <w:iCs/>
+        </w:rPr>
+        <w:t>HospitalAlertObserver</w:t>
+      </w:r>
+      <w:r>
+        <w:t xml:space="preserve"> and </w:t>
+      </w:r>
+      <w:r>
+        <w:rPr>
+          <w:i/>
+          <w:iCs/>
+        </w:rPr>
+        <w:t>GPNotificationObserver</w:t>
+      </w:r>
+      <w:r>
+        <w:t xml:space="preserve"> will receive the event and call </w:t>
+      </w:r>
+      <w:r>
+        <w:rPr>
+          <w:i/>
+          <w:iCs/>
+        </w:rPr>
+        <w:t>onPatientAlertLevelChanged</w:t>
+      </w:r>
+      <w:r>
+        <w:t xml:space="preserve"> on their respective facades.</w:t>
+      </w:r>
+    </w:p>
+    <w:p>
+      <w:pPr>
+        <w:pStyle w:val="ListParagraph"/>
+        <w:numPr>
+          <w:ilvl w:val="0"/>
+          <w:numId w:val="7"/>
+        </w:numPr>
+      </w:pPr>
+      <w:r>
+        <w:rPr>
+          <w:i/>
+          <w:iCs/>
+        </w:rPr>
+        <w:t>HospitalAlertSystemFacade</w:t>
+      </w:r>
+      <w:r>
+        <w:t xml:space="preserve"> will call </w:t>
+      </w:r>
+      <w:r>
+        <w:rPr>
+          <w:i/>
+          <w:iCs/>
+        </w:rPr>
+        <w:t>sendAlertForPatient(…)</w:t>
+      </w:r>
+      <w:r>
+        <w:t xml:space="preserve">, while </w:t>
+      </w:r>
+      <w:r>
+        <w:rPr>
+          <w:i/>
+          <w:iCs/>
+        </w:rPr>
+        <w:t>GPNotificationSystemFacade</w:t>
+      </w:r>
+      <w:r>
+        <w:t xml:space="preserve"> will call </w:t>
+      </w:r>
+      <w:r>
+        <w:rPr>
+          <w:i/>
+          <w:iCs/>
+        </w:rPr>
+        <w:t>sendGPNotificationForPatient(…)</w:t>
+      </w:r>
+      <w:r>
+        <w:t>.</w:t>
+      </w:r>
+    </w:p>
+    <w:p>
+      <w:pPr>
+        <w:rPr>
+          <w:b/>
+          <w:bCs/>
+        </w:rPr>
+      </w:pPr>
+      <w:r>
+        <w:rPr>
+          <w:b/>
+          <w:bCs/>
+        </w:rPr>
+        <w:t>Git Commits</w:t>
+      </w:r>
+    </w:p>
+    <w:p>
+      <w:pPr>
+        <w:pStyle w:val="ListParagraph"/>
+        <w:numPr>
+          <w:ilvl w:val="0"/>
+          <w:numId w:val="8"/>
+        </w:numPr>
+        <w:rPr>
+          <w:b/>
+          <w:bCs/>
+        </w:rPr>
+      </w:pPr>
+      <w:r>
+        <w:t xml:space="preserve">Commits </w:t>
+      </w:r>
+      <w:r>
+        <w:rPr>
+          <w:b/>
+          <w:bCs/>
+        </w:rPr>
+        <w:t xml:space="preserve">57578547 </w:t>
+      </w:r>
+      <w:r>
+        <w:t xml:space="preserve">and </w:t>
+      </w:r>
+      <w:r>
+        <w:rPr>
+          <w:b/>
+          <w:bCs/>
+        </w:rPr>
+        <w:t>12e687af</w:t>
+      </w:r>
+      <w:r>
+        <w:t xml:space="preserve"> create and implement the abstract and concrete observer classes.</w:t>
+      </w:r>
+    </w:p>
+    <w:p>
+      <w:pPr>
+        <w:pStyle w:val="ListParagraph"/>
+        <w:numPr>
+          <w:ilvl w:val="0"/>
+          <w:numId w:val="8"/>
+        </w:numPr>
+        <w:rPr>
+          <w:b/>
+          <w:bCs/>
+        </w:rPr>
+      </w:pPr>
+      <w:r>
+        <w:t xml:space="preserve">Commit </w:t>
+      </w:r>
+      <w:r>
+        <w:rPr>
+          <w:b/>
+          <w:bCs/>
+        </w:rPr>
+        <w:t>54102bfc</w:t>
+      </w:r>
+      <w:r>
+        <w:t xml:space="preserve"> connects the old system facades to the new observers.</w:t>
+      </w:r>
+    </w:p>
+    <w:p>
+      <w:pPr>
+        <w:pStyle w:val="ListParagraph"/>
+        <w:numPr>
+          <w:ilvl w:val="0"/>
+          <w:numId w:val="8"/>
+        </w:numPr>
+      </w:pPr>
+      <w:r>
+        <w:t xml:space="preserve">Commits </w:t>
+      </w:r>
+      <w:r>
+        <w:rPr>
+          <w:b/>
+          <w:bCs/>
+        </w:rPr>
+        <w:t xml:space="preserve">29033a8f, 50e756e8, </w:t>
+      </w:r>
+      <w:r>
+        <w:t xml:space="preserve">and </w:t>
+      </w:r>
+      <w:r>
+        <w:rPr>
+          <w:b/>
+          <w:bCs/>
+        </w:rPr>
+        <w:t xml:space="preserve">409666fb </w:t>
+      </w:r>
+      <w:r>
+        <w:t xml:space="preserve">modify the </w:t>
+      </w:r>
+      <w:r>
+        <w:rPr>
+          <w:i/>
+          <w:iCs/>
+        </w:rPr>
+        <w:t>Patient</w:t>
+      </w:r>
+      <w:r>
+        <w:t xml:space="preserve"> class to store, create, and notify observers.</w:t>
+      </w:r>
+    </w:p>
+    <w:p>
+      <w:pPr>
+        <w:pStyle w:val="ListParagraph"/>
+        <w:numPr>
+          <w:ilvl w:val="0"/>
+          <w:numId w:val="8"/>
+        </w:numPr>
+      </w:pPr>
+      <w:r>
+        <w:t xml:space="preserve">Commits </w:t>
+      </w:r>
+      <w:r>
+        <w:rPr>
+          <w:b/>
+          <w:bCs/>
+        </w:rPr>
+        <w:t>34e743d4</w:t>
+      </w:r>
+      <w:r>
+        <w:t xml:space="preserve"> and </w:t>
+      </w:r>
+      <w:r>
+        <w:rPr>
+          <w:b/>
+          <w:bCs/>
+        </w:rPr>
+        <w:t>769d3fac</w:t>
+      </w:r>
+      <w:r>
+        <w:t xml:space="preserve"> update the </w:t>
+      </w:r>
+      <w:r>
+        <w:rPr>
+          <w:i/>
+          <w:iCs/>
+        </w:rPr>
+        <w:t>PatientManagementSystem</w:t>
+      </w:r>
+      <w:r>
+        <w:t xml:space="preserve"> to own pointers to observer objects instead of the system facades.</w:t>
+      </w:r>
+    </w:p>
+    <w:p>
+      <w:pPr>
+        <w:pStyle w:val="ListParagraph"/>
+        <w:numPr>
+          <w:ilvl w:val="0"/>
+          <w:numId w:val="8"/>
+        </w:numPr>
+      </w:pPr>
+      <w:r>
+        <w:t xml:space="preserve">Commit </w:t>
+      </w:r>
+      <w:r>
+        <w:rPr>
+          <w:b/>
+          <w:bCs/>
+        </w:rPr>
+        <w:t>e7a2e594</w:t>
+      </w:r>
+      <w:r>
+        <w:t xml:space="preserve"> modifie</w:t>
+      </w:r>
+      <w:r>
+        <w:t>s</w:t>
+      </w:r>
+      <w:r>
+        <w:t xml:space="preserve"> the </w:t>
+      </w:r>
+      <w:r>
+        <w:rPr>
+          <w:i/>
+          <w:iCs/>
+        </w:rPr>
+        <w:t xml:space="preserve">PatientManagementSystem </w:t>
+      </w:r>
+      <w:r>
+        <w:t>to add hospital and GP notification observers to all loaded patients.</w:t>
+      </w:r>
+    </w:p>
     <w:sectPr>
+      <w:headerReference w:type="default" r:id="rId14"/>
       <w:pgSz w:w="11906" w:h="16838"/>
       <w:pgMar w:top="1440" w:right="1440" w:bottom="1440" w:left="1440" w:header="708" w:footer="708" w:gutter="0"/>
+      <w:pgNumType w:start="0"/>
       <w:cols w:space="708"/>
+      <w:titlePg/>
       <w:docGrid w:linePitch="360"/>
     </w:sectPr>
   </w:body>
 </w:document>
+</file>
+
+<file path=word/endnotes.xml><?xml version="1.0" encoding="utf-8"?>
+<w:endnotes xmlns:wpc="http://schemas.microsoft.com/office/word/2010/wordprocessingCanvas" xmlns:cx="http://schemas.microsoft.com/office/drawing/2014/chartex" xmlns:cx1="http://schemas.microsoft.com/office/drawing/2015/9/8/chartex" xmlns:cx2="http://schemas.microsoft.com/office/drawing/2015/10/21/chartex" xmlns:cx3="http://schemas.microsoft.com/office/drawing/2016/5/9/chartex" xmlns:cx4="http://schemas.microsoft.com/office/drawing/2016/5/10/chartex" xmlns:cx5="http://schemas.microsoft.com/office/drawing/2016/5/11/chartex" xmlns:cx6="http://schemas.microsoft.com/office/drawing/2016/5/12/chartex" xmlns:cx7="http://schemas.microsoft.com/office/drawing/2016/5/13/chartex" xmlns:cx8="http://schemas.microsoft.com/office/drawing/2016/5/14/chartex" xmlns:mc="http://schemas.openxmlformats.org/markup-compatibility/2006" xmlns:aink="http://schemas.microsoft.com/office/drawing/2016/ink" xmlns:am3d="http://schemas.microsoft.com/office/drawing/2017/model3d" xmlns:o="urn:schemas-microsoft-com:office:office" xmlns:oel="http://schemas.microsoft.com/office/2019/extlst" xmlns:r="http://schemas.openxmlformats.org/officeDocument/2006/relationships" xmlns:m="http://schemas.openxmlformats.org/officeDocument/2006/math" xmlns:v="urn:schemas-microsoft-com:vml" xmlns:wp14="http://schemas.microsoft.com/office/word/2010/wordprocessingDrawing" xmlns:wp="http://schemas.openxmlformats.org/drawingml/2006/wordprocessingDrawing" xmlns:w10="urn:schemas-microsoft-com:office:word" xmlns:w="http://schemas.openxmlformats.org/wordprocessingml/2006/main" xmlns:w14="http://schemas.microsoft.com/office/word/2010/wordml" xmlns:w15="http://schemas.microsoft.com/office/word/2012/wordml" xmlns:w16cex="http://schemas.microsoft.com/office/word/2018/wordml/cex" xmlns:w16cid="http://schemas.microsoft.com/office/word/2016/wordml/cid" xmlns:w16="http://schemas.microsoft.com/office/word/2018/wordml" xmlns:w16du="http://schemas.microsoft.com/office/word/2023/wordml/word16du" xmlns:w16sdtdh="http://schemas.microsoft.com/office/word/2020/wordml/sdtdatahash" xmlns:w16sdtfl="http://schemas.microsoft.com/office/word/2024/wordml/sdtformatlock" xmlns:w16se="http://schemas.microsoft.com/office/word/2015/wordml/symex" xmlns:wpg="http://schemas.microsoft.com/office/word/2010/wordprocessingGroup" xmlns:wpi="http://schemas.microsoft.com/office/word/2010/wordprocessingInk" xmlns:wne="http://schemas.microsoft.com/office/word/2006/wordml" xmlns:wps="http://schemas.microsoft.com/office/word/2010/wordprocessingShape" mc:Ignorable="w14 w15 w16se w16cid w16 w16cex w16sdtdh w16sdtfl w16du wp14">
+  <w:endnote w:type="separator" w:id="-1">
+    <w:p>
+      <w:pPr>
+        <w:spacing w:after="0" w:line="240" w:lineRule="auto"/>
+      </w:pPr>
+      <w:r>
+        <w:separator/>
+      </w:r>
+    </w:p>
+  </w:endnote>
+  <w:endnote w:type="continuationSeparator" w:id="0">
+    <w:p>
+      <w:pPr>
+        <w:spacing w:after="0" w:line="240" w:lineRule="auto"/>
+      </w:pPr>
+      <w:r>
+        <w:continuationSeparator/>
+      </w:r>
+    </w:p>
+  </w:endnote>
+</w:endnotes>
+</file>
+
+<file path=word/footnotes.xml><?xml version="1.0" encoding="utf-8"?>
+<w:footnotes xmlns:wpc="http://schemas.microsoft.com/office/word/2010/wordprocessingCanvas" xmlns:cx="http://schemas.microsoft.com/office/drawing/2014/chartex" xmlns:cx1="http://schemas.microsoft.com/office/drawing/2015/9/8/chartex" xmlns:cx2="http://schemas.microsoft.com/office/drawing/2015/10/21/chartex" xmlns:cx3="http://schemas.microsoft.com/office/drawing/2016/5/9/chartex" xmlns:cx4="http://schemas.microsoft.com/office/drawing/2016/5/10/chartex" xmlns:cx5="http://schemas.microsoft.com/office/drawing/2016/5/11/chartex" xmlns:cx6="http://schemas.microsoft.com/office/drawing/2016/5/12/chartex" xmlns:cx7="http://schemas.microsoft.com/office/drawing/2016/5/13/chartex" xmlns:cx8="http://schemas.microsoft.com/office/drawing/2016/5/14/chartex" xmlns:mc="http://schemas.openxmlformats.org/markup-compatibility/2006" xmlns:aink="http://schemas.microsoft.com/office/drawing/2016/ink" xmlns:am3d="http://schemas.microsoft.com/office/drawing/2017/model3d" xmlns:o="urn:schemas-microsoft-com:office:office" xmlns:oel="http://schemas.microsoft.com/office/2019/extlst" xmlns:r="http://schemas.openxmlformats.org/officeDocument/2006/relationships" xmlns:m="http://schemas.openxmlformats.org/officeDocument/2006/math" xmlns:v="urn:schemas-microsoft-com:vml" xmlns:wp14="http://schemas.microsoft.com/office/word/2010/wordprocessingDrawing" xmlns:wp="http://schemas.openxmlformats.org/drawingml/2006/wordprocessingDrawing" xmlns:w10="urn:schemas-microsoft-com:office:word" xmlns:w="http://schemas.openxmlformats.org/wordprocessingml/2006/main" xmlns:w14="http://schemas.microsoft.com/office/word/2010/wordml" xmlns:w15="http://schemas.microsoft.com/office/word/2012/wordml" xmlns:w16cex="http://schemas.microsoft.com/office/word/2018/wordml/cex" xmlns:w16cid="http://schemas.microsoft.com/office/word/2016/wordml/cid" xmlns:w16="http://schemas.microsoft.com/office/word/2018/wordml" xmlns:w16du="http://schemas.microsoft.com/office/word/2023/wordml/word16du" xmlns:w16sdtdh="http://schemas.microsoft.com/office/word/2020/wordml/sdtdatahash" xmlns:w16sdtfl="http://schemas.microsoft.com/office/word/2024/wordml/sdtformatlock" xmlns:w16se="http://schemas.microsoft.com/office/word/2015/wordml/symex" xmlns:wpg="http://schemas.microsoft.com/office/word/2010/wordprocessingGroup" xmlns:wpi="http://schemas.microsoft.com/office/word/2010/wordprocessingInk" xmlns:wne="http://schemas.microsoft.com/office/word/2006/wordml" xmlns:wps="http://schemas.microsoft.com/office/word/2010/wordprocessingShape" mc:Ignorable="w14 w15 w16se w16cid w16 w16cex w16sdtdh w16sdtfl w16du wp14">
+  <w:footnote w:type="separator" w:id="-1">
+    <w:p>
+      <w:pPr>
+        <w:spacing w:after="0" w:line="240" w:lineRule="auto"/>
+      </w:pPr>
+      <w:r>
+        <w:separator/>
+      </w:r>
+    </w:p>
+  </w:footnote>
+  <w:footnote w:type="continuationSeparator" w:id="0">
+    <w:p>
+      <w:pPr>
+        <w:spacing w:after="0" w:line="240" w:lineRule="auto"/>
+      </w:pPr>
+      <w:r>
+        <w:continuationSeparator/>
+      </w:r>
+    </w:p>
+  </w:footnote>
+</w:footnotes>
+</file>
+
+<file path=word/header1.xml><?xml version="1.0" encoding="utf-8"?>
+<w:hdr xmlns:wpc="http://schemas.microsoft.com/office/word/2010/wordprocessingCanvas" xmlns:cx="http://schemas.microsoft.com/office/drawing/2014/chartex" xmlns:cx1="http://schemas.microsoft.com/office/drawing/2015/9/8/chartex" xmlns:cx2="http://schemas.microsoft.com/office/drawing/2015/10/21/chartex" xmlns:cx3="http://schemas.microsoft.com/office/drawing/2016/5/9/chartex" xmlns:cx4="http://schemas.microsoft.com/office/drawing/2016/5/10/chartex" xmlns:cx5="http://schemas.microsoft.com/office/drawing/2016/5/11/chartex" xmlns:cx6="http://schemas.microsoft.com/office/drawing/2016/5/12/chartex" xmlns:cx7="http://schemas.microsoft.com/office/drawing/2016/5/13/chartex" xmlns:cx8="http://schemas.microsoft.com/office/drawing/2016/5/14/chartex" xmlns:mc="http://schemas.openxmlformats.org/markup-compatibility/2006" xmlns:aink="http://schemas.microsoft.com/office/drawing/2016/ink" xmlns:am3d="http://schemas.microsoft.com/office/drawing/2017/model3d" xmlns:o="urn:schemas-microsoft-com:office:office" xmlns:oel="http://schemas.microsoft.com/office/2019/extlst" xmlns:r="http://schemas.openxmlformats.org/officeDocument/2006/relationships" xmlns:m="http://schemas.openxmlformats.org/officeDocument/2006/math" xmlns:v="urn:schemas-microsoft-com:vml" xmlns:wp14="http://schemas.microsoft.com/office/word/2010/wordprocessingDrawing" xmlns:wp="http://schemas.openxmlformats.org/drawingml/2006/wordprocessingDrawing" xmlns:w10="urn:schemas-microsoft-com:office:word" xmlns:w="http://schemas.openxmlformats.org/wordprocessingml/2006/main" xmlns:w14="http://schemas.microsoft.com/office/word/2010/wordml" xmlns:w15="http://schemas.microsoft.com/office/word/2012/wordml" xmlns:w16cex="http://schemas.microsoft.com/office/word/2018/wordml/cex" xmlns:w16cid="http://schemas.microsoft.com/office/word/2016/wordml/cid" xmlns:w16="http://schemas.microsoft.com/office/word/2018/wordml" xmlns:w16du="http://schemas.microsoft.com/office/word/2023/wordml/word16du" xmlns:w16sdtdh="http://schemas.microsoft.com/office/word/2020/wordml/sdtdatahash" xmlns:w16sdtfl="http://schemas.microsoft.com/office/word/2024/wordml/sdtformatlock" xmlns:w16se="http://schemas.microsoft.com/office/word/2015/wordml/symex" xmlns:wpg="http://schemas.microsoft.com/office/word/2010/wordprocessingGroup" xmlns:wpi="http://schemas.microsoft.com/office/word/2010/wordprocessingInk" xmlns:wne="http://schemas.microsoft.com/office/word/2006/wordml" xmlns:wps="http://schemas.microsoft.com/office/word/2010/wordprocessingShape" mc:Ignorable="w14 w15 w16se w16cid w16 w16cex w16sdtdh w16sdtfl w16du wp14">
+  <w:p>
+    <w:pPr>
+      <w:pStyle w:val="Header"/>
+      <w:tabs>
+        <w:tab w:val="clear" w:pos="4513"/>
+      </w:tabs>
+    </w:pPr>
+    <w:r>
+      <w:t>COMP 1039 – Design Patterns with C++</w:t>
+    </w:r>
+    <w:r>
+      <w:tab/>
+      <w:t>Adam Katic</w:t>
+    </w:r>
+  </w:p>
+  <w:p>
+    <w:pPr>
+      <w:pStyle w:val="Header"/>
+      <w:tabs>
+        <w:tab w:val="clear" w:pos="4513"/>
+      </w:tabs>
+    </w:pPr>
+    <w:r>
+      <w:t>Assignment 2 – Design Document</w:t>
+    </w:r>
+    <w:r>
+      <w:tab/>
+      <w:t>A1706436</w:t>
+    </w:r>
+  </w:p>
+</w:hdr>
 </file>
 
 <file path=word/numbering.xml><?xml version="1.0" encoding="utf-8"?>
@@ -2024,6 +4208,205 @@
     </w:lvl>
   </w:abstractNum>
   <w:abstractNum w:abstractNumId="1" w15:restartNumberingAfterBreak="0">
+    <w:nsid w:val="0A29661F"/>
+    <w:multiLevelType w:val="hybridMultilevel"/>
+    <w:tmpl w:val="040235FA"/>
+    <w:lvl w:ilvl="0" w:tplc="0C09000F">
+      <w:start w:val="1"/>
+      <w:numFmt w:val="decimal"/>
+      <w:lvlText w:val="%1."/>
+      <w:lvlJc w:val="left"/>
+      <w:pPr>
+        <w:ind w:left="720" w:hanging="360"/>
+      </w:pPr>
+    </w:lvl>
+    <w:lvl w:ilvl="1" w:tplc="0C090019" w:tentative="1">
+      <w:start w:val="1"/>
+      <w:numFmt w:val="lowerLetter"/>
+      <w:lvlText w:val="%2."/>
+      <w:lvlJc w:val="left"/>
+      <w:pPr>
+        <w:ind w:left="1440" w:hanging="360"/>
+      </w:pPr>
+    </w:lvl>
+    <w:lvl w:ilvl="2" w:tplc="0C09001B" w:tentative="1">
+      <w:start w:val="1"/>
+      <w:numFmt w:val="lowerRoman"/>
+      <w:lvlText w:val="%3."/>
+      <w:lvlJc w:val="right"/>
+      <w:pPr>
+        <w:ind w:left="2160" w:hanging="180"/>
+      </w:pPr>
+    </w:lvl>
+    <w:lvl w:ilvl="3" w:tplc="0C09000F" w:tentative="1">
+      <w:start w:val="1"/>
+      <w:numFmt w:val="decimal"/>
+      <w:lvlText w:val="%4."/>
+      <w:lvlJc w:val="left"/>
+      <w:pPr>
+        <w:ind w:left="2880" w:hanging="360"/>
+      </w:pPr>
+    </w:lvl>
+    <w:lvl w:ilvl="4" w:tplc="0C090019" w:tentative="1">
+      <w:start w:val="1"/>
+      <w:numFmt w:val="lowerLetter"/>
+      <w:lvlText w:val="%5."/>
+      <w:lvlJc w:val="left"/>
+      <w:pPr>
+        <w:ind w:left="3600" w:hanging="360"/>
+      </w:pPr>
+    </w:lvl>
+    <w:lvl w:ilvl="5" w:tplc="0C09001B" w:tentative="1">
+      <w:start w:val="1"/>
+      <w:numFmt w:val="lowerRoman"/>
+      <w:lvlText w:val="%6."/>
+      <w:lvlJc w:val="right"/>
+      <w:pPr>
+        <w:ind w:left="4320" w:hanging="180"/>
+      </w:pPr>
+    </w:lvl>
+    <w:lvl w:ilvl="6" w:tplc="0C09000F" w:tentative="1">
+      <w:start w:val="1"/>
+      <w:numFmt w:val="decimal"/>
+      <w:lvlText w:val="%7."/>
+      <w:lvlJc w:val="left"/>
+      <w:pPr>
+        <w:ind w:left="5040" w:hanging="360"/>
+      </w:pPr>
+    </w:lvl>
+    <w:lvl w:ilvl="7" w:tplc="0C090019" w:tentative="1">
+      <w:start w:val="1"/>
+      <w:numFmt w:val="lowerLetter"/>
+      <w:lvlText w:val="%8."/>
+      <w:lvlJc w:val="left"/>
+      <w:pPr>
+        <w:ind w:left="5760" w:hanging="360"/>
+      </w:pPr>
+    </w:lvl>
+    <w:lvl w:ilvl="8" w:tplc="0C09001B" w:tentative="1">
+      <w:start w:val="1"/>
+      <w:numFmt w:val="lowerRoman"/>
+      <w:lvlText w:val="%9."/>
+      <w:lvlJc w:val="right"/>
+      <w:pPr>
+        <w:ind w:left="6480" w:hanging="180"/>
+      </w:pPr>
+    </w:lvl>
+  </w:abstractNum>
+  <w:abstractNum w:abstractNumId="2" w15:restartNumberingAfterBreak="0">
+    <w:nsid w:val="16754B28"/>
+    <w:multiLevelType w:val="hybridMultilevel"/>
+    <w:tmpl w:val="E6166258"/>
+    <w:lvl w:ilvl="0" w:tplc="0C090001">
+      <w:start w:val="1"/>
+      <w:numFmt w:val="bullet"/>
+      <w:lvlText w:val=""/>
+      <w:lvlJc w:val="left"/>
+      <w:pPr>
+        <w:ind w:left="720" w:hanging="360"/>
+      </w:pPr>
+      <w:rPr>
+        <w:rFonts w:ascii="Symbol" w:hAnsi="Symbol" w:hint="default"/>
+      </w:rPr>
+    </w:lvl>
+    <w:lvl w:ilvl="1" w:tplc="0C090003" w:tentative="1">
+      <w:start w:val="1"/>
+      <w:numFmt w:val="bullet"/>
+      <w:lvlText w:val="o"/>
+      <w:lvlJc w:val="left"/>
+      <w:pPr>
+        <w:ind w:left="1440" w:hanging="360"/>
+      </w:pPr>
+      <w:rPr>
+        <w:rFonts w:ascii="Courier New" w:hAnsi="Courier New" w:cs="Courier New" w:hint="default"/>
+      </w:rPr>
+    </w:lvl>
+    <w:lvl w:ilvl="2" w:tplc="0C090005" w:tentative="1">
+      <w:start w:val="1"/>
+      <w:numFmt w:val="bullet"/>
+      <w:lvlText w:val=""/>
+      <w:lvlJc w:val="left"/>
+      <w:pPr>
+        <w:ind w:left="2160" w:hanging="360"/>
+      </w:pPr>
+      <w:rPr>
+        <w:rFonts w:ascii="Wingdings" w:hAnsi="Wingdings" w:hint="default"/>
+      </w:rPr>
+    </w:lvl>
+    <w:lvl w:ilvl="3" w:tplc="0C090001" w:tentative="1">
+      <w:start w:val="1"/>
+      <w:numFmt w:val="bullet"/>
+      <w:lvlText w:val=""/>
+      <w:lvlJc w:val="left"/>
+      <w:pPr>
+        <w:ind w:left="2880" w:hanging="360"/>
+      </w:pPr>
+      <w:rPr>
+        <w:rFonts w:ascii="Symbol" w:hAnsi="Symbol" w:hint="default"/>
+      </w:rPr>
+    </w:lvl>
+    <w:lvl w:ilvl="4" w:tplc="0C090003" w:tentative="1">
+      <w:start w:val="1"/>
+      <w:numFmt w:val="bullet"/>
+      <w:lvlText w:val="o"/>
+      <w:lvlJc w:val="left"/>
+      <w:pPr>
+        <w:ind w:left="3600" w:hanging="360"/>
+      </w:pPr>
+      <w:rPr>
+        <w:rFonts w:ascii="Courier New" w:hAnsi="Courier New" w:cs="Courier New" w:hint="default"/>
+      </w:rPr>
+    </w:lvl>
+    <w:lvl w:ilvl="5" w:tplc="0C090005" w:tentative="1">
+      <w:start w:val="1"/>
+      <w:numFmt w:val="bullet"/>
+      <w:lvlText w:val=""/>
+      <w:lvlJc w:val="left"/>
+      <w:pPr>
+        <w:ind w:left="4320" w:hanging="360"/>
+      </w:pPr>
+      <w:rPr>
+        <w:rFonts w:ascii="Wingdings" w:hAnsi="Wingdings" w:hint="default"/>
+      </w:rPr>
+    </w:lvl>
+    <w:lvl w:ilvl="6" w:tplc="0C090001" w:tentative="1">
+      <w:start w:val="1"/>
+      <w:numFmt w:val="bullet"/>
+      <w:lvlText w:val=""/>
+      <w:lvlJc w:val="left"/>
+      <w:pPr>
+        <w:ind w:left="5040" w:hanging="360"/>
+      </w:pPr>
+      <w:rPr>
+        <w:rFonts w:ascii="Symbol" w:hAnsi="Symbol" w:hint="default"/>
+      </w:rPr>
+    </w:lvl>
+    <w:lvl w:ilvl="7" w:tplc="0C090003" w:tentative="1">
+      <w:start w:val="1"/>
+      <w:numFmt w:val="bullet"/>
+      <w:lvlText w:val="o"/>
+      <w:lvlJc w:val="left"/>
+      <w:pPr>
+        <w:ind w:left="5760" w:hanging="360"/>
+      </w:pPr>
+      <w:rPr>
+        <w:rFonts w:ascii="Courier New" w:hAnsi="Courier New" w:cs="Courier New" w:hint="default"/>
+      </w:rPr>
+    </w:lvl>
+    <w:lvl w:ilvl="8" w:tplc="0C090005" w:tentative="1">
+      <w:start w:val="1"/>
+      <w:numFmt w:val="bullet"/>
+      <w:lvlText w:val=""/>
+      <w:lvlJc w:val="left"/>
+      <w:pPr>
+        <w:ind w:left="6480" w:hanging="360"/>
+      </w:pPr>
+      <w:rPr>
+        <w:rFonts w:ascii="Wingdings" w:hAnsi="Wingdings" w:hint="default"/>
+      </w:rPr>
+    </w:lvl>
+  </w:abstractNum>
+  <w:abstractNum w:abstractNumId="3" w15:restartNumberingAfterBreak="0">
     <w:nsid w:val="1CE65160"/>
     <w:multiLevelType w:val="hybridMultilevel"/>
     <w:tmpl w:val="3A960AA6"/>
@@ -2136,7 +4519,120 @@
       </w:rPr>
     </w:lvl>
   </w:abstractNum>
-  <w:abstractNum w:abstractNumId="2" w15:restartNumberingAfterBreak="0">
+  <w:abstractNum w:abstractNumId="4" w15:restartNumberingAfterBreak="0">
+    <w:nsid w:val="27E06401"/>
+    <w:multiLevelType w:val="hybridMultilevel"/>
+    <w:tmpl w:val="A3E04FC8"/>
+    <w:lvl w:ilvl="0" w:tplc="0C090001">
+      <w:start w:val="1"/>
+      <w:numFmt w:val="bullet"/>
+      <w:lvlText w:val=""/>
+      <w:lvlJc w:val="left"/>
+      <w:pPr>
+        <w:ind w:left="720" w:hanging="360"/>
+      </w:pPr>
+      <w:rPr>
+        <w:rFonts w:ascii="Symbol" w:hAnsi="Symbol" w:hint="default"/>
+      </w:rPr>
+    </w:lvl>
+    <w:lvl w:ilvl="1" w:tplc="0C090003">
+      <w:start w:val="1"/>
+      <w:numFmt w:val="bullet"/>
+      <w:lvlText w:val="o"/>
+      <w:lvlJc w:val="left"/>
+      <w:pPr>
+        <w:ind w:left="1440" w:hanging="360"/>
+      </w:pPr>
+      <w:rPr>
+        <w:rFonts w:ascii="Courier New" w:hAnsi="Courier New" w:cs="Courier New" w:hint="default"/>
+      </w:rPr>
+    </w:lvl>
+    <w:lvl w:ilvl="2" w:tplc="0C090005" w:tentative="1">
+      <w:start w:val="1"/>
+      <w:numFmt w:val="bullet"/>
+      <w:lvlText w:val=""/>
+      <w:lvlJc w:val="left"/>
+      <w:pPr>
+        <w:ind w:left="2160" w:hanging="360"/>
+      </w:pPr>
+      <w:rPr>
+        <w:rFonts w:ascii="Wingdings" w:hAnsi="Wingdings" w:hint="default"/>
+      </w:rPr>
+    </w:lvl>
+    <w:lvl w:ilvl="3" w:tplc="0C090001" w:tentative="1">
+      <w:start w:val="1"/>
+      <w:numFmt w:val="bullet"/>
+      <w:lvlText w:val=""/>
+      <w:lvlJc w:val="left"/>
+      <w:pPr>
+        <w:ind w:left="2880" w:hanging="360"/>
+      </w:pPr>
+      <w:rPr>
+        <w:rFonts w:ascii="Symbol" w:hAnsi="Symbol" w:hint="default"/>
+      </w:rPr>
+    </w:lvl>
+    <w:lvl w:ilvl="4" w:tplc="0C090003" w:tentative="1">
+      <w:start w:val="1"/>
+      <w:numFmt w:val="bullet"/>
+      <w:lvlText w:val="o"/>
+      <w:lvlJc w:val="left"/>
+      <w:pPr>
+        <w:ind w:left="3600" w:hanging="360"/>
+      </w:pPr>
+      <w:rPr>
+        <w:rFonts w:ascii="Courier New" w:hAnsi="Courier New" w:cs="Courier New" w:hint="default"/>
+      </w:rPr>
+    </w:lvl>
+    <w:lvl w:ilvl="5" w:tplc="0C090005" w:tentative="1">
+      <w:start w:val="1"/>
+      <w:numFmt w:val="bullet"/>
+      <w:lvlText w:val=""/>
+      <w:lvlJc w:val="left"/>
+      <w:pPr>
+        <w:ind w:left="4320" w:hanging="360"/>
+      </w:pPr>
+      <w:rPr>
+        <w:rFonts w:ascii="Wingdings" w:hAnsi="Wingdings" w:hint="default"/>
+      </w:rPr>
+    </w:lvl>
+    <w:lvl w:ilvl="6" w:tplc="0C090001" w:tentative="1">
+      <w:start w:val="1"/>
+      <w:numFmt w:val="bullet"/>
+      <w:lvlText w:val=""/>
+      <w:lvlJc w:val="left"/>
+      <w:pPr>
+        <w:ind w:left="5040" w:hanging="360"/>
+      </w:pPr>
+      <w:rPr>
+        <w:rFonts w:ascii="Symbol" w:hAnsi="Symbol" w:hint="default"/>
+      </w:rPr>
+    </w:lvl>
+    <w:lvl w:ilvl="7" w:tplc="0C090003" w:tentative="1">
+      <w:start w:val="1"/>
+      <w:numFmt w:val="bullet"/>
+      <w:lvlText w:val="o"/>
+      <w:lvlJc w:val="left"/>
+      <w:pPr>
+        <w:ind w:left="5760" w:hanging="360"/>
+      </w:pPr>
+      <w:rPr>
+        <w:rFonts w:ascii="Courier New" w:hAnsi="Courier New" w:cs="Courier New" w:hint="default"/>
+      </w:rPr>
+    </w:lvl>
+    <w:lvl w:ilvl="8" w:tplc="0C090005" w:tentative="1">
+      <w:start w:val="1"/>
+      <w:numFmt w:val="bullet"/>
+      <w:lvlText w:val=""/>
+      <w:lvlJc w:val="left"/>
+      <w:pPr>
+        <w:ind w:left="6480" w:hanging="360"/>
+      </w:pPr>
+      <w:rPr>
+        <w:rFonts w:ascii="Wingdings" w:hAnsi="Wingdings" w:hint="default"/>
+      </w:rPr>
+    </w:lvl>
+  </w:abstractNum>
+  <w:abstractNum w:abstractNumId="5" w15:restartNumberingAfterBreak="0">
     <w:nsid w:val="321C183C"/>
     <w:multiLevelType w:val="hybridMultilevel"/>
     <w:tmpl w:val="A65EE59E"/>
@@ -2225,7 +4721,120 @@
       </w:pPr>
     </w:lvl>
   </w:abstractNum>
-  <w:abstractNum w:abstractNumId="3" w15:restartNumberingAfterBreak="0">
+  <w:abstractNum w:abstractNumId="6" w15:restartNumberingAfterBreak="0">
+    <w:nsid w:val="34CB16A8"/>
+    <w:multiLevelType w:val="hybridMultilevel"/>
+    <w:tmpl w:val="E3BC4D08"/>
+    <w:lvl w:ilvl="0" w:tplc="0C090001">
+      <w:start w:val="1"/>
+      <w:numFmt w:val="bullet"/>
+      <w:lvlText w:val=""/>
+      <w:lvlJc w:val="left"/>
+      <w:pPr>
+        <w:ind w:left="720" w:hanging="360"/>
+      </w:pPr>
+      <w:rPr>
+        <w:rFonts w:ascii="Symbol" w:hAnsi="Symbol" w:hint="default"/>
+      </w:rPr>
+    </w:lvl>
+    <w:lvl w:ilvl="1" w:tplc="0C090003" w:tentative="1">
+      <w:start w:val="1"/>
+      <w:numFmt w:val="bullet"/>
+      <w:lvlText w:val="o"/>
+      <w:lvlJc w:val="left"/>
+      <w:pPr>
+        <w:ind w:left="1440" w:hanging="360"/>
+      </w:pPr>
+      <w:rPr>
+        <w:rFonts w:ascii="Courier New" w:hAnsi="Courier New" w:cs="Courier New" w:hint="default"/>
+      </w:rPr>
+    </w:lvl>
+    <w:lvl w:ilvl="2" w:tplc="0C090005" w:tentative="1">
+      <w:start w:val="1"/>
+      <w:numFmt w:val="bullet"/>
+      <w:lvlText w:val=""/>
+      <w:lvlJc w:val="left"/>
+      <w:pPr>
+        <w:ind w:left="2160" w:hanging="360"/>
+      </w:pPr>
+      <w:rPr>
+        <w:rFonts w:ascii="Wingdings" w:hAnsi="Wingdings" w:hint="default"/>
+      </w:rPr>
+    </w:lvl>
+    <w:lvl w:ilvl="3" w:tplc="0C090001" w:tentative="1">
+      <w:start w:val="1"/>
+      <w:numFmt w:val="bullet"/>
+      <w:lvlText w:val=""/>
+      <w:lvlJc w:val="left"/>
+      <w:pPr>
+        <w:ind w:left="2880" w:hanging="360"/>
+      </w:pPr>
+      <w:rPr>
+        <w:rFonts w:ascii="Symbol" w:hAnsi="Symbol" w:hint="default"/>
+      </w:rPr>
+    </w:lvl>
+    <w:lvl w:ilvl="4" w:tplc="0C090003" w:tentative="1">
+      <w:start w:val="1"/>
+      <w:numFmt w:val="bullet"/>
+      <w:lvlText w:val="o"/>
+      <w:lvlJc w:val="left"/>
+      <w:pPr>
+        <w:ind w:left="3600" w:hanging="360"/>
+      </w:pPr>
+      <w:rPr>
+        <w:rFonts w:ascii="Courier New" w:hAnsi="Courier New" w:cs="Courier New" w:hint="default"/>
+      </w:rPr>
+    </w:lvl>
+    <w:lvl w:ilvl="5" w:tplc="0C090005" w:tentative="1">
+      <w:start w:val="1"/>
+      <w:numFmt w:val="bullet"/>
+      <w:lvlText w:val=""/>
+      <w:lvlJc w:val="left"/>
+      <w:pPr>
+        <w:ind w:left="4320" w:hanging="360"/>
+      </w:pPr>
+      <w:rPr>
+        <w:rFonts w:ascii="Wingdings" w:hAnsi="Wingdings" w:hint="default"/>
+      </w:rPr>
+    </w:lvl>
+    <w:lvl w:ilvl="6" w:tplc="0C090001" w:tentative="1">
+      <w:start w:val="1"/>
+      <w:numFmt w:val="bullet"/>
+      <w:lvlText w:val=""/>
+      <w:lvlJc w:val="left"/>
+      <w:pPr>
+        <w:ind w:left="5040" w:hanging="360"/>
+      </w:pPr>
+      <w:rPr>
+        <w:rFonts w:ascii="Symbol" w:hAnsi="Symbol" w:hint="default"/>
+      </w:rPr>
+    </w:lvl>
+    <w:lvl w:ilvl="7" w:tplc="0C090003" w:tentative="1">
+      <w:start w:val="1"/>
+      <w:numFmt w:val="bullet"/>
+      <w:lvlText w:val="o"/>
+      <w:lvlJc w:val="left"/>
+      <w:pPr>
+        <w:ind w:left="5760" w:hanging="360"/>
+      </w:pPr>
+      <w:rPr>
+        <w:rFonts w:ascii="Courier New" w:hAnsi="Courier New" w:cs="Courier New" w:hint="default"/>
+      </w:rPr>
+    </w:lvl>
+    <w:lvl w:ilvl="8" w:tplc="0C090005" w:tentative="1">
+      <w:start w:val="1"/>
+      <w:numFmt w:val="bullet"/>
+      <w:lvlText w:val=""/>
+      <w:lvlJc w:val="left"/>
+      <w:pPr>
+        <w:ind w:left="6480" w:hanging="360"/>
+      </w:pPr>
+      <w:rPr>
+        <w:rFonts w:ascii="Wingdings" w:hAnsi="Wingdings" w:hint="default"/>
+      </w:rPr>
+    </w:lvl>
+  </w:abstractNum>
+  <w:abstractNum w:abstractNumId="7" w15:restartNumberingAfterBreak="0">
     <w:nsid w:val="5352295F"/>
     <w:multiLevelType w:val="hybridMultilevel"/>
     <w:tmpl w:val="23C22DF6"/>
@@ -2314,7 +4923,7 @@
       </w:pPr>
     </w:lvl>
   </w:abstractNum>
-  <w:abstractNum w:abstractNumId="4" w15:restartNumberingAfterBreak="0">
+  <w:abstractNum w:abstractNumId="8" w15:restartNumberingAfterBreak="0">
     <w:nsid w:val="597E7952"/>
     <w:multiLevelType w:val="hybridMultilevel"/>
     <w:tmpl w:val="2DA6B8B2"/>
@@ -2427,7 +5036,7 @@
       </w:rPr>
     </w:lvl>
   </w:abstractNum>
-  <w:abstractNum w:abstractNumId="5" w15:restartNumberingAfterBreak="0">
+  <w:abstractNum w:abstractNumId="9" w15:restartNumberingAfterBreak="0">
     <w:nsid w:val="705825E3"/>
     <w:multiLevelType w:val="hybridMultilevel"/>
     <w:tmpl w:val="6074BA82"/>
@@ -2541,21 +5150,33 @@
     </w:lvl>
   </w:abstractNum>
   <w:num w:numId="1" w16cid:durableId="1428770149">
-    <w:abstractNumId w:val="2"/>
+    <w:abstractNumId w:val="5"/>
   </w:num>
   <w:num w:numId="2" w16cid:durableId="73432152">
-    <w:abstractNumId w:val="1"/>
+    <w:abstractNumId w:val="3"/>
   </w:num>
   <w:num w:numId="3" w16cid:durableId="2082285570">
-    <w:abstractNumId w:val="3"/>
+    <w:abstractNumId w:val="7"/>
   </w:num>
   <w:num w:numId="4" w16cid:durableId="1218467137">
-    <w:abstractNumId w:val="5"/>
+    <w:abstractNumId w:val="9"/>
   </w:num>
   <w:num w:numId="5" w16cid:durableId="1850950043">
     <w:abstractNumId w:val="0"/>
   </w:num>
   <w:num w:numId="6" w16cid:durableId="2003704331">
+    <w:abstractNumId w:val="8"/>
+  </w:num>
+  <w:num w:numId="7" w16cid:durableId="307057869">
+    <w:abstractNumId w:val="1"/>
+  </w:num>
+  <w:num w:numId="8" w16cid:durableId="727188264">
+    <w:abstractNumId w:val="6"/>
+  </w:num>
+  <w:num w:numId="9" w16cid:durableId="867990079">
+    <w:abstractNumId w:val="2"/>
+  </w:num>
+  <w:num w:numId="10" w16cid:durableId="1084377653">
     <w:abstractNumId w:val="4"/>
   </w:num>
 </w:numbering>
@@ -3495,6 +6116,79 @@
       <w:szCs w:val="18"/>
     </w:rPr>
   </w:style>
+  <w:style w:type="paragraph" w:styleId="Header">
+    <w:name w:val="header"/>
+    <w:basedOn w:val="Normal"/>
+    <w:link w:val="HeaderChar"/>
+    <w:uiPriority w:val="99"/>
+    <w:unhideWhenUsed/>
+    <w:rsid w:val="0087505A"/>
+    <w:pPr>
+      <w:tabs>
+        <w:tab w:val="center" w:pos="4513"/>
+        <w:tab w:val="right" w:pos="9026"/>
+      </w:tabs>
+      <w:spacing w:after="0" w:line="240" w:lineRule="auto"/>
+    </w:pPr>
+  </w:style>
+  <w:style w:type="character" w:customStyle="1" w:styleId="HeaderChar">
+    <w:name w:val="Header Char"/>
+    <w:basedOn w:val="DefaultParagraphFont"/>
+    <w:link w:val="Header"/>
+    <w:uiPriority w:val="99"/>
+    <w:rsid w:val="0087505A"/>
+  </w:style>
+  <w:style w:type="paragraph" w:styleId="Footer">
+    <w:name w:val="footer"/>
+    <w:basedOn w:val="Normal"/>
+    <w:link w:val="FooterChar"/>
+    <w:uiPriority w:val="99"/>
+    <w:unhideWhenUsed/>
+    <w:rsid w:val="0087505A"/>
+    <w:pPr>
+      <w:tabs>
+        <w:tab w:val="center" w:pos="4513"/>
+        <w:tab w:val="right" w:pos="9026"/>
+      </w:tabs>
+      <w:spacing w:after="0" w:line="240" w:lineRule="auto"/>
+    </w:pPr>
+  </w:style>
+  <w:style w:type="character" w:customStyle="1" w:styleId="FooterChar">
+    <w:name w:val="Footer Char"/>
+    <w:basedOn w:val="DefaultParagraphFont"/>
+    <w:link w:val="Footer"/>
+    <w:uiPriority w:val="99"/>
+    <w:rsid w:val="0087505A"/>
+  </w:style>
+  <w:style w:type="paragraph" w:styleId="NoSpacing">
+    <w:name w:val="No Spacing"/>
+    <w:link w:val="NoSpacingChar"/>
+    <w:uiPriority w:val="1"/>
+    <w:qFormat/>
+    <w:rsid w:val="0087505A"/>
+    <w:pPr>
+      <w:spacing w:after="0" w:line="240" w:lineRule="auto"/>
+    </w:pPr>
+    <w:rPr>
+      <w:rFonts w:eastAsiaTheme="minorEastAsia"/>
+      <w:kern w:val="0"/>
+      <w:lang w:val="en-US"/>
+      <w14:ligatures w14:val="none"/>
+    </w:rPr>
+  </w:style>
+  <w:style w:type="character" w:customStyle="1" w:styleId="NoSpacingChar">
+    <w:name w:val="No Spacing Char"/>
+    <w:basedOn w:val="DefaultParagraphFont"/>
+    <w:link w:val="NoSpacing"/>
+    <w:uiPriority w:val="1"/>
+    <w:rsid w:val="0087505A"/>
+    <w:rPr>
+      <w:rFonts w:eastAsiaTheme="minorEastAsia"/>
+      <w:kern w:val="0"/>
+      <w:lang w:val="en-US"/>
+      <w14:ligatures w14:val="none"/>
+    </w:rPr>
+  </w:style>
 </w:styles>
 </file>
 

</xml_diff>

<commit_message>
tidy up design document and export to pdf.
</commit_message>
<xml_diff>
--- a/design-document.docx
+++ b/design-document.docx
@@ -621,7 +621,25 @@
                                         <w:sz w:val="64"/>
                                         <w:szCs w:val="64"/>
                                       </w:rPr>
-                                      <w:t>COMP 1039 – Design patterns with c++</w:t>
+                                      <w:t xml:space="preserve">COMP 1039 – Design </w:t>
+                                    </w:r>
+                                    <w:r>
+                                      <w:rPr>
+                                        <w:caps/>
+                                        <w:color w:val="156082" w:themeColor="accent1"/>
+                                        <w:sz w:val="64"/>
+                                        <w:szCs w:val="64"/>
+                                      </w:rPr>
+                                      <w:t>P</w:t>
+                                    </w:r>
+                                    <w:r>
+                                      <w:rPr>
+                                        <w:caps/>
+                                        <w:color w:val="156082" w:themeColor="accent1"/>
+                                        <w:sz w:val="64"/>
+                                        <w:szCs w:val="64"/>
+                                      </w:rPr>
+                                      <w:t>atterns with c++</w:t>
                                     </w:r>
                                   </w:sdtContent>
                                 </w:sdt>
@@ -722,7 +740,25 @@
                                   <w:sz w:val="64"/>
                                   <w:szCs w:val="64"/>
                                 </w:rPr>
-                                <w:t>COMP 1039 – Design patterns with c++</w:t>
+                                <w:t xml:space="preserve">COMP 1039 – Design </w:t>
+                              </w:r>
+                              <w:r>
+                                <w:rPr>
+                                  <w:caps/>
+                                  <w:color w:val="156082" w:themeColor="accent1"/>
+                                  <w:sz w:val="64"/>
+                                  <w:szCs w:val="64"/>
+                                </w:rPr>
+                                <w:t>P</w:t>
+                              </w:r>
+                              <w:r>
+                                <w:rPr>
+                                  <w:caps/>
+                                  <w:color w:val="156082" w:themeColor="accent1"/>
+                                  <w:sz w:val="64"/>
+                                  <w:szCs w:val="64"/>
+                                </w:rPr>
+                                <w:t>atterns with c++</w:t>
                               </w:r>
                             </w:sdtContent>
                           </w:sdt>
@@ -936,19 +972,43 @@
           <w:i/>
           <w:iCs/>
         </w:rPr>
+        <w:t>PatientFileLoaderAdapter:</w:t>
+      </w:r>
+      <w:r>
+        <w:rPr>
+          <w:i/>
+          <w:iCs/>
+        </w:rPr>
+        <w:t xml:space="preserve"> </w:t>
+      </w:r>
+      <w:r>
+        <w:t xml:space="preserve">An adapter to connect the </w:t>
+      </w:r>
+      <w:r>
+        <w:rPr>
+          <w:i/>
+          <w:iCs/>
+        </w:rPr>
         <w:t>PatientFileLoader</w:t>
       </w:r>
       <w:r>
-        <w:rPr>
-          <w:b/>
-          <w:bCs/>
-          <w:i/>
-          <w:iCs/>
-        </w:rPr>
-        <w:t>:</w:t>
-      </w:r>
-      <w:r>
-        <w:t xml:space="preserve"> Loads a list of patients from a given filepath.</w:t>
+        <w:t xml:space="preserve"> to the abstract database loader. </w:t>
+      </w:r>
+      <w:r>
+        <w:t>Adapts</w:t>
+      </w:r>
+      <w:r>
+        <w:t xml:space="preserve"> returned patients from the file loader</w:t>
+      </w:r>
+      <w:r>
+        <w:t xml:space="preserve"> to the interface expected by the </w:t>
+      </w:r>
+      <w:r>
+        <w:rPr>
+          <w:i/>
+          <w:iCs/>
+        </w:rPr>
+        <w:t>PatientManagementSystem.</w:t>
       </w:r>
     </w:p>
     <w:p>
@@ -966,27 +1026,26 @@
           <w:i/>
           <w:iCs/>
         </w:rPr>
-        <w:t>PatientFileLoaderAdapter:</w:t>
-      </w:r>
-      <w:r>
-        <w:rPr>
-          <w:i/>
-          <w:iCs/>
-        </w:rPr>
-        <w:t xml:space="preserve"> </w:t>
-      </w:r>
-      <w:r>
-        <w:t xml:space="preserve">An adapter to connect the </w:t>
-      </w:r>
-      <w:r>
-        <w:rPr>
-          <w:i/>
-          <w:iCs/>
-        </w:rPr>
-        <w:t>PatientFileLoader</w:t>
-      </w:r>
-      <w:r>
-        <w:t xml:space="preserve"> to the abstract database loader. Converts returned patients from the file loader into a format similar to the database loader.</w:t>
+        <w:t>CompositePatientLoader:</w:t>
+      </w:r>
+      <w:r>
+        <w:t xml:space="preserve">  </w:t>
+      </w:r>
+      <w:r>
+        <w:t xml:space="preserve">Handles multiple abstract data loaders, to allow the </w:t>
+      </w:r>
+      <w:r>
+        <w:rPr>
+          <w:i/>
+          <w:iCs/>
+        </w:rPr>
+        <w:t>PatientManagementSystem</w:t>
+      </w:r>
+      <w:r>
+        <w:t xml:space="preserve"> to </w:t>
+      </w:r>
+      <w:r>
+        <w:t>load patients from multiple loaders.</w:t>
       </w:r>
     </w:p>
     <w:p>
@@ -1004,26 +1063,10 @@
           <w:i/>
           <w:iCs/>
         </w:rPr>
-        <w:t>CompositePatientLoader:</w:t>
-      </w:r>
-      <w:r>
-        <w:t xml:space="preserve">  </w:t>
-      </w:r>
-      <w:r>
-        <w:t xml:space="preserve">Handles multiple abstract data loaders, to allow the </w:t>
-      </w:r>
-      <w:r>
-        <w:rPr>
-          <w:i/>
-          <w:iCs/>
-        </w:rPr>
-        <w:t>PatientManagementSystem</w:t>
-      </w:r>
-      <w:r>
-        <w:t xml:space="preserve"> to </w:t>
-      </w:r>
-      <w:r>
-        <w:t>load patients from multiple loaders.</w:t>
+        <w:t>AlertLevelStrategy:</w:t>
+      </w:r>
+      <w:r>
+        <w:t xml:space="preserve"> An abstract interface that concrete strategies for setting alert levels are derived from.</w:t>
       </w:r>
     </w:p>
     <w:p>
@@ -1041,10 +1084,10 @@
           <w:i/>
           <w:iCs/>
         </w:rPr>
-        <w:t>AlertLevelStrategy:</w:t>
-      </w:r>
-      <w:r>
-        <w:t xml:space="preserve"> An abstract interface that concrete strategies for setting alert levels are derived from.</w:t>
+        <w:t xml:space="preserve">CordycepsAlertLevelStrategy: </w:t>
+      </w:r>
+      <w:r>
+        <w:t>Calculates the alert level for a patient with the Cordyceps Brain Infection, when new vitals are added.</w:t>
       </w:r>
     </w:p>
     <w:p>
@@ -1062,10 +1105,10 @@
           <w:i/>
           <w:iCs/>
         </w:rPr>
-        <w:t xml:space="preserve">CordycepsAlertLevelStrategy: </w:t>
-      </w:r>
-      <w:r>
-        <w:t>Calculates the alert level for a patient with the Cordyceps Brain Infection, when new vitals are added.</w:t>
+        <w:t xml:space="preserve">KepralsAlertLevelStrategy: </w:t>
+      </w:r>
+      <w:r>
+        <w:t>Calculates the alert level for a patient with Kepral’s Syndrome, when new vitals are added.</w:t>
       </w:r>
     </w:p>
     <w:p>
@@ -1083,25 +1126,10 @@
           <w:i/>
           <w:iCs/>
         </w:rPr>
-        <w:t>Kepral</w:t>
-      </w:r>
-      <w:r>
-        <w:rPr>
-          <w:b/>
-          <w:bCs/>
-          <w:i/>
-          <w:iCs/>
-        </w:rPr>
-        <w:t xml:space="preserve">sAlertLevelStrategy: </w:t>
-      </w:r>
-      <w:r>
-        <w:t xml:space="preserve">Calculates the alert level for a patient with </w:t>
-      </w:r>
-      <w:r>
-        <w:t>Kepral’s Syndrome</w:t>
-      </w:r>
-      <w:r>
-        <w:t>, when new vitals are added.</w:t>
+        <w:t xml:space="preserve">AndromedaAlertLevelStrategy: </w:t>
+      </w:r>
+      <w:r>
+        <w:t>Calculates the alert level for a patient with the Andromeda Strain, when new vitals are added.</w:t>
       </w:r>
     </w:p>
     <w:p>
@@ -1119,25 +1147,20 @@
           <w:i/>
           <w:iCs/>
         </w:rPr>
-        <w:t>Andromeda</w:t>
-      </w:r>
-      <w:r>
-        <w:rPr>
-          <w:b/>
-          <w:bCs/>
-          <w:i/>
-          <w:iCs/>
-        </w:rPr>
-        <w:t xml:space="preserve">AlertLevelStrategy: </w:t>
-      </w:r>
-      <w:r>
-        <w:t xml:space="preserve">Calculates the alert level for a patient with the </w:t>
-      </w:r>
-      <w:r>
-        <w:t>Andromeda Strain</w:t>
-      </w:r>
-      <w:r>
-        <w:t>, when new vitals are added.</w:t>
+        <w:t xml:space="preserve">&lt;&lt;enum&gt;&gt; VitalsRecordType: </w:t>
+      </w:r>
+      <w:r>
+        <w:t xml:space="preserve">Enumeration that allows vitals records to be distinguished by the </w:t>
+      </w:r>
+      <w:r>
+        <w:rPr>
+          <w:i/>
+          <w:iCs/>
+        </w:rPr>
+        <w:t>PatientManagementSystem</w:t>
+      </w:r>
+      <w:r>
+        <w:t>, depending on if they were added from a database/file or added manually by the user.</w:t>
       </w:r>
     </w:p>
     <w:p>
@@ -1147,28 +1170,33 @@
           <w:ilvl w:val="0"/>
           <w:numId w:val="9"/>
         </w:numPr>
-      </w:pPr>
-      <w:r>
-        <w:rPr>
-          <w:b/>
-          <w:bCs/>
-          <w:i/>
-          <w:iCs/>
-        </w:rPr>
-        <w:t xml:space="preserve">&lt;&lt;enum&gt;&gt; VitalsRecordType: </w:t>
-      </w:r>
-      <w:r>
-        <w:t xml:space="preserve">Enumeration that allows vitals records to be distinguished by the </w:t>
-      </w:r>
-      <w:r>
-        <w:rPr>
-          <w:i/>
-          <w:iCs/>
-        </w:rPr>
-        <w:t>PatientManagementSystem</w:t>
-      </w:r>
-      <w:r>
-        <w:t>, depending on if they were added from a database/file or added manually by the user.</w:t>
+        <w:rPr>
+          <w:b/>
+          <w:bCs/>
+          <w:i/>
+          <w:iCs/>
+        </w:rPr>
+      </w:pPr>
+      <w:r>
+        <w:rPr>
+          <w:b/>
+          <w:bCs/>
+          <w:i/>
+          <w:iCs/>
+        </w:rPr>
+        <w:t>PatientAlertObserver:</w:t>
+      </w:r>
+      <w:r>
+        <w:rPr>
+          <w:b/>
+          <w:bCs/>
+          <w:i/>
+          <w:iCs/>
+        </w:rPr>
+        <w:t xml:space="preserve"> </w:t>
+      </w:r>
+      <w:r>
+        <w:t>Abstract observer that concrete hospital and GP observers are derived from.</w:t>
       </w:r>
     </w:p>
     <w:p>
@@ -1192,19 +1220,32 @@
           <w:i/>
           <w:iCs/>
         </w:rPr>
-        <w:t>PatientAlertObserver:</w:t>
-      </w:r>
-      <w:r>
-        <w:rPr>
-          <w:b/>
-          <w:bCs/>
+        <w:t>HospitalAlertObserver:</w:t>
+      </w:r>
+      <w:r>
+        <w:rPr>
           <w:i/>
           <w:iCs/>
         </w:rPr>
         <w:t xml:space="preserve"> </w:t>
       </w:r>
       <w:r>
-        <w:t>Abstract observer that concrete hospital and GP observers are derived from.</w:t>
+        <w:t xml:space="preserve">Observer </w:t>
+      </w:r>
+      <w:r>
+        <w:t>registered with</w:t>
+      </w:r>
+      <w:r>
+        <w:t xml:space="preserve"> each patient, to monitor if that patient’s alert level changes to </w:t>
+      </w:r>
+      <w:r>
+        <w:t>AlertLevel::</w:t>
+      </w:r>
+      <w:r>
+        <w:t>R</w:t>
+      </w:r>
+      <w:r>
+        <w:t>ed and alert the hospital if it does.</w:t>
       </w:r>
     </w:p>
     <w:p>
@@ -1228,53 +1269,25 @@
           <w:i/>
           <w:iCs/>
         </w:rPr>
-        <w:t>HospitalAlertObserver:</w:t>
-      </w:r>
-      <w:r>
-        <w:rPr>
-          <w:i/>
-          <w:iCs/>
-        </w:rPr>
+        <w:t>GPNotificationObserver:</w:t>
+      </w:r>
+      <w:r>
         <w:t xml:space="preserve"> </w:t>
       </w:r>
       <w:r>
-        <w:t>Observer created for each patient, to monitor if that patient’s alert level changes to red and alert the hospital if it does.</w:t>
-      </w:r>
-    </w:p>
-    <w:p>
-      <w:pPr>
-        <w:pStyle w:val="ListParagraph"/>
-        <w:numPr>
-          <w:ilvl w:val="0"/>
-          <w:numId w:val="9"/>
-        </w:numPr>
-        <w:rPr>
-          <w:b/>
-          <w:bCs/>
-          <w:i/>
-          <w:iCs/>
-        </w:rPr>
-      </w:pPr>
-      <w:r>
-        <w:rPr>
-          <w:b/>
-          <w:bCs/>
-          <w:i/>
-          <w:iCs/>
-        </w:rPr>
-        <w:t>GPNotificationAlertObserver:</w:t>
-      </w:r>
-      <w:r>
-        <w:t xml:space="preserve"> </w:t>
-      </w:r>
-      <w:r>
-        <w:t xml:space="preserve">Observer created for each patient, to monitor if that patient’s alert level changes to red and alert </w:t>
-      </w:r>
-      <w:r>
-        <w:t>their GP</w:t>
-      </w:r>
-      <w:r>
-        <w:t xml:space="preserve"> if it does.</w:t>
+        <w:t>Observer registered with each patient</w:t>
+      </w:r>
+      <w:r>
+        <w:t xml:space="preserve">, to monitor if that patient’s alert level changes to </w:t>
+      </w:r>
+      <w:r>
+        <w:t>AlertLevel::</w:t>
+      </w:r>
+      <w:r>
+        <w:t>R</w:t>
+      </w:r>
+      <w:r>
+        <w:t>ed and alert their GP if it does.</w:t>
       </w:r>
     </w:p>
     <w:p>
@@ -1448,7 +1461,29 @@
     </w:p>
     <w:p>
       <w:r>
-        <w:t>The system has to be able to load patient data from the given patients.txt file. However, the patient management system already utilises an existing database loader, so to prevent a rework of the management system I had to use the adapter pattern and create a file loader adapter that implements the existing abstract database loader similarly to the existing database loader. This then interacts with the provided patient file loader to parse the text file and load the relevant patient data into the database, which is forwarded onto the management system.</w:t>
+        <w:t xml:space="preserve">The system has to be able to load patient data from the given patients.txt file. However, the patient management system already utilises an existing database loader, so to prevent a rework of the management system I had to use the adapter pattern and create a file loader adapter that implements the existing abstract database loader similarly to the existing database loader. This then interacts with the provided patient file loader to parse the text file and </w:t>
+      </w:r>
+      <w:r>
+        <w:t xml:space="preserve">create </w:t>
+      </w:r>
+      <w:r>
+        <w:rPr>
+          <w:i/>
+          <w:iCs/>
+        </w:rPr>
+        <w:t>Patient</w:t>
+      </w:r>
+      <w:r>
+        <w:t xml:space="preserve"> objects</w:t>
+      </w:r>
+      <w:r>
+        <w:t xml:space="preserve">, which </w:t>
+      </w:r>
+      <w:r>
+        <w:t>are then forwarded</w:t>
+      </w:r>
+      <w:r>
+        <w:t xml:space="preserve"> onto the management system.</w:t>
       </w:r>
     </w:p>
     <w:p>
@@ -1736,13 +1771,30 @@
           <w:i/>
           <w:iCs/>
         </w:rPr>
-        <w:t>PatientFileLoaderAdaptor</w:t>
+        <w:t>PatientFileLoaderAdapt</w:t>
+      </w:r>
+      <w:r>
+        <w:rPr>
+          <w:i/>
+          <w:iCs/>
+        </w:rPr>
+        <w:t>e</w:t>
+      </w:r>
+      <w:r>
+        <w:rPr>
+          <w:i/>
+          <w:iCs/>
+        </w:rPr>
+        <w:t>r</w:t>
       </w:r>
       <w:r>
         <w:t xml:space="preserve">, </w:t>
       </w:r>
       <w:r>
-        <w:t xml:space="preserve">which the </w:t>
+        <w:t>which are then appended to the vector passed by the</w:t>
+      </w:r>
+      <w:r>
+        <w:t xml:space="preserve"> </w:t>
       </w:r>
       <w:r>
         <w:rPr>
@@ -1750,16 +1802,6 @@
           <w:iCs/>
         </w:rPr>
         <w:t>PatientManagementSystem</w:t>
-      </w:r>
-      <w:r>
-        <w:t xml:space="preserve"> can then use in the same way as the </w:t>
-      </w:r>
-      <w:r>
-        <w:rPr>
-          <w:i/>
-          <w:iCs/>
-        </w:rPr>
-        <w:t>PatientDatabaseLoader</w:t>
       </w:r>
       <w:r>
         <w:t>.</w:t>
@@ -1910,7 +1952,21 @@
           <w:i/>
           <w:iCs/>
         </w:rPr>
-        <w:t>PatientFileLoaderAdaptor</w:t>
+        <w:t>PatientFileLoaderAdapt</w:t>
+      </w:r>
+      <w:r>
+        <w:rPr>
+          <w:i/>
+          <w:iCs/>
+        </w:rPr>
+        <w:t>e</w:t>
+      </w:r>
+      <w:r>
+        <w:rPr>
+          <w:i/>
+          <w:iCs/>
+        </w:rPr>
+        <w:t>r</w:t>
       </w:r>
       <w:r>
         <w:t>.</w:t>
@@ -1989,10 +2045,7 @@
         <w:t>ae8975f5</w:t>
       </w:r>
       <w:r>
-        <w:t xml:space="preserve"> fixes an encoding issue I had, where curly apostrophes were not printing correctly when running the application. I had to change apostrophes in patients.txt and </w:t>
-      </w:r>
-      <w:r>
-        <w:t>Patient.cpp to not keep printing garbage memory.</w:t>
+        <w:t xml:space="preserve"> fixes an encoding issue I had, where curly apostrophes were not printing correctly when running the application.</w:t>
       </w:r>
     </w:p>
     <w:p>
@@ -2149,7 +2202,13 @@
         <w:t xml:space="preserve"> </w:t>
       </w:r>
       <w:r>
-        <w:t xml:space="preserve">to treat a group of loaders as a single loader instead. Both the file and database loaders can be stored within the composite loader, which in turn calls each loaders’ methods. To make it easier to switch between file loading, database loading, and combined loading, I also added a helper function in </w:t>
+        <w:t>to treat a group of loaders as a single loader instead. Both the file and database loaders can be stored within the composite loader, which in turn calls each loader</w:t>
+      </w:r>
+      <w:r>
+        <w:t>’s</w:t>
+      </w:r>
+      <w:r>
+        <w:t xml:space="preserve"> methods. To make it easier to switch between file loading, database loading, and combined loading, I also added a helper function in </w:t>
       </w:r>
       <w:r>
         <w:rPr>
@@ -2177,7 +2236,13 @@
         <w:t>CompositePatientLoader</w:t>
       </w:r>
       <w:r>
-        <w:t xml:space="preserve"> class owns its children, so a virtual destructor was also added into </w:t>
+        <w:t xml:space="preserve"> class owns its children, so </w:t>
+      </w:r>
+      <w:r>
+        <w:t>a</w:t>
+      </w:r>
+      <w:r>
+        <w:t xml:space="preserve"> virtual destructor was added to </w:t>
       </w:r>
       <w:r>
         <w:rPr>
@@ -2187,7 +2252,13 @@
         <w:t>AbstractPatientDatabaseLoader</w:t>
       </w:r>
       <w:r>
-        <w:t>, called when the composite class is destroyed.</w:t>
+        <w:t xml:space="preserve"> so that child loaders stored through </w:t>
+      </w:r>
+      <w:r>
+        <w:t xml:space="preserve">the abstract loader </w:t>
+      </w:r>
+      <w:r>
+        <w:t>are destroyed safely through the base-class interface.</w:t>
       </w:r>
     </w:p>
     <w:p>
@@ -2262,7 +2333,51 @@
         </w:numPr>
       </w:pPr>
       <w:r>
-        <w:t xml:space="preserve">This </w:t>
+        <w:t>A</w:t>
+      </w:r>
+      <w:r>
+        <w:t xml:space="preserve"> </w:t>
+      </w:r>
+      <w:r>
+        <w:rPr>
+          <w:i/>
+          <w:iCs/>
+        </w:rPr>
+        <w:t>PatientDatabaseLoader</w:t>
+      </w:r>
+      <w:r>
+        <w:t xml:space="preserve"> and a </w:t>
+      </w:r>
+      <w:r>
+        <w:rPr>
+          <w:i/>
+          <w:iCs/>
+        </w:rPr>
+        <w:t>PatientFileLoaderAdapt</w:t>
+      </w:r>
+      <w:r>
+        <w:rPr>
+          <w:i/>
+          <w:iCs/>
+        </w:rPr>
+        <w:t>e</w:t>
+      </w:r>
+      <w:r>
+        <w:rPr>
+          <w:i/>
+          <w:iCs/>
+        </w:rPr>
+        <w:t>r</w:t>
+      </w:r>
+      <w:r>
+        <w:rPr>
+          <w:i/>
+          <w:iCs/>
+        </w:rPr>
+        <w:t xml:space="preserve"> </w:t>
+      </w:r>
+      <w:r>
+        <w:t xml:space="preserve">are then added to the </w:t>
       </w:r>
       <w:r>
         <w:rPr>
@@ -2270,26 +2385,6 @@
           <w:iCs/>
         </w:rPr>
         <w:t>CompositePatientLoader</w:t>
-      </w:r>
-      <w:r>
-        <w:t xml:space="preserve"> creates both a </w:t>
-      </w:r>
-      <w:r>
-        <w:rPr>
-          <w:i/>
-          <w:iCs/>
-        </w:rPr>
-        <w:t>PatientDatabaseLoader</w:t>
-      </w:r>
-      <w:r>
-        <w:t xml:space="preserve"> and a </w:t>
-      </w:r>
-      <w:r>
-        <w:rPr>
-          <w:i/>
-          <w:iCs/>
-        </w:rPr>
-        <w:t>PatientFileLoaderAdaptor</w:t>
       </w:r>
       <w:r>
         <w:t>.</w:t>
@@ -2311,10 +2406,10 @@
           <w:i/>
           <w:iCs/>
         </w:rPr>
-        <w:t>PatientManagementSystem</w:t>
-      </w:r>
-      <w:r>
-        <w:t xml:space="preserve"> calls the </w:t>
+        <w:t xml:space="preserve">CompositePatientLoader </w:t>
+      </w:r>
+      <w:r>
+        <w:t xml:space="preserve">calls </w:t>
       </w:r>
       <w:r>
         <w:rPr>
@@ -2334,17 +2429,7 @@
         <w:t>closeConnection()</w:t>
       </w:r>
       <w:r>
-        <w:t xml:space="preserve"> on both </w:t>
-      </w:r>
-      <w:r>
-        <w:rPr>
-          <w:i/>
-          <w:iCs/>
-        </w:rPr>
-        <w:t>CompositePatientLoader</w:t>
-      </w:r>
-      <w:r>
-        <w:t xml:space="preserve"> child loaders, which calls the respective versions of those methods within each child.</w:t>
+        <w:t xml:space="preserve"> on both child loaders, which calls the respective versions of those methods within each child.</w:t>
       </w:r>
     </w:p>
     <w:p>
@@ -2493,7 +2578,13 @@
         <w:t>fd</w:t>
       </w:r>
       <w:r>
-        <w:t xml:space="preserve"> adds a virtual destructor the abstract database loader, to help with memory management.</w:t>
+        <w:t xml:space="preserve"> adds a virtual destructor</w:t>
+      </w:r>
+      <w:r>
+        <w:t xml:space="preserve"> to</w:t>
+      </w:r>
+      <w:r>
+        <w:t xml:space="preserve"> the abstract database loader, to help with memory management.</w:t>
       </w:r>
     </w:p>
     <w:p>
@@ -2741,11 +2832,7 @@
         <w:t xml:space="preserve">The </w:t>
       </w:r>
       <w:r>
-        <w:rPr>
-          <w:i/>
-          <w:iCs/>
-        </w:rPr>
-        <w:t>PatientManagementSystem</w:t>
+        <w:t>system</w:t>
       </w:r>
       <w:r>
         <w:t xml:space="preserve"> needs to be able to calculate the alert level for patients, depending on their most recent vitals record. For this, I applied the strategy pattern, with a different strategy for each diagnosis, following the alert levels logic defined on the assignment page. </w:t>
@@ -2796,7 +2883,7 @@
         <w:t>NewRecord</w:t>
       </w:r>
       <w:r>
-        <w:t>. This means that when a database or file is initially loaded, alert levels are not automatically calculated for them. Only vitals recorded at runtime calculated alert levels.</w:t>
+        <w:t>. This means that when a database or file is initially loaded, alert levels are not automatically calculated for them. Only vitals recorded at runtime calculate alert levels.</w:t>
       </w:r>
     </w:p>
     <w:p>
@@ -2950,7 +3037,10 @@
         <w:t>AlertLevelStrategy</w:t>
       </w:r>
       <w:r>
-        <w:t xml:space="preserve">, a child strategy class for Cordyceps, Kepral’s Syndrome, or Andromeda Strain calls </w:t>
+        <w:t xml:space="preserve">, </w:t>
+      </w:r>
+      <w:r>
+        <w:t xml:space="preserve">the patient calls </w:t>
       </w:r>
       <w:r>
         <w:rPr>
@@ -2960,7 +3050,29 @@
         <w:t>calculateAlertLevel()</w:t>
       </w:r>
       <w:r>
-        <w:t>.</w:t>
+        <w:rPr>
+          <w:i/>
+          <w:iCs/>
+        </w:rPr>
+        <w:t xml:space="preserve"> </w:t>
+      </w:r>
+      <w:r>
+        <w:t xml:space="preserve">on </w:t>
+      </w:r>
+      <w:r>
+        <w:t>either</w:t>
+      </w:r>
+      <w:r>
+        <w:t xml:space="preserve"> </w:t>
+      </w:r>
+      <w:r>
+        <w:t>the</w:t>
+      </w:r>
+      <w:r>
+        <w:t xml:space="preserve"> Cordyceps, Kepral’s Syndrome, or Andromeda Strain</w:t>
+      </w:r>
+      <w:r>
+        <w:t xml:space="preserve"> child strategy classes.</w:t>
       </w:r>
     </w:p>
     <w:p>
@@ -3114,7 +3226,7 @@
         <w:t>af8065a5</w:t>
       </w:r>
       <w:r>
-        <w:t xml:space="preserve"> set up the strategy pattern, create all relevant header/source files, and implements the abstract interface.</w:t>
+        <w:t xml:space="preserve"> set up the strategy pattern, create all relevant header/source files, and implement the abstract interface.</w:t>
       </w:r>
     </w:p>
     <w:p>
@@ -3525,13 +3637,31 @@
         <w:t>needs</w:t>
       </w:r>
       <w:r>
-        <w:t xml:space="preserve"> to communicate with both the hospital and the patient’s GP whenever that patient’s alert level changes to red. I used the observer pattern for this, as multiple observers can be registered for each patient</w:t>
+        <w:t xml:space="preserve"> to communicate with both the hospital and the patient’s GP whenever that patient’s alert level changes to </w:t>
+      </w:r>
+      <w:r>
+        <w:t>AlertLevel::</w:t>
+      </w:r>
+      <w:r>
+        <w:t>R</w:t>
+      </w:r>
+      <w:r>
+        <w:t>ed. I used the observer pattern for this, as multiple observers can be registered for each patient</w:t>
       </w:r>
       <w:r>
         <w:t xml:space="preserve"> through an abstract interface</w:t>
       </w:r>
       <w:r>
-        <w:t>. When the patient’s alert level goes to red, both the hospital and the patient’s GP are notified with the same function call.</w:t>
+        <w:t xml:space="preserve">. When the patient’s alert level goes to </w:t>
+      </w:r>
+      <w:r>
+        <w:t>AlertLevel::</w:t>
+      </w:r>
+      <w:r>
+        <w:t>R</w:t>
+      </w:r>
+      <w:r>
+        <w:t>ed, both the hospital and the patient’s GP are notified with the same function call.</w:t>
       </w:r>
     </w:p>
     <w:p>
@@ -3549,11 +3679,17 @@
         <w:t xml:space="preserve"> directly owned both the hospital alert and GP notification systems directly, however </w:t>
       </w:r>
       <w:r>
-        <w:t xml:space="preserve">for this pattern I disowned them and added the observers in their </w:t>
+        <w:t xml:space="preserve">for this pattern I </w:t>
+      </w:r>
+      <w:r>
+        <w:t>removed direct ownership of the façade objects</w:t>
+      </w:r>
+      <w:r>
+        <w:t xml:space="preserve"> and </w:t>
       </w:r>
       <w:r>
         <w:lastRenderedPageBreak/>
-        <w:t>place.</w:t>
+        <w:t>added the observers in their place.</w:t>
       </w:r>
       <w:r>
         <w:rPr>
@@ -3563,17 +3699,13 @@
         <w:t xml:space="preserve"> Patient</w:t>
       </w:r>
       <w:r>
-        <w:t xml:space="preserve"> stores pointers for the</w:t>
-      </w:r>
-      <w:r>
-        <w:rPr>
-          <w:i/>
-          <w:iCs/>
-        </w:rPr>
-        <w:t xml:space="preserve"> </w:t>
-      </w:r>
-      <w:r>
-        <w:t xml:space="preserve">concrete observers but does not outright own them, hence the association relationship. I also did not explicitly create a </w:t>
+        <w:t xml:space="preserve"> stores </w:t>
+      </w:r>
+      <w:r>
+        <w:t xml:space="preserve">abstract </w:t>
+      </w:r>
+      <w:r>
+        <w:t xml:space="preserve">pointers for the observers but does not outright own them, hence the association relationship. I also did not explicitly create a </w:t>
       </w:r>
       <w:r>
         <w:rPr>
@@ -3770,7 +3902,13 @@
         <w:t>onPatientAlertLevelChanged</w:t>
       </w:r>
       <w:r>
-        <w:t xml:space="preserve"> on their respective facades.</w:t>
+        <w:t xml:space="preserve"> </w:t>
+      </w:r>
+      <w:r>
+        <w:t>to notify their</w:t>
+      </w:r>
+      <w:r>
+        <w:t xml:space="preserve"> respective facades.</w:t>
       </w:r>
     </w:p>
     <w:p>

</xml_diff>